<commit_message>
Add improvement-plan pages, headway reliability analysis, and rewrite proposal
- app: new "改良方案" navigation group with five plan pages (GR trim, G14 feeder,
  G12 reinforcement, long-route split, timetable improvement); shared lib/plans.py
- app: headway reliability page, design-rule checks (reliability / capacity / length)
  in the scenario page, S2a split-to-rail and S2b community feeder scenarios
- app: home page shows line-source label; no more 0.0 driver shifts on the PDF source
- pilot: scripts/11_headway.py (position-interpolated headway, selftest) and outputs
- docs: scenario write-up with maps; submission rewritten around the five plans
- tests: AppTest suites for the new pages and rules

TDX historical data (pilot/data/a1_hist/) is large and kept out of version control.

Co-Authored-By: Claude Sonnet 5.5 <noreply@anthropic.com>
</commit_message>
<xml_diff>
--- a/docs/submission/繳交版_研究計畫書.docx
+++ b/docs/submission/繳交版_研究計畫書.docx
@@ -295,7 +295,7 @@
                 <w:i w:val="0"/>
                 <w:sz w:val="28"/>
               </w:rPr>
-              <w:t>把司機用在刀口上：綠線公車駕駛人力再配置</w:t>
+              <w:t>綠線通車後公車路網與班次改善方案</w:t>
             </w:r>
           </w:p>
         </w:tc>
@@ -426,7 +426,7 @@
                 <w:i w:val="0"/>
                 <w:sz w:val="28"/>
               </w:rPr>
-              <w:t>捷運綠線北段G11至G15b預計115年底通車，沿線公車面臨平行競爭或轉型接駁之調整，而駕駛人力不足為市府指出之瓶頸。本研究以TDX開放資料建立路線重疊、接駁可及性與駕駛人力換算指標，估算裁切平行路段後可再配置之駕駛班次，並以可一車直達車站之長者人口檢視公平性，建立可供分階段通車重複使用之決策工具。</w:t>
+              <w:t>捷運綠線北段G11至G15b預計115年底通車，沿線公車將面臨平行競爭與接駁不足。本研究以TDX開放資料建立路線重疊、接駁可及性與班距可靠度指標，評估GR縮短、G14社區接駁、G12補強、長線切短與班距改善等候選方案，以「班距穩定才裁切」為原則，建立可重複使用之決策工具。</w:t>
             </w:r>
           </w:p>
         </w:tc>
@@ -537,7 +537,7 @@
                 <w:i w:val="0"/>
                 <w:sz w:val="28"/>
               </w:rPr>
-              <w:t>審計處指出，綠線先導公車GR線109年度運量約101萬人次，110年度受疫情影響降至約60萬人次，114年底約回復至101萬人次，「運量培養效果有限」；市府回應主因為駕駛人力不足，並已將部分低載客路線轉型為桃小巴[4]。因此，路網重整不宜僅估算節省之車公里，更應換算為「可移去支援接駁之駕駛班次」。</w:t>
+              <w:t>審計處指出，綠線先導公車GR線109年度運量約101萬人次，110年度降至約60萬人次，114年底約回復至101萬人次，「運量培養效果有限」；市府回應主因為駕駛人力不足，並已將部分低載客路線轉型為桃小巴[4]。因此路網重整不宜僅估算節省之車公里，更應換算為「可移去支援接駁之駕駛班次」。</w:t>
             </w:r>
           </w:p>
           <w:p>
@@ -568,7 +568,7 @@
                 <w:i w:val="0"/>
                 <w:sz w:val="28"/>
               </w:rPr>
-              <w:t>市府推動「新桃園幹線公車」，GR綠捷幹線尖峰班距10至15分鐘，並新闢「13／13A龍壽南竹線」「NL北環線」等路線[5]；桃小巴現有56條路線，預計年底突破120條[6]；交通局於議會答詢時表示，蘆竹地區規劃以機場捷運A10站為接駁核心，停駛之L315、L316免費巴士及303、303A等路線將由桃小巴接棒[7]。此外，市民卡乘車碼轉乘捷運之開放時程將配合綠線通車另行公告[8]，轉乘優惠設計亦將影響接駁成效。</w:t>
+              <w:t>市府推動「新桃園幹線公車」，GR綠捷幹線尖峰班距10至15分鐘，並新闢「13／13A龍壽南竹線」「NL北環線」等路線[5]；桃小巴現有56條路線，預計年底突破120條[6]；蘆竹地區規劃以機場捷運A10站為接駁核心，停駛之L315、L316免費巴士及303、303A等路線將由桃小巴接棒[7]。市民卡乘車碼轉乘捷運之開放時程將配合綠線通車另行公告[8]。</w:t>
             </w:r>
           </w:p>
           <w:p>
@@ -583,7 +583,7 @@
                 <w:i w:val="0"/>
                 <w:sz w:val="28"/>
               </w:rPr>
-              <w:t>(四)族群需求</w:t>
+              <w:t>(四)研究觀察到的三個課題（待驗證）</w:t>
             </w:r>
           </w:p>
           <w:p>
@@ -599,7 +599,82 @@
                 <w:i w:val="0"/>
                 <w:sz w:val="28"/>
               </w:rPr>
-              <w:t>長者對步行距離與轉乘負擔較為敏感，為本研究主要之公平性對象，路網重整須避免造成其服務缺口。桃園移工人數為全國最多（114年10月已逾13萬人）[9]，惟目前缺乏公開之移工居住或工作地點空間資料，本研究僅以產業用地作為探索性代理指標，列為次要面向。</w:t>
+              <w:t>借鏡臺中綠線通車時裁切平行路線並改為接駁之作法，桃園另有三個現況問題，直接複製可能使服務更差，本研究視為待檢驗之假設，不預設為事實：</w:t>
+            </w:r>
+          </w:p>
+          <w:p>
+            <w:pPr>
+              <w:spacing w:lineRule="exact" w:line="360" w:before="0" w:after="0"/>
+              <w:ind w:left="340" w:hanging="340"/>
+              <w:jc w:val="both"/>
+            </w:pPr>
+            <w:r>
+              <w:rPr>
+                <w:rFonts w:ascii="Times New Roman" w:hAnsi="Times New Roman" w:cs="Times New Roman" w:eastAsia="標楷體"/>
+                <w:b w:val="0"/>
+                <w:i w:val="0"/>
+                <w:sz w:val="28"/>
+              </w:rPr>
+              <w:t>1.</w:t>
+            </w:r>
+            <w:r>
+              <w:rPr>
+                <w:rFonts w:ascii="Times New Roman" w:hAnsi="Times New Roman" w:cs="Times New Roman" w:eastAsia="標楷體"/>
+                <w:b w:val="0"/>
+                <w:i w:val="0"/>
+                <w:sz w:val="28"/>
+              </w:rPr>
+              <w:t>班距長且可能脫班，使轉乘等候被放大，乘客不信任接駁。</w:t>
+            </w:r>
+          </w:p>
+          <w:p>
+            <w:pPr>
+              <w:spacing w:lineRule="exact" w:line="360" w:before="0" w:after="0"/>
+              <w:ind w:left="340" w:hanging="340"/>
+              <w:jc w:val="both"/>
+            </w:pPr>
+            <w:r>
+              <w:rPr>
+                <w:rFonts w:ascii="Times New Roman" w:hAnsi="Times New Roman" w:cs="Times New Roman" w:eastAsia="標楷體"/>
+                <w:b w:val="0"/>
+                <w:i w:val="0"/>
+                <w:sz w:val="28"/>
+              </w:rPr>
+              <w:t>2.</w:t>
+            </w:r>
+            <w:r>
+              <w:rPr>
+                <w:rFonts w:ascii="Times New Roman" w:hAnsi="Times New Roman" w:cs="Times New Roman" w:eastAsia="標楷體"/>
+                <w:b w:val="0"/>
+                <w:i w:val="0"/>
+                <w:sz w:val="28"/>
+              </w:rPr>
+              <w:t>路線密度不足，裁切後缺少替代路線，長者最受影響。</w:t>
+            </w:r>
+          </w:p>
+          <w:p>
+            <w:pPr>
+              <w:spacing w:lineRule="exact" w:line="360" w:before="0" w:after="0"/>
+              <w:ind w:left="340" w:hanging="340"/>
+              <w:jc w:val="both"/>
+            </w:pPr>
+            <w:r>
+              <w:rPr>
+                <w:rFonts w:ascii="Times New Roman" w:hAnsi="Times New Roman" w:cs="Times New Roman" w:eastAsia="標楷體"/>
+                <w:b w:val="0"/>
+                <w:i w:val="0"/>
+                <w:sz w:val="28"/>
+              </w:rPr>
+              <w:t>3.</w:t>
+            </w:r>
+            <w:r>
+              <w:rPr>
+                <w:rFonts w:ascii="Times New Roman" w:hAnsi="Times New Roman" w:cs="Times New Roman" w:eastAsia="標楷體"/>
+                <w:b w:val="0"/>
+                <w:i w:val="0"/>
+                <w:sz w:val="28"/>
+              </w:rPr>
+              <w:t>桃小巴運用可能失衡，人潮多之路線若改用小車，容量不足而疏運失效。</w:t>
             </w:r>
           </w:p>
           <w:p>
@@ -630,7 +705,7 @@
                 <w:i w:val="0"/>
                 <w:sz w:val="28"/>
               </w:rPr>
-              <w:t>市長115年8月施政報告將綠線北段通車、新桃園幹線公車及桃小巴擴張列為交通主軸[6]；捷運工程局表示已同步辦理公車接駁、站區道路、人行環境及停車轉乘規劃[10]。惟截至本提案撰寫時，尚未查得市府公開之「綠線通車後逐路線公車調整方案」；若市府於通車前公布方案，本研究將轉為方案評估與通車後成效追蹤，與市府分工互補。</w:t>
+              <w:t>市長115年8月施政報告將綠線北段通車、新桃園幹線公車及桃小巴擴張列為交通主軸[6]；捷運工程局表示已同步辦理公車接駁、站區道路、人行環境及停車轉乘規劃[9]。惟截至提案撰寫時，尚未查得市府公開之「綠線通車後逐路線公車調整方案」；若市府於通車前公布方案，本研究將轉為方案評估與通車後成效追蹤，與市府分工互補。</w:t>
             </w:r>
           </w:p>
           <w:p>
@@ -650,21 +725,6 @@
           <w:p>
             <w:pPr>
               <w:spacing w:lineRule="exact" w:line="360" w:before="0" w:after="0"/>
-              <w:ind w:left="0"/>
-            </w:pPr>
-            <w:r>
-              <w:rPr>
-                <w:rFonts w:ascii="Times New Roman" w:hAnsi="Times New Roman" w:cs="Times New Roman" w:eastAsia="標楷體"/>
-                <w:b/>
-                <w:i w:val="0"/>
-                <w:sz w:val="28"/>
-              </w:rPr>
-              <w:t>(一)捷運通車後之公車調整案例</w:t>
-            </w:r>
-          </w:p>
-          <w:p>
-            <w:pPr>
-              <w:spacing w:lineRule="exact" w:line="360" w:before="0" w:after="0"/>
               <w:ind w:firstLine="561"/>
               <w:jc w:val="both"/>
             </w:pPr>
@@ -675,69 +735,7 @@
                 <w:i w:val="0"/>
                 <w:sz w:val="28"/>
               </w:rPr>
-              <w:t>臺中捷運綠線於110年4月25日通車時，交通局將800路改為「綠1」、53路裁切為「綠2」「綠3」，以減少與捷運重疊並強化接駁；報導指出共新闢5條接駁線、調整10條既有路線[11], [12]。交通部運輸研究所《捷運路網規劃參考手冊》涵蓋公車與軌道之競合及轉乘整合等規劃面向，為本研究之方法依據[13]。</w:t>
-            </w:r>
-          </w:p>
-          <w:p>
-            <w:pPr>
-              <w:spacing w:lineRule="exact" w:line="360" w:before="0" w:after="0"/>
-              <w:ind w:left="0"/>
-            </w:pPr>
-            <w:r>
-              <w:rPr>
-                <w:rFonts w:ascii="Times New Roman" w:hAnsi="Times New Roman" w:cs="Times New Roman" w:eastAsia="標楷體"/>
-                <w:b/>
-                <w:i w:val="0"/>
-                <w:sz w:val="28"/>
-              </w:rPr>
-              <w:t>(二)相關學位論文與本研究之定位</w:t>
-            </w:r>
-          </w:p>
-          <w:p>
-            <w:pPr>
-              <w:spacing w:lineRule="exact" w:line="360" w:before="0" w:after="0"/>
-              <w:ind w:firstLine="561"/>
-              <w:jc w:val="both"/>
-            </w:pPr>
-            <w:r>
-              <w:rPr>
-                <w:rFonts w:ascii="Times New Roman" w:hAnsi="Times New Roman" w:cs="Times New Roman" w:eastAsia="標楷體"/>
-                <w:b w:val="0"/>
-                <w:i w:val="0"/>
-                <w:sz w:val="28"/>
-              </w:rPr>
-              <w:t>與本題最相關者為學位論文《捷運通車後公車路線調整模式—以航空城為例》[14]，另有《市區公車之既有路線調整與新闢路線規劃程序之研究》[15]及《台中捷運接駁公車路線規劃－以捷運櫻花文心站至逢甲商圈為例》[16]。本研究將於執行初期詳讀上述文獻並具體比較異同；本研究規劃之特色為：使用TDX實際線型與即時動態資料進行通車前後實證比較、將重整效果換算為駕駛人力，並納入長者可及性。</w:t>
-            </w:r>
-          </w:p>
-          <w:p>
-            <w:pPr>
-              <w:spacing w:lineRule="exact" w:line="360" w:before="0" w:after="0"/>
-              <w:ind w:left="0"/>
-            </w:pPr>
-            <w:r>
-              <w:rPr>
-                <w:rFonts w:ascii="Times New Roman" w:hAnsi="Times New Roman" w:cs="Times New Roman" w:eastAsia="標楷體"/>
-                <w:b/>
-                <w:i w:val="0"/>
-                <w:sz w:val="28"/>
-              </w:rPr>
-              <w:t>(三)與往年度獲獎作品之區隔</w:t>
-            </w:r>
-          </w:p>
-          <w:p>
-            <w:pPr>
-              <w:spacing w:lineRule="exact" w:line="360" w:before="0" w:after="0"/>
-              <w:ind w:firstLine="561"/>
-              <w:jc w:val="both"/>
-            </w:pPr>
-            <w:r>
-              <w:rPr>
-                <w:rFonts w:ascii="Times New Roman" w:hAnsi="Times New Roman" w:cs="Times New Roman" w:eastAsia="標楷體"/>
-                <w:b w:val="0"/>
-                <w:i w:val="0"/>
-                <w:sz w:val="28"/>
-              </w:rPr>
-              <w:t>114年度金質研究獎作品「公車要來沒」之公開資訊僅有題名與團隊名稱[17], [18]。本研究聚焦路網結構與捷運整合，不涉及到站預估或乘客端資訊服務。</w:t>
+              <w:t>臺中捷運綠線於110年4月25日通車時，將800路改為「綠1」、53路裁切為「綠2」「綠3」，報導指出共新闢5條接駁線、調整10條既有路線[10], [11]。交通部運輸研究所《捷運路網規劃參考手冊》涵蓋公車與軌道之競合及轉乘整合，為本研究方法依據[12]。最相關之學位論文為《捷運通車後公車路線調整模式—以航空城為例》[13]，另有[14], [15]；本研究於執行初期詳讀並比較異同。本研究特色為：使用TDX實際線型與位置資料，以班距可靠度作為裁切門檻，將重整效果換算為駕駛人力，並納入長者可及性。114年度金質研究獎作品「公車要來沒」之公開資訊僅有題名[16], [17]，本研究聚焦路網結構與捷運整合，不涉及到站預估。</w:t>
             </w:r>
           </w:p>
           <w:p>
@@ -776,7 +774,7 @@
                 <w:i w:val="0"/>
                 <w:sz w:val="28"/>
               </w:rPr>
-              <w:t>量化各公車路線與綠線之重疊程度，辨識適合裁切、轉型或強化為接駁之路線。</w:t>
+              <w:t>量化各路線與綠線之重疊程度，辨識適合裁切、轉型或強化接駁之路線。</w:t>
             </w:r>
           </w:p>
           <w:p>
@@ -801,7 +799,7 @@
                 <w:i w:val="0"/>
                 <w:sz w:val="28"/>
               </w:rPr>
-              <w:t>盤點7站步行服務範圍內之公車接駁可及性，找出接駁弱站。</w:t>
+              <w:t>找出接駁薄弱且長者多之車站。</w:t>
             </w:r>
           </w:p>
           <w:p>
@@ -826,7 +824,7 @@
                 <w:i w:val="0"/>
                 <w:sz w:val="28"/>
               </w:rPr>
-              <w:t>將重整情境之車公里換算為車輛小時與約當駕駛班次，估算可再配置之駕駛人力，回應駕駛人力不足之市政課題。</w:t>
+              <w:t>以班距可靠度檢驗「裁切是否可行」，並檢驗上述三個課題。</w:t>
             </w:r>
           </w:p>
           <w:p>
@@ -851,7 +849,7 @@
                 <w:i w:val="0"/>
                 <w:sz w:val="28"/>
               </w:rPr>
-              <w:t>以「可一車直達車站之65歲以上人口」為主要公平性指標，避免重整造成長者服務缺口。</w:t>
+              <w:t>評估候選改善方案之車公里、約當駕駛班次與長者可及性。</w:t>
             </w:r>
           </w:p>
           <w:p>
@@ -941,7 +939,7 @@
                 <w:i w:val="0"/>
                 <w:sz w:val="28"/>
               </w:rPr>
-              <w:t>以TDX桃園市區公車線型、站序、班表與即時動態資料，結合OpenStreetMap步行路網與村里人口，建立路線重疊、車站接駁可及性與駕駛人力換算指標，模擬多套重整情境，並於通車前後比較公車營運表現，產出路線分類清單、情境比較報告與開源決策平台。</w:t>
+              <w:t>本研究以實作為導向：以TDX公車資料、OSM步行路網與村里人口，建立路線重疊、接駁可及性與班距可靠度指標，評估五個候選改善方案，並實作可供市府操作之決策平台與開源分析程式，於通車前後驗證。</w:t>
             </w:r>
           </w:p>
           <w:p>
@@ -980,7 +978,7 @@
                 <w:i w:val="0"/>
                 <w:sz w:val="28"/>
               </w:rPr>
-              <w:t>量化各路線與綠線之重疊程度，辨識適合裁切、轉型或強化接駁之路線。</w:t>
+              <w:t>辨識適合裁切、轉型或強化接駁之路線。</w:t>
             </w:r>
           </w:p>
           <w:p>
@@ -1005,7 +1003,7 @@
                 <w:i w:val="0"/>
                 <w:sz w:val="28"/>
               </w:rPr>
-              <w:t>找出7站步行範圍內接駁薄弱之車站。</w:t>
+              <w:t>找出接駁薄弱且長者多之車站。</w:t>
             </w:r>
           </w:p>
           <w:p>
@@ -1030,7 +1028,7 @@
                 <w:i w:val="0"/>
                 <w:sz w:val="28"/>
               </w:rPr>
-              <w:t>比較各情境之車公里、約當駕駛班次與長者可及性，估算淨可再配置之駕駛人力。</w:t>
+              <w:t>以班距變異、大間隔與併班比例檢視班距可靠度，作為裁切門檻。</w:t>
             </w:r>
           </w:p>
           <w:p>
@@ -1055,7 +1053,7 @@
                 <w:i w:val="0"/>
                 <w:sz w:val="28"/>
               </w:rPr>
-              <w:t>比較通車前後相關路線之旅行時間與班距穩定度。</w:t>
+              <w:t>比較候選方案之約當駕駛班次與長者可及性。</w:t>
             </w:r>
           </w:p>
           <w:p>
@@ -1080,7 +1078,7 @@
                 <w:i w:val="0"/>
                 <w:sz w:val="28"/>
               </w:rPr>
-              <w:t>（探索性）以產業用地為代理，初探移工通勤之公車可達性。</w:t>
+              <w:t>比較通車前後旅行時間與班距穩定度。</w:t>
             </w:r>
           </w:p>
           <w:p>
@@ -1125,7 +1123,7 @@
                 <w:i w:val="0"/>
                 <w:sz w:val="28"/>
               </w:rPr>
-              <w:t>公車線型、站序、班表與即時動態取自TDX[19], [20], [21]；車站位置參考捷運工程局公告[1]及OSM[22]；人口採戶政司村里人口[23]或SEGIS[24]；輔以運量統計[25], [26], [27]、市府站址表[28]及產業園區範圍圖[29]。逐路線上下車量與票證起訖未公開，列為資料媒合需求。</w:t>
+              <w:t>線型、站序、班表取自TDX[18]；即時位置與2026年10月21日單日歷史位置取自TDX[18], [19]；車站位置參考捷運工程局[1]與OSM[20]；人口採戶政司村里人口[21]。逐路線上下車量未公開，列為資料媒合需求。</w:t>
             </w:r>
           </w:p>
           <w:p>
@@ -1140,177 +1138,7 @@
                 <w:i w:val="0"/>
                 <w:sz w:val="28"/>
               </w:rPr>
-              <w:t>(二)路線重疊指標</w:t>
-            </w:r>
-          </w:p>
-          <w:p>
-            <w:pPr>
-              <w:spacing w:lineRule="exact" w:line="360" w:before="0" w:after="0"/>
-              <w:ind w:firstLine="561"/>
-              <w:jc w:val="both"/>
-            </w:pPr>
-            <w:r>
-              <w:rPr>
-                <w:rFonts w:ascii="Times New Roman" w:hAnsi="Times New Roman" w:cs="Times New Roman" w:eastAsia="標楷體"/>
-                <w:b w:val="0"/>
-                <w:i w:val="0"/>
-                <w:sz w:val="28"/>
-              </w:rPr>
-              <w:t>計算線型落於車站500 m範圍之長度占比、站點重疊率，並以「平日班次×範圍內長度」加權排序，將路線分為高度平行、部分重疊、天然接駁與無關四類；緩衝距離另作敏感度分析。</w:t>
-            </w:r>
-          </w:p>
-          <w:p>
-            <w:pPr>
-              <w:spacing w:lineRule="exact" w:line="360" w:before="0" w:after="0"/>
-              <w:ind w:left="0"/>
-            </w:pPr>
-            <w:r>
-              <w:rPr>
-                <w:rFonts w:ascii="Times New Roman" w:hAnsi="Times New Roman" w:cs="Times New Roman" w:eastAsia="標楷體"/>
-                <w:b/>
-                <w:i w:val="0"/>
-                <w:sz w:val="28"/>
-              </w:rPr>
-              <w:t>(三)車站接駁可及性</w:t>
-            </w:r>
-          </w:p>
-          <w:p>
-            <w:pPr>
-              <w:spacing w:lineRule="exact" w:line="360" w:before="0" w:after="0"/>
-              <w:ind w:firstLine="561"/>
-              <w:jc w:val="both"/>
-            </w:pPr>
-            <w:r>
-              <w:rPr>
-                <w:rFonts w:ascii="Times New Roman" w:hAnsi="Times New Roman" w:cs="Times New Roman" w:eastAsia="標楷體"/>
-                <w:b w:val="0"/>
-                <w:i w:val="0"/>
-                <w:sz w:val="28"/>
-              </w:rPr>
-              <w:t>以OSMnx[30]建立步行路網，計算300／500／800 m等時圈內站牌、路線與尖離峰班次，並計算可一車直達車站之65歲以上人口（距直達路線站牌300 m內）。</w:t>
-            </w:r>
-          </w:p>
-          <w:p>
-            <w:pPr>
-              <w:spacing w:lineRule="exact" w:line="360" w:before="0" w:after="0"/>
-              <w:ind w:left="0"/>
-            </w:pPr>
-            <w:r>
-              <w:rPr>
-                <w:rFonts w:ascii="Times New Roman" w:hAnsi="Times New Roman" w:cs="Times New Roman" w:eastAsia="標楷體"/>
-                <w:b/>
-                <w:i w:val="0"/>
-                <w:sz w:val="28"/>
-              </w:rPr>
-              <w:t>(四)重整情境與駕駛人力換算</w:t>
-            </w:r>
-          </w:p>
-          <w:p>
-            <w:pPr>
-              <w:spacing w:lineRule="exact" w:line="360" w:before="0" w:after="0"/>
-              <w:ind w:firstLine="561"/>
-              <w:jc w:val="both"/>
-            </w:pPr>
-            <w:r>
-              <w:rPr>
-                <w:rFonts w:ascii="Times New Roman" w:hAnsi="Times New Roman" w:cs="Times New Roman" w:eastAsia="標楷體"/>
-                <w:b w:val="0"/>
-                <w:i w:val="0"/>
-                <w:sz w:val="28"/>
-              </w:rPr>
-              <w:t>情境含S0現狀、S1裁切平行段、S2改末端接駁並縮短班距、S3桃小巴補位。車公里＝平日班次×單程長度；車輛小時＝車公里÷營運速率；約當駕駛班次＝車輛小時÷每班駕駛時數；可再配置人力＝裁切節省班次－新接駁所需班次。本研究暫假設平均營運車速18 km/h、每班駕駛8小時，後續以即時動態實測速率及交通局排班規則校正；現階段僅含行駛時間，未含端點休息、空駛、備勤與輪休。旅行時間以GTFS化資料搭配路徑規劃工具計算。</w:t>
-            </w:r>
-          </w:p>
-          <w:p>
-            <w:pPr>
-              <w:spacing w:lineRule="exact" w:line="360" w:before="0" w:after="0"/>
-              <w:ind w:left="0"/>
-            </w:pPr>
-            <w:r>
-              <w:rPr>
-                <w:rFonts w:ascii="Times New Roman" w:hAnsi="Times New Roman" w:cs="Times New Roman" w:eastAsia="標楷體"/>
-                <w:b/>
-                <w:i w:val="0"/>
-                <w:sz w:val="28"/>
-              </w:rPr>
-              <w:t>(五)通車前後比較</w:t>
-            </w:r>
-          </w:p>
-          <w:p>
-            <w:pPr>
-              <w:spacing w:lineRule="exact" w:line="360" w:before="0" w:after="0"/>
-              <w:ind w:firstLine="561"/>
-              <w:jc w:val="both"/>
-            </w:pPr>
-            <w:r>
-              <w:rPr>
-                <w:rFonts w:ascii="Times New Roman" w:hAnsi="Times New Roman" w:cs="Times New Roman" w:eastAsia="標楷體"/>
-                <w:b w:val="0"/>
-                <w:i w:val="0"/>
-                <w:sz w:val="28"/>
-              </w:rPr>
-              <w:t>以即時動態資料建立通車前旅行時間與班距基準，通車後同時段再測，並以未受影響路線為對照組。</w:t>
-            </w:r>
-          </w:p>
-          <w:p>
-            <w:pPr>
-              <w:spacing w:lineRule="exact" w:line="360" w:before="0" w:after="0"/>
-              <w:ind w:left="0"/>
-            </w:pPr>
-            <w:r>
-              <w:rPr>
-                <w:rFonts w:ascii="Times New Roman" w:hAnsi="Times New Roman" w:cs="Times New Roman" w:eastAsia="標楷體"/>
-                <w:b/>
-                <w:i w:val="0"/>
-                <w:sz w:val="28"/>
-              </w:rPr>
-              <w:t>(六)使用者調查（規劃中）</w:t>
-            </w:r>
-          </w:p>
-          <w:p>
-            <w:pPr>
-              <w:spacing w:lineRule="exact" w:line="360" w:before="0" w:after="0"/>
-              <w:ind w:firstLine="561"/>
-              <w:jc w:val="both"/>
-            </w:pPr>
-            <w:r>
-              <w:rPr>
-                <w:rFonts w:ascii="Times New Roman" w:hAnsi="Times New Roman" w:cs="Times New Roman" w:eastAsia="標楷體"/>
-                <w:b w:val="0"/>
-                <w:i w:val="0"/>
-                <w:sz w:val="28"/>
-              </w:rPr>
-              <w:t>擬透過社區關懷據點調查長者轉乘意願與可接受步行距離，並透過移工服務單位驗證代理指標；採書面知情同意、代碼處理且不蒐集可識別個資。目前尚未進行任何問卷或訪談。</w:t>
-            </w:r>
-          </w:p>
-          <w:p>
-            <w:pPr>
-              <w:spacing w:lineRule="exact" w:line="360" w:before="80" w:after="0"/>
-            </w:pPr>
-            <w:r>
-              <w:rPr>
-                <w:rFonts w:ascii="Times New Roman" w:hAnsi="Times New Roman" w:cs="Times New Roman" w:eastAsia="標楷體"/>
-                <w:b/>
-                <w:i w:val="0"/>
-                <w:sz w:val="28"/>
-              </w:rPr>
-              <w:t>四、研究範圍與限制</w:t>
-            </w:r>
-          </w:p>
-          <w:p>
-            <w:pPr>
-              <w:spacing w:lineRule="exact" w:line="360" w:before="0" w:after="0"/>
-              <w:ind w:firstLine="561"/>
-              <w:jc w:val="both"/>
-            </w:pPr>
-            <w:r>
-              <w:rPr>
-                <w:rFonts w:ascii="Times New Roman" w:hAnsi="Times New Roman" w:cs="Times New Roman" w:eastAsia="標楷體"/>
-                <w:b w:val="0"/>
-                <w:i w:val="0"/>
-                <w:sz w:val="28"/>
-              </w:rPr>
-              <w:t>範圍為綠線北段G11至G15b共7站及周邊1.5 km內之市區公車路線。限制如下：</w:t>
+              <w:t>(二)評估指標</w:t>
             </w:r>
           </w:p>
           <w:p>
@@ -1335,7 +1163,7 @@
                 <w:i w:val="0"/>
                 <w:sz w:val="28"/>
               </w:rPr>
-              <w:t>車站點位取自OSM，G15b以機場捷運A11站點位估計，需以官方出入口複核。</w:t>
+              <w:t>路線重疊：線型落於車站500 m範圍之長度占比，以平日班次加權，分高度平行、部分重疊、天然接駁、無關四類，緩衝距離另做敏感度分析。</w:t>
             </w:r>
           </w:p>
           <w:p>
@@ -1360,7 +1188,7 @@
                 <w:i w:val="0"/>
                 <w:sz w:val="28"/>
               </w:rPr>
-              <w:t>TDX桃園班表僅有起點發車時刻，尖離峰判定可能偏移；平日以週三代表。</w:t>
+              <w:t>接駁可及性：以OSMnx[22]計算300／500／800 m步行等時圈內站牌與尖離峰班次；長者主指標為距直達路線站牌300 m內之65歲以上人口。</w:t>
             </w:r>
           </w:p>
           <w:p>
@@ -1385,7 +1213,7 @@
                 <w:i w:val="0"/>
                 <w:sz w:val="28"/>
               </w:rPr>
-              <w:t>人口以村里面積比例分配，假設村里內均勻分布；產業用地不等於移工人口。</w:t>
+              <w:t>班距可靠度：將位置投影至線型，內插通過車站之時刻得實際班距，與時刻表比較，得變異係數、大間隔比例（超過2倍）與併班比例（低於0.25倍）；倍數門檻為暫定。</w:t>
             </w:r>
           </w:p>
           <w:p>
@@ -1410,7 +1238,22 @@
                 <w:i w:val="0"/>
                 <w:sz w:val="28"/>
               </w:rPr>
-              <w:t>營運速率、駕駛時數與接駁班次為假設值；需求面暫以人口與土地使用代理。</w:t>
+              <w:t>駕駛人力：車公里＝平日班次×單程長度；約當駕駛班次＝車公里÷速率÷每班時數。暫假設18 km/h、8小時，僅含行駛時間，須以實測速率與排班規則校正，不代表可裁減人員。</w:t>
+            </w:r>
+          </w:p>
+          <w:p>
+            <w:pPr>
+              <w:spacing w:lineRule="exact" w:line="360" w:before="0" w:after="0"/>
+              <w:ind w:left="0"/>
+            </w:pPr>
+            <w:r>
+              <w:rPr>
+                <w:rFonts w:ascii="Times New Roman" w:hAnsi="Times New Roman" w:cs="Times New Roman" w:eastAsia="標楷體"/>
+                <w:b/>
+                <w:i w:val="0"/>
+                <w:sz w:val="28"/>
+              </w:rPr>
+              <w:t>(三)設計原則</w:t>
             </w:r>
           </w:p>
           <w:p>
@@ -1426,7 +1269,7 @@
                 <w:i w:val="0"/>
                 <w:sz w:val="28"/>
               </w:rPr>
-              <w:t>5.</w:t>
+              <w:t>1.</w:t>
             </w:r>
             <w:r>
               <w:rPr>
@@ -1435,7 +1278,152 @@
                 <w:i w:val="0"/>
                 <w:sz w:val="28"/>
               </w:rPr>
-              <w:t>即時資料之車輛涵蓋率待評估；若通車延後，前後比較順延，以情境模擬為主要成果。</w:t>
+              <w:t>班距穩定才裁切。2.高載客路線不降為桃小巴。3.新接駁線單程長度與路口數設上限，超過則切段轉乘。</w:t>
+            </w:r>
+          </w:p>
+          <w:p>
+            <w:pPr>
+              <w:spacing w:lineRule="exact" w:line="360" w:before="0" w:after="0"/>
+              <w:ind w:left="0"/>
+            </w:pPr>
+            <w:r>
+              <w:rPr>
+                <w:rFonts w:ascii="Times New Roman" w:hAnsi="Times New Roman" w:cs="Times New Roman" w:eastAsia="標楷體"/>
+                <w:b/>
+                <w:i w:val="0"/>
+                <w:sz w:val="28"/>
+              </w:rPr>
+              <w:t>(四)通車前後比較與調查</w:t>
+            </w:r>
+          </w:p>
+          <w:p>
+            <w:pPr>
+              <w:spacing w:lineRule="exact" w:line="360" w:before="0" w:after="0"/>
+              <w:ind w:firstLine="561"/>
+              <w:jc w:val="both"/>
+            </w:pPr>
+            <w:r>
+              <w:rPr>
+                <w:rFonts w:ascii="Times New Roman" w:hAnsi="Times New Roman" w:cs="Times New Roman" w:eastAsia="標楷體"/>
+                <w:b w:val="0"/>
+                <w:i w:val="0"/>
+                <w:sz w:val="28"/>
+              </w:rPr>
+              <w:t>以通車前基準對照通車後同時段，並以未受影響路線為對照組。長者轉乘意願調查規劃採書面知情同意、不蒐集可識別個資，目前尚未進行。</w:t>
+            </w:r>
+          </w:p>
+          <w:p>
+            <w:pPr>
+              <w:spacing w:lineRule="exact" w:line="360" w:before="80" w:after="0"/>
+            </w:pPr>
+            <w:r>
+              <w:rPr>
+                <w:rFonts w:ascii="Times New Roman" w:hAnsi="Times New Roman" w:cs="Times New Roman" w:eastAsia="標楷體"/>
+                <w:b/>
+                <w:i w:val="0"/>
+                <w:sz w:val="28"/>
+              </w:rPr>
+              <w:t>四、研究範圍與限制</w:t>
+            </w:r>
+          </w:p>
+          <w:p>
+            <w:pPr>
+              <w:spacing w:lineRule="exact" w:line="360" w:before="0" w:after="0"/>
+              <w:ind w:left="340" w:hanging="340"/>
+              <w:jc w:val="both"/>
+            </w:pPr>
+            <w:r>
+              <w:rPr>
+                <w:rFonts w:ascii="Times New Roman" w:hAnsi="Times New Roman" w:cs="Times New Roman" w:eastAsia="標楷體"/>
+                <w:b w:val="0"/>
+                <w:i w:val="0"/>
+                <w:sz w:val="28"/>
+              </w:rPr>
+              <w:t>1.</w:t>
+            </w:r>
+            <w:r>
+              <w:rPr>
+                <w:rFonts w:ascii="Times New Roman" w:hAnsi="Times New Roman" w:cs="Times New Roman" w:eastAsia="標楷體"/>
+                <w:b w:val="0"/>
+                <w:i w:val="0"/>
+                <w:sz w:val="28"/>
+              </w:rPr>
+              <w:t>範圍為G11至G15b共7站及周邊1.5 km內市區公車。G15b點位以機場捷運A11站估計，需官方出入口複核。</w:t>
+            </w:r>
+          </w:p>
+          <w:p>
+            <w:pPr>
+              <w:spacing w:lineRule="exact" w:line="360" w:before="0" w:after="0"/>
+              <w:ind w:left="340" w:hanging="340"/>
+              <w:jc w:val="both"/>
+            </w:pPr>
+            <w:r>
+              <w:rPr>
+                <w:rFonts w:ascii="Times New Roman" w:hAnsi="Times New Roman" w:cs="Times New Roman" w:eastAsia="標楷體"/>
+                <w:b w:val="0"/>
+                <w:i w:val="0"/>
+                <w:sz w:val="28"/>
+              </w:rPr>
+              <w:t>2.</w:t>
+            </w:r>
+            <w:r>
+              <w:rPr>
+                <w:rFonts w:ascii="Times New Roman" w:hAnsi="Times New Roman" w:cs="Times New Roman" w:eastAsia="標楷體"/>
+                <w:b w:val="0"/>
+                <w:i w:val="0"/>
+                <w:sz w:val="28"/>
+              </w:rPr>
+              <w:t>班表僅有起點發車時刻，以其代替計時點班距；歷史位置目前僅單日。</w:t>
+            </w:r>
+          </w:p>
+          <w:p>
+            <w:pPr>
+              <w:spacing w:lineRule="exact" w:line="360" w:before="0" w:after="0"/>
+              <w:ind w:left="340" w:hanging="340"/>
+              <w:jc w:val="both"/>
+            </w:pPr>
+            <w:r>
+              <w:rPr>
+                <w:rFonts w:ascii="Times New Roman" w:hAnsi="Times New Roman" w:cs="Times New Roman" w:eastAsia="標楷體"/>
+                <w:b w:val="0"/>
+                <w:i w:val="0"/>
+                <w:sz w:val="28"/>
+              </w:rPr>
+              <w:t>3.</w:t>
+            </w:r>
+            <w:r>
+              <w:rPr>
+                <w:rFonts w:ascii="Times New Roman" w:hAnsi="Times New Roman" w:cs="Times New Roman" w:eastAsia="標楷體"/>
+                <w:b w:val="0"/>
+                <w:i w:val="0"/>
+                <w:sz w:val="28"/>
+              </w:rPr>
+              <w:t>人口依村里面積比例分配，假設村內均勻。</w:t>
+            </w:r>
+          </w:p>
+          <w:p>
+            <w:pPr>
+              <w:spacing w:lineRule="exact" w:line="360" w:before="0" w:after="0"/>
+              <w:ind w:left="340" w:hanging="340"/>
+              <w:jc w:val="both"/>
+            </w:pPr>
+            <w:r>
+              <w:rPr>
+                <w:rFonts w:ascii="Times New Roman" w:hAnsi="Times New Roman" w:cs="Times New Roman" w:eastAsia="標楷體"/>
+                <w:b w:val="0"/>
+                <w:i w:val="0"/>
+                <w:sz w:val="28"/>
+              </w:rPr>
+              <w:t>4.</w:t>
+            </w:r>
+            <w:r>
+              <w:rPr>
+                <w:rFonts w:ascii="Times New Roman" w:hAnsi="Times New Roman" w:cs="Times New Roman" w:eastAsia="標楷體"/>
+                <w:b w:val="0"/>
+                <w:i w:val="0"/>
+                <w:sz w:val="28"/>
+              </w:rPr>
+              <w:t>速率、工時、接駁班次為假設值；尚缺上下車量。若通車延後，前後比較順延。</w:t>
             </w:r>
           </w:p>
           <w:p>
@@ -1465,28 +1453,13 @@
                 <w:i w:val="0"/>
                 <w:sz w:val="28"/>
               </w:rPr>
-              <w:t>本研究已於115年10月24日完成試行分析，僅供研究設計參考，未進行問卷、訪談或實地調查。</w:t>
+              <w:t>前期試行於115年10月24日完成，僅供研究設計參考，未進行問卷、訪談或實地調查。</w:t>
             </w:r>
           </w:p>
           <w:p>
             <w:pPr>
               <w:spacing w:lineRule="exact" w:line="360" w:before="0" w:after="0"/>
-              <w:ind w:left="0"/>
-            </w:pPr>
-            <w:r>
-              <w:rPr>
-                <w:rFonts w:ascii="Times New Roman" w:hAnsi="Times New Roman" w:cs="Times New Roman" w:eastAsia="標楷體"/>
-                <w:b/>
-                <w:i w:val="0"/>
-                <w:sz w:val="28"/>
-              </w:rPr>
-              <w:t>(一)路線重疊</w:t>
-            </w:r>
-          </w:p>
-          <w:p>
-            <w:pPr>
-              <w:spacing w:lineRule="exact" w:line="360" w:before="0" w:after="0"/>
-              <w:ind w:firstLine="561"/>
+              <w:ind w:left="340" w:hanging="340"/>
               <w:jc w:val="both"/>
             </w:pPr>
             <w:r>
@@ -1496,7 +1469,91 @@
                 <w:i w:val="0"/>
                 <w:sz w:val="28"/>
               </w:rPr>
-              <w:t>664條子路線方向中有75個與7站500 m範圍重疊。GR雙向各約5.8 km（約34%）落於範圍內，占全部重疊車公里22.0%，但距G14約850 m；T300次之（13.0%），且為少數服務G14之路線。309、5019、5022A等重疊長度達3.9至5.7 km，但平日每方向僅1至4班，故應以班次加權排序（表1、圖1）。</w:t>
+              <w:t>1.</w:t>
+            </w:r>
+            <w:r>
+              <w:rPr>
+                <w:rFonts w:ascii="Times New Roman" w:hAnsi="Times New Roman" w:cs="Times New Roman" w:eastAsia="標楷體"/>
+                <w:b w:val="0"/>
+                <w:i w:val="0"/>
+                <w:sz w:val="28"/>
+              </w:rPr>
+              <w:t>路線重疊：664條子路線方向中75個與7站500 m範圍重疊；GR單向約34%（約5.8 km）落於範圍內，占全部重疊車公里22.0%，為最大宗。</w:t>
+            </w:r>
+          </w:p>
+          <w:p>
+            <w:pPr>
+              <w:spacing w:lineRule="exact" w:line="360" w:before="0" w:after="0"/>
+              <w:ind w:left="340" w:hanging="340"/>
+              <w:jc w:val="both"/>
+            </w:pPr>
+            <w:r>
+              <w:rPr>
+                <w:rFonts w:ascii="Times New Roman" w:hAnsi="Times New Roman" w:cs="Times New Roman" w:eastAsia="標楷體"/>
+                <w:b w:val="0"/>
+                <w:i w:val="0"/>
+                <w:sz w:val="28"/>
+              </w:rPr>
+              <w:t>2.</w:t>
+            </w:r>
+            <w:r>
+              <w:rPr>
+                <w:rFonts w:ascii="Times New Roman" w:hAnsi="Times New Roman" w:cs="Times New Roman" w:eastAsia="標楷體"/>
+                <w:b w:val="0"/>
+                <w:i w:val="0"/>
+                <w:sz w:val="28"/>
+              </w:rPr>
+              <w:t>接駁可及性：G14接駁最弱，300 m內無站牌、500 m內尖峰每小時約4.2班；G12 500 m內尖峰亦約4.2班，但800 m內約有1,379名65歲以上居民；G11最充足（約25.8班）。</w:t>
+            </w:r>
+          </w:p>
+          <w:p>
+            <w:pPr>
+              <w:spacing w:lineRule="exact" w:line="360" w:before="0" w:after="0"/>
+              <w:ind w:left="340" w:hanging="340"/>
+              <w:jc w:val="both"/>
+            </w:pPr>
+            <w:r>
+              <w:rPr>
+                <w:rFonts w:ascii="Times New Roman" w:hAnsi="Times New Roman" w:cs="Times New Roman" w:eastAsia="標楷體"/>
+                <w:b w:val="0"/>
+                <w:i w:val="0"/>
+                <w:sz w:val="28"/>
+              </w:rPr>
+              <w:t>3.</w:t>
+            </w:r>
+            <w:r>
+              <w:rPr>
+                <w:rFonts w:ascii="Times New Roman" w:hAnsi="Times New Roman" w:cs="Times New Roman" w:eastAsia="標楷體"/>
+                <w:b w:val="0"/>
+                <w:i w:val="0"/>
+                <w:sz w:val="28"/>
+              </w:rPr>
+              <w:t>班距可靠度（2026年10月21日週三單日，僅供檢查方法）：GR於G12日間實際班距約12至64分鐘，時刻表為30至40分鐘；去程11個班距中2個超過時刻表2倍。與市府所稱尖峰10至15分鐘不一致，口徑待驗證，不可推論為常態。</w:t>
+            </w:r>
+          </w:p>
+          <w:p>
+            <w:pPr>
+              <w:spacing w:lineRule="exact" w:line="360" w:before="0" w:after="0"/>
+              <w:ind w:left="340" w:hanging="340"/>
+              <w:jc w:val="both"/>
+            </w:pPr>
+            <w:r>
+              <w:rPr>
+                <w:rFonts w:ascii="Times New Roman" w:hAnsi="Times New Roman" w:cs="Times New Roman" w:eastAsia="標楷體"/>
+                <w:b w:val="0"/>
+                <w:i w:val="0"/>
+                <w:sz w:val="28"/>
+              </w:rPr>
+              <w:t>4.</w:t>
+            </w:r>
+            <w:r>
+              <w:rPr>
+                <w:rFonts w:ascii="Times New Roman" w:hAnsi="Times New Roman" w:cs="Times New Roman" w:eastAsia="標楷體"/>
+                <w:b w:val="0"/>
+                <w:i w:val="0"/>
+                <w:sz w:val="28"/>
+              </w:rPr>
+              <w:t>候選方案如表1。以決策平台示意情境（方案一加二）估算，約當駕駛班次由138.1降至133.8，淨可再配置約4.4班／平日；可一車直達G14之長者約由1,018增至2,332人，G12、G15b各減約33、28人。此為假設值下之示意，非建議。</w:t>
             </w:r>
           </w:p>
           <w:p>
@@ -1520,11 +1577,10 @@
               <w:tblLayout w:type="fixed"/>
             </w:tblPr>
             <w:tblGrid>
-              <w:gridCol w:w="2051"/>
-              <w:gridCol w:w="1982"/>
-              <w:gridCol w:w="1640"/>
-              <w:gridCol w:w="1777"/>
-              <w:gridCol w:w="1846"/>
+              <w:gridCol w:w="1678"/>
+              <w:gridCol w:w="2970"/>
+              <w:gridCol w:w="2712"/>
+              <w:gridCol w:w="1937"/>
             </w:tblGrid>
             <w:tr>
               <w:trPr>
@@ -1533,8 +1589,8 @@
               </w:trPr>
               <w:tc>
                 <w:tcPr>
-                  <w:tcW w:type="dxa" w:w="9296"/>
-                  <w:gridSpan w:val="5"/>
+                  <w:tcW w:type="dxa" w:w="9297"/>
+                  <w:gridSpan w:val="4"/>
                   <w:tcBorders>
                     <w:top w:val="nil"/>
                     <w:left w:val="nil"/>
@@ -1554,7 +1610,7 @@
                       <w:i w:val="0"/>
                       <w:sz w:val="24"/>
                     </w:rPr>
-                    <w:t>表1　班次加權重疊車公里（前8條路線）</w:t>
+                    <w:t>表1　候選改善方案</w:t>
                   </w:r>
                 </w:p>
               </w:tc>
@@ -1566,7 +1622,7 @@
               </w:trPr>
               <w:tc>
                 <w:tcPr>
-                  <w:tcW w:type="dxa" w:w="2051"/>
+                  <w:tcW w:type="dxa" w:w="1678"/>
                   <w:shd w:val="clear" w:color="auto" w:fill="E7E6E6"/>
                   <w:vAlign w:val="center"/>
                 </w:tcPr>
@@ -1583,13 +1639,13 @@
                       <w:i w:val="0"/>
                       <w:sz w:val="24"/>
                     </w:rPr>
-                    <w:t>路線</w:t>
+                    <w:t>方案</w:t>
                   </w:r>
                 </w:p>
               </w:tc>
               <w:tc>
                 <w:tcPr>
-                  <w:tcW w:type="dxa" w:w="1982"/>
+                  <w:tcW w:type="dxa" w:w="2970"/>
                   <w:shd w:val="clear" w:color="auto" w:fill="E7E6E6"/>
                   <w:vAlign w:val="center"/>
                 </w:tcPr>
@@ -1606,13 +1662,13 @@
                       <w:i w:val="0"/>
                       <w:sz w:val="24"/>
                     </w:rPr>
-                    <w:t>範圍內長度km</w:t>
+                    <w:t>做法</w:t>
                   </w:r>
                 </w:p>
               </w:tc>
               <w:tc>
                 <w:tcPr>
-                  <w:tcW w:type="dxa" w:w="1640"/>
+                  <w:tcW w:type="dxa" w:w="2712"/>
                   <w:shd w:val="clear" w:color="auto" w:fill="E7E6E6"/>
                   <w:vAlign w:val="center"/>
                 </w:tcPr>
@@ -1629,13 +1685,13 @@
                       <w:i w:val="0"/>
                       <w:sz w:val="24"/>
                     </w:rPr>
-                    <w:t>平日班次</w:t>
+                    <w:t>前期依據</w:t>
                   </w:r>
                 </w:p>
               </w:tc>
               <w:tc>
                 <w:tcPr>
-                  <w:tcW w:type="dxa" w:w="1777"/>
+                  <w:tcW w:type="dxa" w:w="1937"/>
                   <w:shd w:val="clear" w:color="auto" w:fill="E7E6E6"/>
                   <w:vAlign w:val="center"/>
                 </w:tcPr>
@@ -1652,30 +1708,7 @@
                       <w:i w:val="0"/>
                       <w:sz w:val="24"/>
                     </w:rPr>
-                    <w:t>範圍內車公里</w:t>
-                  </w:r>
-                </w:p>
-              </w:tc>
-              <w:tc>
-                <w:tcPr>
-                  <w:tcW w:type="dxa" w:w="1846"/>
-                  <w:shd w:val="clear" w:color="auto" w:fill="E7E6E6"/>
-                  <w:vAlign w:val="center"/>
-                </w:tcPr>
-                <w:p>
-                  <w:pPr>
-                    <w:keepNext/>
-                    <w:spacing w:lineRule="exact" w:line="360" w:before="0" w:after="0"/>
-                    <w:jc w:val="center"/>
-                  </w:pPr>
-                  <w:r>
-                    <w:rPr>
-                      <w:rFonts w:ascii="Times New Roman" w:hAnsi="Times New Roman" w:cs="Times New Roman" w:eastAsia="標楷體"/>
-                      <w:b/>
-                      <w:i w:val="0"/>
-                      <w:sz w:val="24"/>
-                    </w:rPr>
-                    <w:t>占比</w:t>
+                    <w:t>驗證指標</w:t>
                   </w:r>
                 </w:p>
               </w:tc>
@@ -1686,7 +1719,7 @@
               </w:trPr>
               <w:tc>
                 <w:tcPr>
-                  <w:tcW w:type="dxa" w:w="2051"/>
+                  <w:tcW w:type="dxa" w:w="1678"/>
                   <w:vAlign w:val="center"/>
                 </w:tcPr>
                 <w:p>
@@ -1702,13 +1735,13 @@
                       <w:i w:val="0"/>
                       <w:sz w:val="24"/>
                     </w:rPr>
-                    <w:t>GR</w:t>
+                    <w:t>一 GR縮短</w:t>
                   </w:r>
                 </w:p>
               </w:tc>
               <w:tc>
                 <w:tcPr>
-                  <w:tcW w:type="dxa" w:w="1982"/>
+                  <w:tcW w:type="dxa" w:w="2970"/>
                   <w:vAlign w:val="center"/>
                 </w:tcPr>
                 <w:p>
@@ -1724,13 +1757,13 @@
                       <w:i w:val="0"/>
                       <w:sz w:val="24"/>
                     </w:rPr>
-                    <w:t>5.82</w:t>
+                    <w:t>裁掉與綠線並行段，保留桃園總站至G11</w:t>
                   </w:r>
                 </w:p>
               </w:tc>
               <w:tc>
                 <w:tcPr>
-                  <w:tcW w:type="dxa" w:w="1640"/>
+                  <w:tcW w:type="dxa" w:w="2712"/>
                   <w:vAlign w:val="center"/>
                 </w:tcPr>
                 <w:p>
@@ -1746,13 +1779,13 @@
                       <w:i w:val="0"/>
                       <w:sz w:val="24"/>
                     </w:rPr>
-                    <w:t>60</w:t>
+                    <w:t>GR約34%落於範圍內</w:t>
                   </w:r>
                 </w:p>
               </w:tc>
               <w:tc>
                 <w:tcPr>
-                  <w:tcW w:type="dxa" w:w="1777"/>
+                  <w:tcW w:type="dxa" w:w="1937"/>
                   <w:vAlign w:val="center"/>
                 </w:tcPr>
                 <w:p>
@@ -1768,13 +1801,40 @@
                       <w:i w:val="0"/>
                       <w:sz w:val="24"/>
                     </w:rPr>
-                    <w:t>347.4</w:t>
+                    <w:t>車公里、約當班次</w:t>
+                  </w:r>
+                </w:p>
+              </w:tc>
+            </w:tr>
+            <w:tr>
+              <w:trPr>
+                <w:cantSplit/>
+              </w:trPr>
+              <w:tc>
+                <w:tcPr>
+                  <w:tcW w:type="dxa" w:w="1678"/>
+                  <w:vAlign w:val="center"/>
+                </w:tcPr>
+                <w:p>
+                  <w:pPr>
+                    <w:keepNext/>
+                    <w:spacing w:lineRule="exact" w:line="360" w:before="0" w:after="0"/>
+                    <w:jc w:val="left"/>
+                  </w:pPr>
+                  <w:r>
+                    <w:rPr>
+                      <w:rFonts w:ascii="Times New Roman" w:hAnsi="Times New Roman" w:cs="Times New Roman" w:eastAsia="標楷體"/>
+                      <w:b w:val="0"/>
+                      <w:i w:val="0"/>
+                      <w:sz w:val="24"/>
+                    </w:rPr>
+                    <w:t>二 G14接駁</w:t>
                   </w:r>
                 </w:p>
               </w:tc>
               <w:tc>
                 <w:tcPr>
-                  <w:tcW w:type="dxa" w:w="1846"/>
+                  <w:tcW w:type="dxa" w:w="2970"/>
                   <w:vAlign w:val="center"/>
                 </w:tcPr>
                 <w:p>
@@ -1790,7 +1850,51 @@
                       <w:i w:val="0"/>
                       <w:sz w:val="24"/>
                     </w:rPr>
-                    <w:t>22.0%</w:t>
+                    <w:t>自G14出發之社區循環接駁</w:t>
+                  </w:r>
+                </w:p>
+              </w:tc>
+              <w:tc>
+                <w:tcPr>
+                  <w:tcW w:type="dxa" w:w="2712"/>
+                  <w:vAlign w:val="center"/>
+                </w:tcPr>
+                <w:p>
+                  <w:pPr>
+                    <w:keepNext/>
+                    <w:spacing w:lineRule="exact" w:line="360" w:before="0" w:after="0"/>
+                    <w:jc w:val="center"/>
+                  </w:pPr>
+                  <w:r>
+                    <w:rPr>
+                      <w:rFonts w:ascii="Times New Roman" w:hAnsi="Times New Roman" w:cs="Times New Roman" w:eastAsia="標楷體"/>
+                      <w:b w:val="0"/>
+                      <w:i w:val="0"/>
+                      <w:sz w:val="24"/>
+                    </w:rPr>
+                    <w:t>G14 300 m內無站牌</w:t>
+                  </w:r>
+                </w:p>
+              </w:tc>
+              <w:tc>
+                <w:tcPr>
+                  <w:tcW w:type="dxa" w:w="1937"/>
+                  <w:vAlign w:val="center"/>
+                </w:tcPr>
+                <w:p>
+                  <w:pPr>
+                    <w:keepNext/>
+                    <w:spacing w:lineRule="exact" w:line="360" w:before="0" w:after="0"/>
+                    <w:jc w:val="center"/>
+                  </w:pPr>
+                  <w:r>
+                    <w:rPr>
+                      <w:rFonts w:ascii="Times New Roman" w:hAnsi="Times New Roman" w:cs="Times New Roman" w:eastAsia="標楷體"/>
+                      <w:b w:val="0"/>
+                      <w:i w:val="0"/>
+                      <w:sz w:val="24"/>
+                    </w:rPr>
+                    <w:t>長者直達人數、容量</w:t>
                   </w:r>
                 </w:p>
               </w:tc>
@@ -1801,7 +1905,7 @@
               </w:trPr>
               <w:tc>
                 <w:tcPr>
-                  <w:tcW w:type="dxa" w:w="2051"/>
+                  <w:tcW w:type="dxa" w:w="1678"/>
                   <w:vAlign w:val="center"/>
                 </w:tcPr>
                 <w:p>
@@ -1817,13 +1921,13 @@
                       <w:i w:val="0"/>
                       <w:sz w:val="24"/>
                     </w:rPr>
-                    <w:t>T300</w:t>
+                    <w:t>三 G12補強</w:t>
                   </w:r>
                 </w:p>
               </w:tc>
               <w:tc>
                 <w:tcPr>
-                  <w:tcW w:type="dxa" w:w="1982"/>
+                  <w:tcW w:type="dxa" w:w="2970"/>
                   <w:vAlign w:val="center"/>
                 </w:tcPr>
                 <w:p>
@@ -1839,13 +1943,13 @@
                       <w:i w:val="0"/>
                       <w:sz w:val="24"/>
                     </w:rPr>
-                    <w:t>3.44</w:t>
+                    <w:t>增班或改道經G12</w:t>
                   </w:r>
                 </w:p>
               </w:tc>
               <w:tc>
                 <w:tcPr>
-                  <w:tcW w:type="dxa" w:w="1640"/>
+                  <w:tcW w:type="dxa" w:w="2712"/>
                   <w:vAlign w:val="center"/>
                 </w:tcPr>
                 <w:p>
@@ -1861,13 +1965,13 @@
                       <w:i w:val="0"/>
                       <w:sz w:val="24"/>
                     </w:rPr>
-                    <w:t>60</w:t>
+                    <w:t>500 m內約4.2班／時，800 m內約1,379位長者</w:t>
                   </w:r>
                 </w:p>
               </w:tc>
               <w:tc>
                 <w:tcPr>
-                  <w:tcW w:type="dxa" w:w="1777"/>
+                  <w:tcW w:type="dxa" w:w="1937"/>
                   <w:vAlign w:val="center"/>
                 </w:tcPr>
                 <w:p>
@@ -1883,13 +1987,40 @@
                       <w:i w:val="0"/>
                       <w:sz w:val="24"/>
                     </w:rPr>
-                    <w:t>205.5</w:t>
+                    <w:t>長者直達人數</w:t>
+                  </w:r>
+                </w:p>
+              </w:tc>
+            </w:tr>
+            <w:tr>
+              <w:trPr>
+                <w:cantSplit/>
+              </w:trPr>
+              <w:tc>
+                <w:tcPr>
+                  <w:tcW w:type="dxa" w:w="1678"/>
+                  <w:vAlign w:val="center"/>
+                </w:tcPr>
+                <w:p>
+                  <w:pPr>
+                    <w:keepNext/>
+                    <w:spacing w:lineRule="exact" w:line="360" w:before="0" w:after="0"/>
+                    <w:jc w:val="left"/>
+                  </w:pPr>
+                  <w:r>
+                    <w:rPr>
+                      <w:rFonts w:ascii="Times New Roman" w:hAnsi="Times New Roman" w:cs="Times New Roman" w:eastAsia="標楷體"/>
+                      <w:b w:val="0"/>
+                      <w:i w:val="0"/>
+                      <w:sz w:val="24"/>
+                    </w:rPr>
+                    <w:t>四 長線切短</w:t>
                   </w:r>
                 </w:p>
               </w:tc>
               <w:tc>
                 <w:tcPr>
-                  <w:tcW w:type="dxa" w:w="1846"/>
+                  <w:tcW w:type="dxa" w:w="2970"/>
                   <w:vAlign w:val="center"/>
                 </w:tcPr>
                 <w:p>
@@ -1905,40 +2036,13 @@
                       <w:i w:val="0"/>
                       <w:sz w:val="24"/>
                     </w:rPr>
-                    <w:t>13.0%</w:t>
-                  </w:r>
-                </w:p>
-              </w:tc>
-            </w:tr>
-            <w:tr>
-              <w:trPr>
-                <w:cantSplit/>
-              </w:trPr>
-              <w:tc>
-                <w:tcPr>
-                  <w:tcW w:type="dxa" w:w="2051"/>
-                  <w:vAlign w:val="center"/>
-                </w:tcPr>
-                <w:p>
-                  <w:pPr>
-                    <w:keepNext/>
-                    <w:spacing w:lineRule="exact" w:line="360" w:before="0" w:after="0"/>
-                    <w:jc w:val="left"/>
-                  </w:pPr>
-                  <w:r>
-                    <w:rPr>
-                      <w:rFonts w:ascii="Times New Roman" w:hAnsi="Times New Roman" w:cs="Times New Roman" w:eastAsia="標楷體"/>
-                      <w:b w:val="0"/>
-                      <w:i w:val="0"/>
-                      <w:sz w:val="24"/>
-                    </w:rPr>
-                    <w:t>703</w:t>
+                    <w:t>長線於車站切段轉乘</w:t>
                   </w:r>
                 </w:p>
               </w:tc>
               <w:tc>
                 <w:tcPr>
-                  <w:tcW w:type="dxa" w:w="1982"/>
+                  <w:tcW w:type="dxa" w:w="2712"/>
                   <w:vAlign w:val="center"/>
                 </w:tcPr>
                 <w:p>
@@ -1954,13 +2058,13 @@
                       <w:i w:val="0"/>
                       <w:sz w:val="24"/>
                     </w:rPr>
-                    <w:t>2.04</w:t>
+                    <w:t>長線脫班易連鎖</w:t>
                   </w:r>
                 </w:p>
               </w:tc>
               <w:tc>
                 <w:tcPr>
-                  <w:tcW w:type="dxa" w:w="1640"/>
+                  <w:tcW w:type="dxa" w:w="1937"/>
                   <w:vAlign w:val="center"/>
                 </w:tcPr>
                 <w:p>
@@ -1976,18 +2080,43 @@
                       <w:i w:val="0"/>
                       <w:sz w:val="24"/>
                     </w:rPr>
-                    <w:t>56</w:t>
+                    <w:t>班距變異、轉乘等候</w:t>
+                  </w:r>
+                </w:p>
+              </w:tc>
+            </w:tr>
+            <w:tr>
+              <w:trPr>
+                <w:cantSplit/>
+              </w:trPr>
+              <w:tc>
+                <w:tcPr>
+                  <w:tcW w:type="dxa" w:w="1678"/>
+                  <w:vAlign w:val="center"/>
+                </w:tcPr>
+                <w:p>
+                  <w:pPr>
+                    <w:spacing w:lineRule="exact" w:line="360" w:before="0" w:after="0"/>
+                    <w:jc w:val="left"/>
+                  </w:pPr>
+                  <w:r>
+                    <w:rPr>
+                      <w:rFonts w:ascii="Times New Roman" w:hAnsi="Times New Roman" w:cs="Times New Roman" w:eastAsia="標楷體"/>
+                      <w:b w:val="0"/>
+                      <w:i w:val="0"/>
+                      <w:sz w:val="24"/>
+                    </w:rPr>
+                    <w:t>五 班次改善</w:t>
                   </w:r>
                 </w:p>
               </w:tc>
               <w:tc>
                 <w:tcPr>
-                  <w:tcW w:type="dxa" w:w="1777"/>
+                  <w:tcW w:type="dxa" w:w="2970"/>
                   <w:vAlign w:val="center"/>
                 </w:tcPr>
                 <w:p>
                   <w:pPr>
-                    <w:keepNext/>
                     <w:spacing w:lineRule="exact" w:line="360" w:before="0" w:after="0"/>
                     <w:jc w:val="center"/>
                   </w:pPr>
@@ -1998,18 +2127,17 @@
                       <w:i w:val="0"/>
                       <w:sz w:val="24"/>
                     </w:rPr>
-                    <w:t>114.2</w:t>
+                    <w:t>固定班距並與捷運對接</w:t>
                   </w:r>
                 </w:p>
               </w:tc>
               <w:tc>
                 <w:tcPr>
-                  <w:tcW w:type="dxa" w:w="1846"/>
+                  <w:tcW w:type="dxa" w:w="2712"/>
                   <w:vAlign w:val="center"/>
                 </w:tcPr>
                 <w:p>
                   <w:pPr>
-                    <w:keepNext/>
                     <w:spacing w:lineRule="exact" w:line="360" w:before="0" w:after="0"/>
                     <w:jc w:val="center"/>
                   </w:pPr>
@@ -2020,45 +2148,17 @@
                       <w:i w:val="0"/>
                       <w:sz w:val="24"/>
                     </w:rPr>
-                    <w:t>7.2%</w:t>
-                  </w:r>
-                </w:p>
-              </w:tc>
-            </w:tr>
-            <w:tr>
-              <w:trPr>
-                <w:cantSplit/>
-              </w:trPr>
-              <w:tc>
-                <w:tcPr>
-                  <w:tcW w:type="dxa" w:w="2051"/>
-                  <w:vAlign w:val="center"/>
-                </w:tcPr>
-                <w:p>
-                  <w:pPr>
-                    <w:keepNext/>
-                    <w:spacing w:lineRule="exact" w:line="360" w:before="0" w:after="0"/>
-                    <w:jc w:val="left"/>
-                  </w:pPr>
-                  <w:r>
-                    <w:rPr>
-                      <w:rFonts w:ascii="Times New Roman" w:hAnsi="Times New Roman" w:cs="Times New Roman" w:eastAsia="標楷體"/>
-                      <w:b w:val="0"/>
-                      <w:i w:val="0"/>
-                      <w:sz w:val="24"/>
-                    </w:rPr>
-                    <w:t>5022</w:t>
+                    <w:t>實際班距與時刻表有落差（單日）</w:t>
                   </w:r>
                 </w:p>
               </w:tc>
               <w:tc>
                 <w:tcPr>
-                  <w:tcW w:type="dxa" w:w="1982"/>
+                  <w:tcW w:type="dxa" w:w="1937"/>
                   <w:vAlign w:val="center"/>
                 </w:tcPr>
                 <w:p>
                   <w:pPr>
-                    <w:keepNext/>
                     <w:spacing w:lineRule="exact" w:line="360" w:before="0" w:after="0"/>
                     <w:jc w:val="center"/>
                   </w:pPr>
@@ -2069,641 +2169,7 @@
                       <w:i w:val="0"/>
                       <w:sz w:val="24"/>
                     </w:rPr>
-                    <w:t>2.16</w:t>
-                  </w:r>
-                </w:p>
-              </w:tc>
-              <w:tc>
-                <w:tcPr>
-                  <w:tcW w:type="dxa" w:w="1640"/>
-                  <w:vAlign w:val="center"/>
-                </w:tcPr>
-                <w:p>
-                  <w:pPr>
-                    <w:keepNext/>
-                    <w:spacing w:lineRule="exact" w:line="360" w:before="0" w:after="0"/>
-                    <w:jc w:val="center"/>
-                  </w:pPr>
-                  <w:r>
-                    <w:rPr>
-                      <w:rFonts w:ascii="Times New Roman" w:hAnsi="Times New Roman" w:cs="Times New Roman" w:eastAsia="標楷體"/>
-                      <w:b w:val="0"/>
-                      <w:i w:val="0"/>
-                      <w:sz w:val="24"/>
-                    </w:rPr>
-                    <w:t>49</w:t>
-                  </w:r>
-                </w:p>
-              </w:tc>
-              <w:tc>
-                <w:tcPr>
-                  <w:tcW w:type="dxa" w:w="1777"/>
-                  <w:vAlign w:val="center"/>
-                </w:tcPr>
-                <w:p>
-                  <w:pPr>
-                    <w:keepNext/>
-                    <w:spacing w:lineRule="exact" w:line="360" w:before="0" w:after="0"/>
-                    <w:jc w:val="center"/>
-                  </w:pPr>
-                  <w:r>
-                    <w:rPr>
-                      <w:rFonts w:ascii="Times New Roman" w:hAnsi="Times New Roman" w:cs="Times New Roman" w:eastAsia="標楷體"/>
-                      <w:b w:val="0"/>
-                      <w:i w:val="0"/>
-                      <w:sz w:val="24"/>
-                    </w:rPr>
-                    <w:t>105.6</w:t>
-                  </w:r>
-                </w:p>
-              </w:tc>
-              <w:tc>
-                <w:tcPr>
-                  <w:tcW w:type="dxa" w:w="1846"/>
-                  <w:vAlign w:val="center"/>
-                </w:tcPr>
-                <w:p>
-                  <w:pPr>
-                    <w:keepNext/>
-                    <w:spacing w:lineRule="exact" w:line="360" w:before="0" w:after="0"/>
-                    <w:jc w:val="center"/>
-                  </w:pPr>
-                  <w:r>
-                    <w:rPr>
-                      <w:rFonts w:ascii="Times New Roman" w:hAnsi="Times New Roman" w:cs="Times New Roman" w:eastAsia="標楷體"/>
-                      <w:b w:val="0"/>
-                      <w:i w:val="0"/>
-                      <w:sz w:val="24"/>
-                    </w:rPr>
-                    <w:t>6.7%</w:t>
-                  </w:r>
-                </w:p>
-              </w:tc>
-            </w:tr>
-            <w:tr>
-              <w:trPr>
-                <w:cantSplit/>
-              </w:trPr>
-              <w:tc>
-                <w:tcPr>
-                  <w:tcW w:type="dxa" w:w="2051"/>
-                  <w:vAlign w:val="center"/>
-                </w:tcPr>
-                <w:p>
-                  <w:pPr>
-                    <w:keepNext/>
-                    <w:spacing w:lineRule="exact" w:line="360" w:before="0" w:after="0"/>
-                    <w:jc w:val="left"/>
-                  </w:pPr>
-                  <w:r>
-                    <w:rPr>
-                      <w:rFonts w:ascii="Times New Roman" w:hAnsi="Times New Roman" w:cs="Times New Roman" w:eastAsia="標楷體"/>
-                      <w:b w:val="0"/>
-                      <w:i w:val="0"/>
-                      <w:sz w:val="24"/>
-                    </w:rPr>
-                    <w:t>168</w:t>
-                  </w:r>
-                </w:p>
-              </w:tc>
-              <w:tc>
-                <w:tcPr>
-                  <w:tcW w:type="dxa" w:w="1982"/>
-                  <w:vAlign w:val="center"/>
-                </w:tcPr>
-                <w:p>
-                  <w:pPr>
-                    <w:keepNext/>
-                    <w:spacing w:lineRule="exact" w:line="360" w:before="0" w:after="0"/>
-                    <w:jc w:val="center"/>
-                  </w:pPr>
-                  <w:r>
-                    <w:rPr>
-                      <w:rFonts w:ascii="Times New Roman" w:hAnsi="Times New Roman" w:cs="Times New Roman" w:eastAsia="標楷體"/>
-                      <w:b w:val="0"/>
-                      <w:i w:val="0"/>
-                      <w:sz w:val="24"/>
-                    </w:rPr>
-                    <w:t>1.06</w:t>
-                  </w:r>
-                </w:p>
-              </w:tc>
-              <w:tc>
-                <w:tcPr>
-                  <w:tcW w:type="dxa" w:w="1640"/>
-                  <w:vAlign w:val="center"/>
-                </w:tcPr>
-                <w:p>
-                  <w:pPr>
-                    <w:keepNext/>
-                    <w:spacing w:lineRule="exact" w:line="360" w:before="0" w:after="0"/>
-                    <w:jc w:val="center"/>
-                  </w:pPr>
-                  <w:r>
-                    <w:rPr>
-                      <w:rFonts w:ascii="Times New Roman" w:hAnsi="Times New Roman" w:cs="Times New Roman" w:eastAsia="標楷體"/>
-                      <w:b w:val="0"/>
-                      <w:i w:val="0"/>
-                      <w:sz w:val="24"/>
-                    </w:rPr>
-                    <w:t>77</w:t>
-                  </w:r>
-                </w:p>
-              </w:tc>
-              <w:tc>
-                <w:tcPr>
-                  <w:tcW w:type="dxa" w:w="1777"/>
-                  <w:vAlign w:val="center"/>
-                </w:tcPr>
-                <w:p>
-                  <w:pPr>
-                    <w:keepNext/>
-                    <w:spacing w:lineRule="exact" w:line="360" w:before="0" w:after="0"/>
-                    <w:jc w:val="center"/>
-                  </w:pPr>
-                  <w:r>
-                    <w:rPr>
-                      <w:rFonts w:ascii="Times New Roman" w:hAnsi="Times New Roman" w:cs="Times New Roman" w:eastAsia="標楷體"/>
-                      <w:b w:val="0"/>
-                      <w:i w:val="0"/>
-                      <w:sz w:val="24"/>
-                    </w:rPr>
-                    <w:t>81.2</w:t>
-                  </w:r>
-                </w:p>
-              </w:tc>
-              <w:tc>
-                <w:tcPr>
-                  <w:tcW w:type="dxa" w:w="1846"/>
-                  <w:vAlign w:val="center"/>
-                </w:tcPr>
-                <w:p>
-                  <w:pPr>
-                    <w:keepNext/>
-                    <w:spacing w:lineRule="exact" w:line="360" w:before="0" w:after="0"/>
-                    <w:jc w:val="center"/>
-                  </w:pPr>
-                  <w:r>
-                    <w:rPr>
-                      <w:rFonts w:ascii="Times New Roman" w:hAnsi="Times New Roman" w:cs="Times New Roman" w:eastAsia="標楷體"/>
-                      <w:b w:val="0"/>
-                      <w:i w:val="0"/>
-                      <w:sz w:val="24"/>
-                    </w:rPr>
-                    <w:t>5.1%</w:t>
-                  </w:r>
-                </w:p>
-              </w:tc>
-            </w:tr>
-            <w:tr>
-              <w:trPr>
-                <w:cantSplit/>
-              </w:trPr>
-              <w:tc>
-                <w:tcPr>
-                  <w:tcW w:type="dxa" w:w="2051"/>
-                  <w:vAlign w:val="center"/>
-                </w:tcPr>
-                <w:p>
-                  <w:pPr>
-                    <w:keepNext/>
-                    <w:spacing w:lineRule="exact" w:line="360" w:before="0" w:after="0"/>
-                    <w:jc w:val="left"/>
-                  </w:pPr>
-                  <w:r>
-                    <w:rPr>
-                      <w:rFonts w:ascii="Times New Roman" w:hAnsi="Times New Roman" w:cs="Times New Roman" w:eastAsia="標楷體"/>
-                      <w:b w:val="0"/>
-                      <w:i w:val="0"/>
-                      <w:sz w:val="24"/>
-                    </w:rPr>
-                    <w:t>302</w:t>
-                  </w:r>
-                </w:p>
-              </w:tc>
-              <w:tc>
-                <w:tcPr>
-                  <w:tcW w:type="dxa" w:w="1982"/>
-                  <w:vAlign w:val="center"/>
-                </w:tcPr>
-                <w:p>
-                  <w:pPr>
-                    <w:keepNext/>
-                    <w:spacing w:lineRule="exact" w:line="360" w:before="0" w:after="0"/>
-                    <w:jc w:val="center"/>
-                  </w:pPr>
-                  <w:r>
-                    <w:rPr>
-                      <w:rFonts w:ascii="Times New Roman" w:hAnsi="Times New Roman" w:cs="Times New Roman" w:eastAsia="標楷體"/>
-                      <w:b w:val="0"/>
-                      <w:i w:val="0"/>
-                      <w:sz w:val="24"/>
-                    </w:rPr>
-                    <w:t>2.11</w:t>
-                  </w:r>
-                </w:p>
-              </w:tc>
-              <w:tc>
-                <w:tcPr>
-                  <w:tcW w:type="dxa" w:w="1640"/>
-                  <w:vAlign w:val="center"/>
-                </w:tcPr>
-                <w:p>
-                  <w:pPr>
-                    <w:keepNext/>
-                    <w:spacing w:lineRule="exact" w:line="360" w:before="0" w:after="0"/>
-                    <w:jc w:val="center"/>
-                  </w:pPr>
-                  <w:r>
-                    <w:rPr>
-                      <w:rFonts w:ascii="Times New Roman" w:hAnsi="Times New Roman" w:cs="Times New Roman" w:eastAsia="標楷體"/>
-                      <w:b w:val="0"/>
-                      <w:i w:val="0"/>
-                      <w:sz w:val="24"/>
-                    </w:rPr>
-                    <w:t>36</w:t>
-                  </w:r>
-                </w:p>
-              </w:tc>
-              <w:tc>
-                <w:tcPr>
-                  <w:tcW w:type="dxa" w:w="1777"/>
-                  <w:vAlign w:val="center"/>
-                </w:tcPr>
-                <w:p>
-                  <w:pPr>
-                    <w:keepNext/>
-                    <w:spacing w:lineRule="exact" w:line="360" w:before="0" w:after="0"/>
-                    <w:jc w:val="center"/>
-                  </w:pPr>
-                  <w:r>
-                    <w:rPr>
-                      <w:rFonts w:ascii="Times New Roman" w:hAnsi="Times New Roman" w:cs="Times New Roman" w:eastAsia="標楷體"/>
-                      <w:b w:val="0"/>
-                      <w:i w:val="0"/>
-                      <w:sz w:val="24"/>
-                    </w:rPr>
-                    <w:t>75.8</w:t>
-                  </w:r>
-                </w:p>
-              </w:tc>
-              <w:tc>
-                <w:tcPr>
-                  <w:tcW w:type="dxa" w:w="1846"/>
-                  <w:vAlign w:val="center"/>
-                </w:tcPr>
-                <w:p>
-                  <w:pPr>
-                    <w:keepNext/>
-                    <w:spacing w:lineRule="exact" w:line="360" w:before="0" w:after="0"/>
-                    <w:jc w:val="center"/>
-                  </w:pPr>
-                  <w:r>
-                    <w:rPr>
-                      <w:rFonts w:ascii="Times New Roman" w:hAnsi="Times New Roman" w:cs="Times New Roman" w:eastAsia="標楷體"/>
-                      <w:b w:val="0"/>
-                      <w:i w:val="0"/>
-                      <w:sz w:val="24"/>
-                    </w:rPr>
-                    <w:t>4.8%</w:t>
-                  </w:r>
-                </w:p>
-              </w:tc>
-            </w:tr>
-            <w:tr>
-              <w:trPr>
-                <w:cantSplit/>
-              </w:trPr>
-              <w:tc>
-                <w:tcPr>
-                  <w:tcW w:type="dxa" w:w="2051"/>
-                  <w:vAlign w:val="center"/>
-                </w:tcPr>
-                <w:p>
-                  <w:pPr>
-                    <w:keepNext/>
-                    <w:spacing w:lineRule="exact" w:line="360" w:before="0" w:after="0"/>
-                    <w:jc w:val="left"/>
-                  </w:pPr>
-                  <w:r>
-                    <w:rPr>
-                      <w:rFonts w:ascii="Times New Roman" w:hAnsi="Times New Roman" w:cs="Times New Roman" w:eastAsia="標楷體"/>
-                      <w:b w:val="0"/>
-                      <w:i w:val="0"/>
-                      <w:sz w:val="24"/>
-                    </w:rPr>
-                    <w:t>5059</w:t>
-                  </w:r>
-                </w:p>
-              </w:tc>
-              <w:tc>
-                <w:tcPr>
-                  <w:tcW w:type="dxa" w:w="1982"/>
-                  <w:vAlign w:val="center"/>
-                </w:tcPr>
-                <w:p>
-                  <w:pPr>
-                    <w:keepNext/>
-                    <w:spacing w:lineRule="exact" w:line="360" w:before="0" w:after="0"/>
-                    <w:jc w:val="center"/>
-                  </w:pPr>
-                  <w:r>
-                    <w:rPr>
-                      <w:rFonts w:ascii="Times New Roman" w:hAnsi="Times New Roman" w:cs="Times New Roman" w:eastAsia="標楷體"/>
-                      <w:b w:val="0"/>
-                      <w:i w:val="0"/>
-                      <w:sz w:val="24"/>
-                    </w:rPr>
-                    <w:t>2.04</w:t>
-                  </w:r>
-                </w:p>
-              </w:tc>
-              <w:tc>
-                <w:tcPr>
-                  <w:tcW w:type="dxa" w:w="1640"/>
-                  <w:vAlign w:val="center"/>
-                </w:tcPr>
-                <w:p>
-                  <w:pPr>
-                    <w:keepNext/>
-                    <w:spacing w:lineRule="exact" w:line="360" w:before="0" w:after="0"/>
-                    <w:jc w:val="center"/>
-                  </w:pPr>
-                  <w:r>
-                    <w:rPr>
-                      <w:rFonts w:ascii="Times New Roman" w:hAnsi="Times New Roman" w:cs="Times New Roman" w:eastAsia="標楷體"/>
-                      <w:b w:val="0"/>
-                      <w:i w:val="0"/>
-                      <w:sz w:val="24"/>
-                    </w:rPr>
-                    <w:t>24</w:t>
-                  </w:r>
-                </w:p>
-              </w:tc>
-              <w:tc>
-                <w:tcPr>
-                  <w:tcW w:type="dxa" w:w="1777"/>
-                  <w:vAlign w:val="center"/>
-                </w:tcPr>
-                <w:p>
-                  <w:pPr>
-                    <w:keepNext/>
-                    <w:spacing w:lineRule="exact" w:line="360" w:before="0" w:after="0"/>
-                    <w:jc w:val="center"/>
-                  </w:pPr>
-                  <w:r>
-                    <w:rPr>
-                      <w:rFonts w:ascii="Times New Roman" w:hAnsi="Times New Roman" w:cs="Times New Roman" w:eastAsia="標楷體"/>
-                      <w:b w:val="0"/>
-                      <w:i w:val="0"/>
-                      <w:sz w:val="24"/>
-                    </w:rPr>
-                    <w:t>49.0</w:t>
-                  </w:r>
-                </w:p>
-              </w:tc>
-              <w:tc>
-                <w:tcPr>
-                  <w:tcW w:type="dxa" w:w="1846"/>
-                  <w:vAlign w:val="center"/>
-                </w:tcPr>
-                <w:p>
-                  <w:pPr>
-                    <w:keepNext/>
-                    <w:spacing w:lineRule="exact" w:line="360" w:before="0" w:after="0"/>
-                    <w:jc w:val="center"/>
-                  </w:pPr>
-                  <w:r>
-                    <w:rPr>
-                      <w:rFonts w:ascii="Times New Roman" w:hAnsi="Times New Roman" w:cs="Times New Roman" w:eastAsia="標楷體"/>
-                      <w:b w:val="0"/>
-                      <w:i w:val="0"/>
-                      <w:sz w:val="24"/>
-                    </w:rPr>
-                    <w:t>3.1%</w:t>
-                  </w:r>
-                </w:p>
-              </w:tc>
-            </w:tr>
-            <w:tr>
-              <w:trPr>
-                <w:cantSplit/>
-              </w:trPr>
-              <w:tc>
-                <w:tcPr>
-                  <w:tcW w:type="dxa" w:w="2051"/>
-                  <w:vAlign w:val="center"/>
-                </w:tcPr>
-                <w:p>
-                  <w:pPr>
-                    <w:keepNext/>
-                    <w:spacing w:lineRule="exact" w:line="360" w:before="0" w:after="0"/>
-                    <w:jc w:val="left"/>
-                  </w:pPr>
-                  <w:r>
-                    <w:rPr>
-                      <w:rFonts w:ascii="Times New Roman" w:hAnsi="Times New Roman" w:cs="Times New Roman" w:eastAsia="標楷體"/>
-                      <w:b w:val="0"/>
-                      <w:i w:val="0"/>
-                      <w:sz w:val="24"/>
-                    </w:rPr>
-                    <w:t>5022A</w:t>
-                  </w:r>
-                </w:p>
-              </w:tc>
-              <w:tc>
-                <w:tcPr>
-                  <w:tcW w:type="dxa" w:w="1982"/>
-                  <w:vAlign w:val="center"/>
-                </w:tcPr>
-                <w:p>
-                  <w:pPr>
-                    <w:keepNext/>
-                    <w:spacing w:lineRule="exact" w:line="360" w:before="0" w:after="0"/>
-                    <w:jc w:val="center"/>
-                  </w:pPr>
-                  <w:r>
-                    <w:rPr>
-                      <w:rFonts w:ascii="Times New Roman" w:hAnsi="Times New Roman" w:cs="Times New Roman" w:eastAsia="標楷體"/>
-                      <w:b w:val="0"/>
-                      <w:i w:val="0"/>
-                      <w:sz w:val="24"/>
-                    </w:rPr>
-                    <w:t>5.18</w:t>
-                  </w:r>
-                </w:p>
-              </w:tc>
-              <w:tc>
-                <w:tcPr>
-                  <w:tcW w:type="dxa" w:w="1640"/>
-                  <w:vAlign w:val="center"/>
-                </w:tcPr>
-                <w:p>
-                  <w:pPr>
-                    <w:keepNext/>
-                    <w:spacing w:lineRule="exact" w:line="360" w:before="0" w:after="0"/>
-                    <w:jc w:val="center"/>
-                  </w:pPr>
-                  <w:r>
-                    <w:rPr>
-                      <w:rFonts w:ascii="Times New Roman" w:hAnsi="Times New Roman" w:cs="Times New Roman" w:eastAsia="標楷體"/>
-                      <w:b w:val="0"/>
-                      <w:i w:val="0"/>
-                      <w:sz w:val="24"/>
-                    </w:rPr>
-                    <w:t>9</w:t>
-                  </w:r>
-                </w:p>
-              </w:tc>
-              <w:tc>
-                <w:tcPr>
-                  <w:tcW w:type="dxa" w:w="1777"/>
-                  <w:vAlign w:val="center"/>
-                </w:tcPr>
-                <w:p>
-                  <w:pPr>
-                    <w:keepNext/>
-                    <w:spacing w:lineRule="exact" w:line="360" w:before="0" w:after="0"/>
-                    <w:jc w:val="center"/>
-                  </w:pPr>
-                  <w:r>
-                    <w:rPr>
-                      <w:rFonts w:ascii="Times New Roman" w:hAnsi="Times New Roman" w:cs="Times New Roman" w:eastAsia="標楷體"/>
-                      <w:b w:val="0"/>
-                      <w:i w:val="0"/>
-                      <w:sz w:val="24"/>
-                    </w:rPr>
-                    <w:t>46.5</w:t>
-                  </w:r>
-                </w:p>
-              </w:tc>
-              <w:tc>
-                <w:tcPr>
-                  <w:tcW w:type="dxa" w:w="1846"/>
-                  <w:vAlign w:val="center"/>
-                </w:tcPr>
-                <w:p>
-                  <w:pPr>
-                    <w:keepNext/>
-                    <w:spacing w:lineRule="exact" w:line="360" w:before="0" w:after="0"/>
-                    <w:jc w:val="center"/>
-                  </w:pPr>
-                  <w:r>
-                    <w:rPr>
-                      <w:rFonts w:ascii="Times New Roman" w:hAnsi="Times New Roman" w:cs="Times New Roman" w:eastAsia="標楷體"/>
-                      <w:b w:val="0"/>
-                      <w:i w:val="0"/>
-                      <w:sz w:val="24"/>
-                    </w:rPr>
-                    <w:t>2.9%</w:t>
-                  </w:r>
-                </w:p>
-              </w:tc>
-            </w:tr>
-            <w:tr>
-              <w:trPr>
-                <w:cantSplit/>
-              </w:trPr>
-              <w:tc>
-                <w:tcPr>
-                  <w:tcW w:type="dxa" w:w="2051"/>
-                  <w:vAlign w:val="center"/>
-                </w:tcPr>
-                <w:p>
-                  <w:pPr>
-                    <w:spacing w:lineRule="exact" w:line="360" w:before="0" w:after="0"/>
-                    <w:jc w:val="left"/>
-                  </w:pPr>
-                  <w:r>
-                    <w:rPr>
-                      <w:rFonts w:ascii="Times New Roman" w:hAnsi="Times New Roman" w:cs="Times New Roman" w:eastAsia="標楷體"/>
-                      <w:b/>
-                      <w:i w:val="0"/>
-                      <w:sz w:val="24"/>
-                    </w:rPr>
-                    <w:t>51條路線合計</w:t>
-                  </w:r>
-                </w:p>
-              </w:tc>
-              <w:tc>
-                <w:tcPr>
-                  <w:tcW w:type="dxa" w:w="1982"/>
-                  <w:vAlign w:val="center"/>
-                </w:tcPr>
-                <w:p>
-                  <w:pPr>
-                    <w:spacing w:lineRule="exact" w:line="360" w:before="0" w:after="0"/>
-                    <w:jc w:val="center"/>
-                  </w:pPr>
-                  <w:r>
-                    <w:rPr>
-                      <w:rFonts w:ascii="Times New Roman" w:hAnsi="Times New Roman" w:cs="Times New Roman" w:eastAsia="標楷體"/>
-                      <w:b/>
-                      <w:i w:val="0"/>
-                      <w:sz w:val="24"/>
-                    </w:rPr>
-                  </w:r>
-                </w:p>
-              </w:tc>
-              <w:tc>
-                <w:tcPr>
-                  <w:tcW w:type="dxa" w:w="1640"/>
-                  <w:vAlign w:val="center"/>
-                </w:tcPr>
-                <w:p>
-                  <w:pPr>
-                    <w:spacing w:lineRule="exact" w:line="360" w:before="0" w:after="0"/>
-                    <w:jc w:val="center"/>
-                  </w:pPr>
-                  <w:r>
-                    <w:rPr>
-                      <w:rFonts w:ascii="Times New Roman" w:hAnsi="Times New Roman" w:cs="Times New Roman" w:eastAsia="標楷體"/>
-                      <w:b/>
-                      <w:i w:val="0"/>
-                      <w:sz w:val="24"/>
-                    </w:rPr>
-                  </w:r>
-                </w:p>
-              </w:tc>
-              <w:tc>
-                <w:tcPr>
-                  <w:tcW w:type="dxa" w:w="1777"/>
-                  <w:vAlign w:val="center"/>
-                </w:tcPr>
-                <w:p>
-                  <w:pPr>
-                    <w:spacing w:lineRule="exact" w:line="360" w:before="0" w:after="0"/>
-                    <w:jc w:val="center"/>
-                  </w:pPr>
-                  <w:r>
-                    <w:rPr>
-                      <w:rFonts w:ascii="Times New Roman" w:hAnsi="Times New Roman" w:cs="Times New Roman" w:eastAsia="標楷體"/>
-                      <w:b/>
-                      <w:i w:val="0"/>
-                      <w:sz w:val="24"/>
-                    </w:rPr>
-                    <w:t>1,579.3</w:t>
-                  </w:r>
-                </w:p>
-              </w:tc>
-              <w:tc>
-                <w:tcPr>
-                  <w:tcW w:type="dxa" w:w="1846"/>
-                  <w:vAlign w:val="center"/>
-                </w:tcPr>
-                <w:p>
-                  <w:pPr>
-                    <w:spacing w:lineRule="exact" w:line="360" w:before="0" w:after="0"/>
-                    <w:jc w:val="center"/>
-                  </w:pPr>
-                  <w:r>
-                    <w:rPr>
-                      <w:rFonts w:ascii="Times New Roman" w:hAnsi="Times New Roman" w:cs="Times New Roman" w:eastAsia="標楷體"/>
-                      <w:b/>
-                      <w:i w:val="0"/>
-                      <w:sz w:val="24"/>
-                    </w:rPr>
-                    <w:t>100%</w:t>
+                    <w:t>變異係數、大間隔比例</w:t>
                   </w:r>
                 </w:p>
               </w:tc>
@@ -2722,69 +2188,12 @@
                 <w:i w:val="0"/>
                 <w:sz w:val="24"/>
               </w:rPr>
-              <w:t>註：範圍內長度取較長方向之線型；平日班次為雙向合計；範圍內車公里＝平日班次×7站500 m範圍內線型長度（每平日），為重整可釋出資源之上限參考；占比為占全部重疊車公里之比例。資料來源：TDX[19]（115年10月24日取得）、OSM[22]。</w:t>
+              <w:t>註：候選示意，不指定路線，非市府決定。資料：TDX[18], [19]、OSM[20]。</w:t>
             </w:r>
           </w:p>
           <w:p>
             <w:pPr>
-              <w:keepNext/>
-              <w:spacing w:lineRule="auto" w:line="240" w:before="120" w:after="0"/>
-              <w:jc w:val="center"/>
-            </w:pPr>
-            <w:r>
-              <w:drawing>
-                <wp:inline xmlns:a="http://schemas.openxmlformats.org/drawingml/2006/main" xmlns:pic="http://schemas.openxmlformats.org/drawingml/2006/picture">
-                  <wp:extent cx="3600000" cy="4245261"/>
-                  <wp:docPr id="1" name="Picture 1"/>
-                  <wp:cNvGraphicFramePr>
-                    <a:graphicFrameLocks noChangeAspect="1"/>
-                  </wp:cNvGraphicFramePr>
-                  <a:graphic>
-                    <a:graphicData uri="http://schemas.openxmlformats.org/drawingml/2006/picture">
-                      <pic:pic>
-                        <pic:nvPicPr>
-                          <pic:cNvPr id="0" name="fig1_overlap.png"/>
-                          <pic:cNvPicPr/>
-                        </pic:nvPicPr>
-                        <pic:blipFill>
-                          <a:blip r:embed="rId10"/>
-                          <a:stretch>
-                            <a:fillRect/>
-                          </a:stretch>
-                        </pic:blipFill>
-                        <pic:spPr>
-                          <a:xfrm>
-                            <a:off x="0" y="0"/>
-                            <a:ext cx="3600000" cy="4245261"/>
-                          </a:xfrm>
-                          <a:prstGeom prst="rect"/>
-                        </pic:spPr>
-                      </pic:pic>
-                    </a:graphicData>
-                  </a:graphic>
-                </wp:inline>
-              </w:drawing>
-            </w:r>
-          </w:p>
-          <w:p>
-            <w:pPr>
-              <w:spacing w:lineRule="exact" w:line="360" w:before="0" w:after="120"/>
-              <w:jc w:val="center"/>
-            </w:pPr>
-            <w:r>
-              <w:rPr>
-                <w:rFonts w:ascii="Times New Roman" w:hAnsi="Times New Roman" w:cs="Times New Roman" w:eastAsia="標楷體"/>
-                <w:b/>
-                <w:i w:val="0"/>
-                <w:sz w:val="24"/>
-              </w:rPr>
-              <w:t>圖1　TDX實際線型下與綠線北段7站500 m範圍重疊長度前10名之子路線。資料：TDX Shape、StopOfRoute（115年10月24日取得）[19]；OSM[22]。</w:t>
-            </w:r>
-          </w:p>
-          <w:p>
-            <w:pPr>
-              <w:spacing w:lineRule="exact" w:line="360" w:before="0" w:after="0"/>
-              <w:ind w:left="0"/>
+              <w:spacing w:lineRule="exact" w:line="360" w:before="80" w:after="0"/>
             </w:pPr>
             <w:r>
               <w:rPr>
@@ -2793,7 +2202,7 @@
                 <w:i w:val="0"/>
                 <w:sz w:val="28"/>
               </w:rPr>
-              <w:t>(二)車站接駁可及性</w:t>
+              <w:t>六、實作項目與驗收</w:t>
             </w:r>
           </w:p>
           <w:p>
@@ -2809,7 +2218,7 @@
                 <w:i w:val="0"/>
                 <w:sz w:val="28"/>
               </w:rPr>
-              <w:t>G14接駁最弱：300 m內無站牌，500 m內尖峰每小時4.2班。G12之500 m內尖峰亦僅4.2班，但800 m內估計約有1,379名65歲以上居民，為「長者多、接駁弱」最明顯之站；G11接駁最充足（尖峰25.8班）（表2、圖2）。</w:t>
+              <w:t>本研究產出可運作之工具，而非僅有報告。各項目現況與驗收方式如表2。</w:t>
             </w:r>
           </w:p>
           <w:p>
@@ -2833,10 +2242,10 @@
               <w:tblLayout w:type="fixed"/>
             </w:tblPr>
             <w:tblGrid>
-              <w:gridCol w:w="2391"/>
-              <w:gridCol w:w="1859"/>
-              <w:gridCol w:w="2523"/>
-              <w:gridCol w:w="2523"/>
+              <w:gridCol w:w="1678"/>
+              <w:gridCol w:w="3228"/>
+              <w:gridCol w:w="2324"/>
+              <w:gridCol w:w="2066"/>
             </w:tblGrid>
             <w:tr>
               <w:trPr>
@@ -2866,7 +2275,7 @@
                       <w:i w:val="0"/>
                       <w:sz w:val="24"/>
                     </w:rPr>
-                    <w:t>表2　各站步行等時圈內公車服務與長者人口（300／500／800 m）</w:t>
+                    <w:t>表2　實作項目與驗收</w:t>
                   </w:r>
                 </w:p>
               </w:tc>
@@ -2878,7 +2287,7 @@
               </w:trPr>
               <w:tc>
                 <w:tcPr>
-                  <w:tcW w:type="dxa" w:w="2391"/>
+                  <w:tcW w:type="dxa" w:w="1678"/>
                   <w:shd w:val="clear" w:color="auto" w:fill="E7E6E6"/>
                   <w:vAlign w:val="center"/>
                 </w:tcPr>
@@ -2895,13 +2304,13 @@
                       <w:i w:val="0"/>
                       <w:sz w:val="24"/>
                     </w:rPr>
-                    <w:t>車站</w:t>
+                    <w:t>項目</w:t>
                   </w:r>
                 </w:p>
               </w:tc>
               <w:tc>
                 <w:tcPr>
-                  <w:tcW w:type="dxa" w:w="1859"/>
+                  <w:tcW w:type="dxa" w:w="3228"/>
                   <w:shd w:val="clear" w:color="auto" w:fill="E7E6E6"/>
                   <w:vAlign w:val="center"/>
                 </w:tcPr>
@@ -2918,13 +2327,13 @@
                       <w:i w:val="0"/>
                       <w:sz w:val="24"/>
                     </w:rPr>
-                    <w:t>站牌位置數</w:t>
+                    <w:t>內容</w:t>
                   </w:r>
                 </w:p>
               </w:tc>
               <w:tc>
                 <w:tcPr>
-                  <w:tcW w:type="dxa" w:w="2523"/>
+                  <w:tcW w:type="dxa" w:w="2324"/>
                   <w:shd w:val="clear" w:color="auto" w:fill="E7E6E6"/>
                   <w:vAlign w:val="center"/>
                 </w:tcPr>
@@ -2941,13 +2350,13 @@
                       <w:i w:val="0"/>
                       <w:sz w:val="24"/>
                     </w:rPr>
-                    <w:t>尖峰班次／時</w:t>
+                    <w:t>現況</w:t>
                   </w:r>
                 </w:p>
               </w:tc>
               <w:tc>
                 <w:tcPr>
-                  <w:tcW w:type="dxa" w:w="2523"/>
+                  <w:tcW w:type="dxa" w:w="2066"/>
                   <w:shd w:val="clear" w:color="auto" w:fill="E7E6E6"/>
                   <w:vAlign w:val="center"/>
                 </w:tcPr>
@@ -2964,7 +2373,7 @@
                       <w:i w:val="0"/>
                       <w:sz w:val="24"/>
                     </w:rPr>
-                    <w:t>65歲以上人口估計</w:t>
+                    <w:t>驗收</w:t>
                   </w:r>
                 </w:p>
               </w:tc>
@@ -2975,7 +2384,7 @@
               </w:trPr>
               <w:tc>
                 <w:tcPr>
-                  <w:tcW w:type="dxa" w:w="2391"/>
+                  <w:tcW w:type="dxa" w:w="1678"/>
                   <w:vAlign w:val="center"/>
                 </w:tcPr>
                 <w:p>
@@ -2991,13 +2400,13 @@
                       <w:i w:val="0"/>
                       <w:sz w:val="24"/>
                     </w:rPr>
-                    <w:t>G11藝文特區</w:t>
+                    <w:t>決策平台</w:t>
                   </w:r>
                 </w:p>
               </w:tc>
               <w:tc>
                 <w:tcPr>
-                  <w:tcW w:type="dxa" w:w="1859"/>
+                  <w:tcW w:type="dxa" w:w="3228"/>
                   <w:vAlign w:val="center"/>
                 </w:tcPr>
                 <w:p>
@@ -3013,13 +2422,13 @@
                       <w:i w:val="0"/>
                       <w:sz w:val="24"/>
                     </w:rPr>
-                    <w:t>8／12／42</w:t>
+                    <w:t>分析頁面與「改良方案」專區（五個方案各一頁，含地圖、數字與規則檢查）</w:t>
                   </w:r>
                 </w:p>
               </w:tc>
               <w:tc>
                 <w:tcPr>
-                  <w:tcW w:type="dxa" w:w="2523"/>
+                  <w:tcW w:type="dxa" w:w="2324"/>
                   <w:vAlign w:val="center"/>
                 </w:tcPr>
                 <w:p>
@@ -3035,13 +2444,13 @@
                       <w:i w:val="0"/>
                       <w:sz w:val="24"/>
                     </w:rPr>
-                    <w:t>25.8／25.8／36.8</w:t>
+                    <w:t>展示版已完成</w:t>
                   </w:r>
                 </w:p>
               </w:tc>
               <w:tc>
                 <w:tcPr>
-                  <w:tcW w:type="dxa" w:w="2523"/>
+                  <w:tcW w:type="dxa" w:w="2066"/>
                   <w:vAlign w:val="center"/>
                 </w:tcPr>
                 <w:p>
@@ -3057,7 +2466,7 @@
                       <w:i w:val="0"/>
                       <w:sz w:val="24"/>
                     </w:rPr>
-                    <w:t>857／2,431／6,231</w:t>
+                    <w:t>市府人員可調參數並比較方案</w:t>
                   </w:r>
                 </w:p>
               </w:tc>
@@ -3068,7 +2477,7 @@
               </w:trPr>
               <w:tc>
                 <w:tcPr>
-                  <w:tcW w:type="dxa" w:w="2391"/>
+                  <w:tcW w:type="dxa" w:w="1678"/>
                   <w:vAlign w:val="center"/>
                 </w:tcPr>
                 <w:p>
@@ -3084,13 +2493,13 @@
                       <w:i w:val="0"/>
                       <w:sz w:val="24"/>
                     </w:rPr>
-                    <w:t>G12蘆興埤</w:t>
+                    <w:t>班距分析程式</w:t>
                   </w:r>
                 </w:p>
               </w:tc>
               <w:tc>
                 <w:tcPr>
-                  <w:tcW w:type="dxa" w:w="1859"/>
+                  <w:tcW w:type="dxa" w:w="3228"/>
                   <w:vAlign w:val="center"/>
                 </w:tcPr>
                 <w:p>
@@ -3106,13 +2515,13 @@
                       <w:i w:val="0"/>
                       <w:sz w:val="24"/>
                     </w:rPr>
-                    <w:t>2／4／15</w:t>
+                    <w:t>由位置資料推算班距與可靠度指標，開源</w:t>
                   </w:r>
                 </w:p>
               </w:tc>
               <w:tc>
                 <w:tcPr>
-                  <w:tcW w:type="dxa" w:w="2523"/>
+                  <w:tcW w:type="dxa" w:w="2324"/>
                   <w:vAlign w:val="center"/>
                 </w:tcPr>
                 <w:p>
@@ -3128,13 +2537,13 @@
                       <w:i w:val="0"/>
                       <w:sz w:val="24"/>
                     </w:rPr>
-                    <w:t>4.2／4.2／17.5</w:t>
+                    <w:t>已完成，合成與單日真實資料測試</w:t>
                   </w:r>
                 </w:p>
               </w:tc>
               <w:tc>
                 <w:tcPr>
-                  <w:tcW w:type="dxa" w:w="2523"/>
+                  <w:tcW w:type="dxa" w:w="2066"/>
                   <w:vAlign w:val="center"/>
                 </w:tcPr>
                 <w:p>
@@ -3150,7 +2559,7 @@
                       <w:i w:val="0"/>
                       <w:sz w:val="24"/>
                     </w:rPr>
-                    <w:t>320／580／1,379</w:t>
+                    <w:t>可重複產出報告</w:t>
                   </w:r>
                 </w:p>
               </w:tc>
@@ -3161,7 +2570,7 @@
               </w:trPr>
               <w:tc>
                 <w:tcPr>
-                  <w:tcW w:type="dxa" w:w="2391"/>
+                  <w:tcW w:type="dxa" w:w="1678"/>
                   <w:vAlign w:val="center"/>
                 </w:tcPr>
                 <w:p>
@@ -3177,13 +2586,13 @@
                       <w:i w:val="0"/>
                       <w:sz w:val="24"/>
                     </w:rPr>
-                    <w:t>G13南竹中正北</w:t>
+                    <w:t>規則檢查與情境</w:t>
                   </w:r>
                 </w:p>
               </w:tc>
               <w:tc>
                 <w:tcPr>
-                  <w:tcW w:type="dxa" w:w="1859"/>
+                  <w:tcW w:type="dxa" w:w="3228"/>
                   <w:vAlign w:val="center"/>
                 </w:tcPr>
                 <w:p>
@@ -3199,13 +2608,13 @@
                       <w:i w:val="0"/>
                       <w:sz w:val="24"/>
                     </w:rPr>
-                    <w:t>4／15／32</w:t>
+                    <w:t>可靠度門檻、車型容量、新線長度檢查；切短接鐵路站、站出發社區接駁</w:t>
                   </w:r>
                 </w:p>
               </w:tc>
               <w:tc>
                 <w:tcPr>
-                  <w:tcW w:type="dxa" w:w="2523"/>
+                  <w:tcW w:type="dxa" w:w="2324"/>
                   <w:vAlign w:val="center"/>
                 </w:tcPr>
                 <w:p>
@@ -3221,13 +2630,13 @@
                       <w:i w:val="0"/>
                       <w:sz w:val="24"/>
                     </w:rPr>
-                    <w:t>8.8／17.0／17.2</w:t>
+                    <w:t>展示版已完成，門檻待多日資料校正</w:t>
                   </w:r>
                 </w:p>
               </w:tc>
               <w:tc>
                 <w:tcPr>
-                  <w:tcW w:type="dxa" w:w="2523"/>
+                  <w:tcW w:type="dxa" w:w="2066"/>
                   <w:vAlign w:val="center"/>
                 </w:tcPr>
                 <w:p>
@@ -3243,7 +2652,7 @@
                       <w:i w:val="0"/>
                       <w:sz w:val="24"/>
                     </w:rPr>
-                    <w:t>116／332／1,097</w:t>
+                    <w:t>方案一至五可於平台比較與檢查</w:t>
                   </w:r>
                 </w:p>
               </w:tc>
@@ -3254,7 +2663,7 @@
               </w:trPr>
               <w:tc>
                 <w:tcPr>
-                  <w:tcW w:type="dxa" w:w="2391"/>
+                  <w:tcW w:type="dxa" w:w="1678"/>
                   <w:vAlign w:val="center"/>
                 </w:tcPr>
                 <w:p>
@@ -3270,13 +2679,13 @@
                       <w:i w:val="0"/>
                       <w:sz w:val="24"/>
                     </w:rPr>
-                    <w:t>G14蘆竹中正北</w:t>
+                    <w:t>通車前後監測</w:t>
                   </w:r>
                 </w:p>
               </w:tc>
               <w:tc>
                 <w:tcPr>
-                  <w:tcW w:type="dxa" w:w="1859"/>
+                  <w:tcW w:type="dxa" w:w="3228"/>
                   <w:vAlign w:val="center"/>
                 </w:tcPr>
                 <w:p>
@@ -3292,13 +2701,13 @@
                       <w:i w:val="0"/>
                       <w:sz w:val="24"/>
                     </w:rPr>
-                    <w:t>0／2／9</w:t>
+                    <w:t>建立通車前基準，通車後同時段再測</w:t>
                   </w:r>
                 </w:p>
               </w:tc>
               <w:tc>
                 <w:tcPr>
-                  <w:tcW w:type="dxa" w:w="2523"/>
+                  <w:tcW w:type="dxa" w:w="2324"/>
                   <w:vAlign w:val="center"/>
                 </w:tcPr>
                 <w:p>
@@ -3314,13 +2723,13 @@
                       <w:i w:val="0"/>
                       <w:sz w:val="24"/>
                     </w:rPr>
-                    <w:t>0.0／4.2／5.5</w:t>
+                    <w:t>蒐集程式已完成，基準建立中</w:t>
                   </w:r>
                 </w:p>
               </w:tc>
               <w:tc>
                 <w:tcPr>
-                  <w:tcW w:type="dxa" w:w="2523"/>
+                  <w:tcW w:type="dxa" w:w="2066"/>
                   <w:vAlign w:val="center"/>
                 </w:tcPr>
                 <w:p>
@@ -3336,7 +2745,7 @@
                       <w:i w:val="0"/>
                       <w:sz w:val="24"/>
                     </w:rPr>
-                    <w:t>11／21／71</w:t>
+                    <w:t>前後比較報告</w:t>
                   </w:r>
                 </w:p>
               </w:tc>
@@ -3347,193 +2756,7 @@
               </w:trPr>
               <w:tc>
                 <w:tcPr>
-                  <w:tcW w:type="dxa" w:w="2391"/>
-                  <w:vAlign w:val="center"/>
-                </w:tcPr>
-                <w:p>
-                  <w:pPr>
-                    <w:keepNext/>
-                    <w:spacing w:lineRule="exact" w:line="360" w:before="0" w:after="0"/>
-                    <w:jc w:val="left"/>
-                  </w:pPr>
-                  <w:r>
-                    <w:rPr>
-                      <w:rFonts w:ascii="Times New Roman" w:hAnsi="Times New Roman" w:cs="Times New Roman" w:eastAsia="標楷體"/>
-                      <w:b w:val="0"/>
-                      <w:i w:val="0"/>
-                      <w:sz w:val="24"/>
-                    </w:rPr>
-                    <w:t>G15水尾</w:t>
-                  </w:r>
-                </w:p>
-              </w:tc>
-              <w:tc>
-                <w:tcPr>
-                  <w:tcW w:type="dxa" w:w="1859"/>
-                  <w:vAlign w:val="center"/>
-                </w:tcPr>
-                <w:p>
-                  <w:pPr>
-                    <w:keepNext/>
-                    <w:spacing w:lineRule="exact" w:line="360" w:before="0" w:after="0"/>
-                    <w:jc w:val="center"/>
-                  </w:pPr>
-                  <w:r>
-                    <w:rPr>
-                      <w:rFonts w:ascii="Times New Roman" w:hAnsi="Times New Roman" w:cs="Times New Roman" w:eastAsia="標楷體"/>
-                      <w:b w:val="0"/>
-                      <w:i w:val="0"/>
-                      <w:sz w:val="24"/>
-                    </w:rPr>
-                    <w:t>6／13／21</w:t>
-                  </w:r>
-                </w:p>
-              </w:tc>
-              <w:tc>
-                <w:tcPr>
-                  <w:tcW w:type="dxa" w:w="2523"/>
-                  <w:vAlign w:val="center"/>
-                </w:tcPr>
-                <w:p>
-                  <w:pPr>
-                    <w:keepNext/>
-                    <w:spacing w:lineRule="exact" w:line="360" w:before="0" w:after="0"/>
-                    <w:jc w:val="center"/>
-                  </w:pPr>
-                  <w:r>
-                    <w:rPr>
-                      <w:rFonts w:ascii="Times New Roman" w:hAnsi="Times New Roman" w:cs="Times New Roman" w:eastAsia="標楷體"/>
-                      <w:b w:val="0"/>
-                      <w:i w:val="0"/>
-                      <w:sz w:val="24"/>
-                    </w:rPr>
-                    <w:t>21.0／21.2／21.8</w:t>
-                  </w:r>
-                </w:p>
-              </w:tc>
-              <w:tc>
-                <w:tcPr>
-                  <w:tcW w:type="dxa" w:w="2523"/>
-                  <w:vAlign w:val="center"/>
-                </w:tcPr>
-                <w:p>
-                  <w:pPr>
-                    <w:keepNext/>
-                    <w:spacing w:lineRule="exact" w:line="360" w:before="0" w:after="0"/>
-                    <w:jc w:val="center"/>
-                  </w:pPr>
-                  <w:r>
-                    <w:rPr>
-                      <w:rFonts w:ascii="Times New Roman" w:hAnsi="Times New Roman" w:cs="Times New Roman" w:eastAsia="標楷體"/>
-                      <w:b w:val="0"/>
-                      <w:i w:val="0"/>
-                      <w:sz w:val="24"/>
-                    </w:rPr>
-                    <w:t>24／68／148</w:t>
-                  </w:r>
-                </w:p>
-              </w:tc>
-            </w:tr>
-            <w:tr>
-              <w:trPr>
-                <w:cantSplit/>
-              </w:trPr>
-              <w:tc>
-                <w:tcPr>
-                  <w:tcW w:type="dxa" w:w="2391"/>
-                  <w:vAlign w:val="center"/>
-                </w:tcPr>
-                <w:p>
-                  <w:pPr>
-                    <w:keepNext/>
-                    <w:spacing w:lineRule="exact" w:line="360" w:before="0" w:after="0"/>
-                    <w:jc w:val="left"/>
-                  </w:pPr>
-                  <w:r>
-                    <w:rPr>
-                      <w:rFonts w:ascii="Times New Roman" w:hAnsi="Times New Roman" w:cs="Times New Roman" w:eastAsia="標楷體"/>
-                      <w:b w:val="0"/>
-                      <w:i w:val="0"/>
-                      <w:sz w:val="24"/>
-                    </w:rPr>
-                    <w:t>G15a菓林</w:t>
-                  </w:r>
-                </w:p>
-              </w:tc>
-              <w:tc>
-                <w:tcPr>
-                  <w:tcW w:type="dxa" w:w="1859"/>
-                  <w:vAlign w:val="center"/>
-                </w:tcPr>
-                <w:p>
-                  <w:pPr>
-                    <w:keepNext/>
-                    <w:spacing w:lineRule="exact" w:line="360" w:before="0" w:after="0"/>
-                    <w:jc w:val="center"/>
-                  </w:pPr>
-                  <w:r>
-                    <w:rPr>
-                      <w:rFonts w:ascii="Times New Roman" w:hAnsi="Times New Roman" w:cs="Times New Roman" w:eastAsia="標楷體"/>
-                      <w:b w:val="0"/>
-                      <w:i w:val="0"/>
-                      <w:sz w:val="24"/>
-                    </w:rPr>
-                    <w:t>9／21／26</w:t>
-                  </w:r>
-                </w:p>
-              </w:tc>
-              <w:tc>
-                <w:tcPr>
-                  <w:tcW w:type="dxa" w:w="2523"/>
-                  <w:vAlign w:val="center"/>
-                </w:tcPr>
-                <w:p>
-                  <w:pPr>
-                    <w:keepNext/>
-                    <w:spacing w:lineRule="exact" w:line="360" w:before="0" w:after="0"/>
-                    <w:jc w:val="center"/>
-                  </w:pPr>
-                  <w:r>
-                    <w:rPr>
-                      <w:rFonts w:ascii="Times New Roman" w:hAnsi="Times New Roman" w:cs="Times New Roman" w:eastAsia="標楷體"/>
-                      <w:b w:val="0"/>
-                      <w:i w:val="0"/>
-                      <w:sz w:val="24"/>
-                    </w:rPr>
-                    <w:t>14.8／14.8／15.2</w:t>
-                  </w:r>
-                </w:p>
-              </w:tc>
-              <w:tc>
-                <w:tcPr>
-                  <w:tcW w:type="dxa" w:w="2523"/>
-                  <w:vAlign w:val="center"/>
-                </w:tcPr>
-                <w:p>
-                  <w:pPr>
-                    <w:keepNext/>
-                    <w:spacing w:lineRule="exact" w:line="360" w:before="0" w:after="0"/>
-                    <w:jc w:val="center"/>
-                  </w:pPr>
-                  <w:r>
-                    <w:rPr>
-                      <w:rFonts w:ascii="Times New Roman" w:hAnsi="Times New Roman" w:cs="Times New Roman" w:eastAsia="標楷體"/>
-                      <w:b w:val="0"/>
-                      <w:i w:val="0"/>
-                      <w:sz w:val="24"/>
-                    </w:rPr>
-                    <w:t>99／253／523</w:t>
-                  </w:r>
-                </w:p>
-              </w:tc>
-            </w:tr>
-            <w:tr>
-              <w:trPr>
-                <w:cantSplit/>
-              </w:trPr>
-              <w:tc>
-                <w:tcPr>
-                  <w:tcW w:type="dxa" w:w="2391"/>
+                  <w:tcW w:type="dxa" w:w="1678"/>
                   <w:vAlign w:val="center"/>
                 </w:tcPr>
                 <w:p>
@@ -3548,13 +2771,13 @@
                       <w:i w:val="0"/>
                       <w:sz w:val="24"/>
                     </w:rPr>
-                    <w:t>G15b坑口</w:t>
+                    <w:t>試辦建議</w:t>
                   </w:r>
                 </w:p>
               </w:tc>
               <w:tc>
                 <w:tcPr>
-                  <w:tcW w:type="dxa" w:w="1859"/>
+                  <w:tcW w:type="dxa" w:w="3228"/>
                   <w:vAlign w:val="center"/>
                 </w:tcPr>
                 <w:p>
@@ -3569,13 +2792,13 @@
                       <w:i w:val="0"/>
                       <w:sz w:val="24"/>
                     </w:rPr>
-                    <w:t>1／2／6</w:t>
+                    <w:t>與市府討論G14接駁線小規模試辦之路線、班次與指標</w:t>
                   </w:r>
                 </w:p>
               </w:tc>
               <w:tc>
                 <w:tcPr>
-                  <w:tcW w:type="dxa" w:w="2523"/>
+                  <w:tcW w:type="dxa" w:w="2324"/>
                   <w:vAlign w:val="center"/>
                 </w:tcPr>
                 <w:p>
@@ -3590,13 +2813,13 @@
                       <w:i w:val="0"/>
                       <w:sz w:val="24"/>
                     </w:rPr>
-                    <w:t>0.5／6.2／6.2</w:t>
+                    <w:t>規劃，須市府同意</w:t>
                   </w:r>
                 </w:p>
               </w:tc>
               <w:tc>
                 <w:tcPr>
-                  <w:tcW w:type="dxa" w:w="2523"/>
+                  <w:tcW w:type="dxa" w:w="2066"/>
                   <w:vAlign w:val="center"/>
                 </w:tcPr>
                 <w:p>
@@ -3611,7 +2834,7 @@
                       <w:i w:val="0"/>
                       <w:sz w:val="24"/>
                     </w:rPr>
-                    <w:t>17／46／138</w:t>
+                    <w:t>試辦計畫書</w:t>
                   </w:r>
                 </w:p>
               </w:tc>
@@ -3630,1273 +2853,6 @@
                 <w:i w:val="0"/>
                 <w:sz w:val="24"/>
               </w:rPr>
-              <w:t>註：尖峰為平日07:00–09:00及17:00–19:00，以起點發車時刻判定；人口為村里人口依面積比例分配之估計值。資料來源：TDX[19]、內政部戶政司115年9月村里人口[23]、OSM[22]。</w:t>
-            </w:r>
-          </w:p>
-          <w:p>
-            <w:pPr>
-              <w:keepNext/>
-              <w:spacing w:lineRule="auto" w:line="240" w:before="120" w:after="0"/>
-              <w:jc w:val="center"/>
-            </w:pPr>
-            <w:r>
-              <w:drawing>
-                <wp:inline xmlns:a="http://schemas.openxmlformats.org/drawingml/2006/main" xmlns:pic="http://schemas.openxmlformats.org/drawingml/2006/picture">
-                  <wp:extent cx="3960000" cy="3610722"/>
-                  <wp:docPr id="2" name="Picture 2"/>
-                  <wp:cNvGraphicFramePr>
-                    <a:graphicFrameLocks noChangeAspect="1"/>
-                  </wp:cNvGraphicFramePr>
-                  <a:graphic>
-                    <a:graphicData uri="http://schemas.openxmlformats.org/drawingml/2006/picture">
-                      <pic:pic>
-                        <pic:nvPicPr>
-                          <pic:cNvPr id="0" name="fig2_access.png"/>
-                          <pic:cNvPicPr/>
-                        </pic:nvPicPr>
-                        <pic:blipFill>
-                          <a:blip r:embed="rId11"/>
-                          <a:stretch>
-                            <a:fillRect/>
-                          </a:stretch>
-                        </pic:blipFill>
-                        <pic:spPr>
-                          <a:xfrm>
-                            <a:off x="0" y="0"/>
-                            <a:ext cx="3960000" cy="3610722"/>
-                          </a:xfrm>
-                          <a:prstGeom prst="rect"/>
-                        </pic:spPr>
-                      </pic:pic>
-                    </a:graphicData>
-                  </a:graphic>
-                </wp:inline>
-              </w:drawing>
-            </w:r>
-          </w:p>
-          <w:p>
-            <w:pPr>
-              <w:spacing w:lineRule="exact" w:line="360" w:before="0" w:after="120"/>
-              <w:jc w:val="center"/>
-            </w:pPr>
-            <w:r>
-              <w:rPr>
-                <w:rFonts w:ascii="Times New Roman" w:hAnsi="Times New Roman" w:cs="Times New Roman" w:eastAsia="標楷體"/>
-                <w:b/>
-                <w:i w:val="0"/>
-                <w:sz w:val="24"/>
-              </w:rPr>
-              <w:t>圖2　7站步行等時圈、TDX站牌與500 m範圍內尖峰／離峰班次。資料：TDX[19]、OSM[22]、內政部戶政司115年9月村里人口[23]。</w:t>
-            </w:r>
-          </w:p>
-          <w:p>
-            <w:pPr>
-              <w:spacing w:lineRule="exact" w:line="360" w:before="0" w:after="0"/>
-              <w:ind w:left="0"/>
-            </w:pPr>
-            <w:r>
-              <w:rPr>
-                <w:rFonts w:ascii="Times New Roman" w:hAnsi="Times New Roman" w:cs="Times New Roman" w:eastAsia="標楷體"/>
-                <w:b/>
-                <w:i w:val="0"/>
-                <w:sz w:val="28"/>
-              </w:rPr>
-              <w:t>(三)駕駛人力再配置示意情境</w:t>
-            </w:r>
-          </w:p>
-          <w:p>
-            <w:pPr>
-              <w:spacing w:lineRule="exact" w:line="360" w:before="0" w:after="0"/>
-              <w:ind w:firstLine="561"/>
-              <w:jc w:val="both"/>
-            </w:pPr>
-            <w:r>
-              <w:rPr>
-                <w:rFonts w:ascii="Times New Roman" w:hAnsi="Times New Roman" w:cs="Times New Roman" w:eastAsia="標楷體"/>
-                <w:b w:val="0"/>
-                <w:i w:val="0"/>
-                <w:sz w:val="28"/>
-              </w:rPr>
-              <w:t>以決策平台展示版設定示意情境（非建議方案）：A為GR刪除車站500 m範圍內首末站牌間區段，僅保留桃園總站至G11，單程由17.31／17.25 km縮為各4.40 km，班次不變；B為以貪婪法自G14周邊選取6個既有站牌組成循環接駁線（直線4.84 km），假設平日30班。在上述速率與工時假設下，約當駕駛班次由138.1降為133.8班：GR節省約5.4班，接駁線需約1.0班，淨可再配置約4.4班／平日；可一車直達G14之長者估計增加約1,313人，但G12、G15b各減少數十人，需另行補位（表3、圖3）。此換算不代表可裁減人員。</w:t>
-            </w:r>
-          </w:p>
-          <w:p>
-            <w:pPr>
-              <w:spacing w:lineRule="exact" w:line="360" w:before="0" w:after="0"/>
-            </w:pPr>
-          </w:p>
-          <w:tbl>
-            <w:tblPr>
-              <w:tblW w:type="auto" w:w="0"/>
-              <w:tblLayout w:type="fixed"/>
-              <w:tblLook w:firstColumn="1" w:firstRow="1" w:lastColumn="0" w:lastRow="0" w:noHBand="0" w:noVBand="1" w:val="04A0"/>
-              <w:tblBorders>
-                <w:top w:val="single" w:sz="4" w:space="0" w:color="000000"/>
-                <w:left w:val="single" w:sz="4" w:space="0" w:color="000000"/>
-                <w:bottom w:val="single" w:sz="4" w:space="0" w:color="000000"/>
-                <w:right w:val="single" w:sz="4" w:space="0" w:color="000000"/>
-                <w:insideH w:val="single" w:sz="4" w:space="0" w:color="000000"/>
-                <w:insideV w:val="single" w:sz="4" w:space="0" w:color="000000"/>
-              </w:tblBorders>
-              <w:tblLayout w:type="fixed"/>
-            </w:tblPr>
-            <w:tblGrid>
-              <w:gridCol w:w="3828"/>
-              <w:gridCol w:w="1504"/>
-              <w:gridCol w:w="1777"/>
-              <w:gridCol w:w="2187"/>
-            </w:tblGrid>
-            <w:tr>
-              <w:trPr>
-                <w:cantSplit/>
-                <w:tblHeader/>
-              </w:trPr>
-              <w:tc>
-                <w:tcPr>
-                  <w:tcW w:type="dxa" w:w="9296"/>
-                  <w:gridSpan w:val="4"/>
-                  <w:tcBorders>
-                    <w:top w:val="nil"/>
-                    <w:left w:val="nil"/>
-                    <w:right w:val="nil"/>
-                  </w:tcBorders>
-                </w:tcPr>
-                <w:p>
-                  <w:pPr>
-                    <w:keepNext/>
-                    <w:spacing w:lineRule="exact" w:line="360" w:before="0" w:after="0"/>
-                    <w:jc w:val="center"/>
-                  </w:pPr>
-                  <w:r>
-                    <w:rPr>
-                      <w:rFonts w:ascii="Times New Roman" w:hAnsi="Times New Roman" w:cs="Times New Roman" w:eastAsia="標楷體"/>
-                      <w:b/>
-                      <w:i w:val="0"/>
-                      <w:sz w:val="24"/>
-                    </w:rPr>
-                    <w:t>表3　示意情境（A＋B）與現況之比較</w:t>
-                  </w:r>
-                </w:p>
-              </w:tc>
-            </w:tr>
-            <w:tr>
-              <w:trPr>
-                <w:tblHeader/>
-                <w:cantSplit/>
-              </w:trPr>
-              <w:tc>
-                <w:tcPr>
-                  <w:tcW w:type="dxa" w:w="3828"/>
-                  <w:shd w:val="clear" w:color="auto" w:fill="E7E6E6"/>
-                  <w:vAlign w:val="center"/>
-                </w:tcPr>
-                <w:p>
-                  <w:pPr>
-                    <w:keepNext/>
-                    <w:spacing w:lineRule="exact" w:line="360" w:before="0" w:after="0"/>
-                    <w:jc w:val="center"/>
-                  </w:pPr>
-                  <w:r>
-                    <w:rPr>
-                      <w:rFonts w:ascii="Times New Roman" w:hAnsi="Times New Roman" w:cs="Times New Roman" w:eastAsia="標楷體"/>
-                      <w:b/>
-                      <w:i w:val="0"/>
-                      <w:sz w:val="24"/>
-                    </w:rPr>
-                    <w:t>指標</w:t>
-                  </w:r>
-                </w:p>
-              </w:tc>
-              <w:tc>
-                <w:tcPr>
-                  <w:tcW w:type="dxa" w:w="1504"/>
-                  <w:shd w:val="clear" w:color="auto" w:fill="E7E6E6"/>
-                  <w:vAlign w:val="center"/>
-                </w:tcPr>
-                <w:p>
-                  <w:pPr>
-                    <w:keepNext/>
-                    <w:spacing w:lineRule="exact" w:line="360" w:before="0" w:after="0"/>
-                    <w:jc w:val="center"/>
-                  </w:pPr>
-                  <w:r>
-                    <w:rPr>
-                      <w:rFonts w:ascii="Times New Roman" w:hAnsi="Times New Roman" w:cs="Times New Roman" w:eastAsia="標楷體"/>
-                      <w:b/>
-                      <w:i w:val="0"/>
-                      <w:sz w:val="24"/>
-                    </w:rPr>
-                    <w:t>S0現況</w:t>
-                  </w:r>
-                </w:p>
-              </w:tc>
-              <w:tc>
-                <w:tcPr>
-                  <w:tcW w:type="dxa" w:w="1777"/>
-                  <w:shd w:val="clear" w:color="auto" w:fill="E7E6E6"/>
-                  <w:vAlign w:val="center"/>
-                </w:tcPr>
-                <w:p>
-                  <w:pPr>
-                    <w:keepNext/>
-                    <w:spacing w:lineRule="exact" w:line="360" w:before="0" w:after="0"/>
-                    <w:jc w:val="center"/>
-                  </w:pPr>
-                  <w:r>
-                    <w:rPr>
-                      <w:rFonts w:ascii="Times New Roman" w:hAnsi="Times New Roman" w:cs="Times New Roman" w:eastAsia="標楷體"/>
-                      <w:b/>
-                      <w:i w:val="0"/>
-                      <w:sz w:val="24"/>
-                    </w:rPr>
-                    <w:t>A＋B示意情境</w:t>
-                  </w:r>
-                </w:p>
-              </w:tc>
-              <w:tc>
-                <w:tcPr>
-                  <w:tcW w:type="dxa" w:w="2187"/>
-                  <w:shd w:val="clear" w:color="auto" w:fill="E7E6E6"/>
-                  <w:vAlign w:val="center"/>
-                </w:tcPr>
-                <w:p>
-                  <w:pPr>
-                    <w:keepNext/>
-                    <w:spacing w:lineRule="exact" w:line="360" w:before="0" w:after="0"/>
-                    <w:jc w:val="center"/>
-                  </w:pPr>
-                  <w:r>
-                    <w:rPr>
-                      <w:rFonts w:ascii="Times New Roman" w:hAnsi="Times New Roman" w:cs="Times New Roman" w:eastAsia="標楷體"/>
-                      <w:b/>
-                      <w:i w:val="0"/>
-                      <w:sz w:val="24"/>
-                    </w:rPr>
-                    <w:t>差異</w:t>
-                  </w:r>
-                </w:p>
-              </w:tc>
-            </w:tr>
-            <w:tr>
-              <w:trPr>
-                <w:cantSplit/>
-              </w:trPr>
-              <w:tc>
-                <w:tcPr>
-                  <w:tcW w:type="dxa" w:w="3828"/>
-                  <w:vAlign w:val="center"/>
-                </w:tcPr>
-                <w:p>
-                  <w:pPr>
-                    <w:keepNext/>
-                    <w:spacing w:lineRule="exact" w:line="360" w:before="0" w:after="0"/>
-                    <w:jc w:val="left"/>
-                  </w:pPr>
-                  <w:r>
-                    <w:rPr>
-                      <w:rFonts w:ascii="Times New Roman" w:hAnsi="Times New Roman" w:cs="Times New Roman" w:eastAsia="標楷體"/>
-                      <w:b w:val="0"/>
-                      <w:i w:val="0"/>
-                      <w:sz w:val="24"/>
-                    </w:rPr>
-                    <w:t>平日車公里（84個路線方向＋接駁線）</w:t>
-                  </w:r>
-                </w:p>
-              </w:tc>
-              <w:tc>
-                <w:tcPr>
-                  <w:tcW w:type="dxa" w:w="1504"/>
-                  <w:vAlign w:val="center"/>
-                </w:tcPr>
-                <w:p>
-                  <w:pPr>
-                    <w:keepNext/>
-                    <w:spacing w:lineRule="exact" w:line="360" w:before="0" w:after="0"/>
-                    <w:jc w:val="center"/>
-                  </w:pPr>
-                  <w:r>
-                    <w:rPr>
-                      <w:rFonts w:ascii="Times New Roman" w:hAnsi="Times New Roman" w:cs="Times New Roman" w:eastAsia="標楷體"/>
-                      <w:b w:val="0"/>
-                      <w:i w:val="0"/>
-                      <w:sz w:val="24"/>
-                    </w:rPr>
-                    <w:t>19,893</w:t>
-                  </w:r>
-                </w:p>
-              </w:tc>
-              <w:tc>
-                <w:tcPr>
-                  <w:tcW w:type="dxa" w:w="1777"/>
-                  <w:vAlign w:val="center"/>
-                </w:tcPr>
-                <w:p>
-                  <w:pPr>
-                    <w:keepNext/>
-                    <w:spacing w:lineRule="exact" w:line="360" w:before="0" w:after="0"/>
-                    <w:jc w:val="center"/>
-                  </w:pPr>
-                  <w:r>
-                    <w:rPr>
-                      <w:rFonts w:ascii="Times New Roman" w:hAnsi="Times New Roman" w:cs="Times New Roman" w:eastAsia="標楷體"/>
-                      <w:b w:val="0"/>
-                      <w:i w:val="0"/>
-                      <w:sz w:val="24"/>
-                    </w:rPr>
-                    <w:t>19,265</w:t>
-                  </w:r>
-                </w:p>
-              </w:tc>
-              <w:tc>
-                <w:tcPr>
-                  <w:tcW w:type="dxa" w:w="2187"/>
-                  <w:vAlign w:val="center"/>
-                </w:tcPr>
-                <w:p>
-                  <w:pPr>
-                    <w:keepNext/>
-                    <w:spacing w:lineRule="exact" w:line="360" w:before="0" w:after="0"/>
-                    <w:jc w:val="center"/>
-                  </w:pPr>
-                  <w:r>
-                    <w:rPr>
-                      <w:rFonts w:ascii="Times New Roman" w:hAnsi="Times New Roman" w:cs="Times New Roman" w:eastAsia="標楷體"/>
-                      <w:b w:val="0"/>
-                      <w:i w:val="0"/>
-                      <w:sz w:val="24"/>
-                    </w:rPr>
-                    <w:t>−628</w:t>
-                  </w:r>
-                </w:p>
-              </w:tc>
-            </w:tr>
-            <w:tr>
-              <w:trPr>
-                <w:cantSplit/>
-              </w:trPr>
-              <w:tc>
-                <w:tcPr>
-                  <w:tcW w:type="dxa" w:w="3828"/>
-                  <w:vAlign w:val="center"/>
-                </w:tcPr>
-                <w:p>
-                  <w:pPr>
-                    <w:keepNext/>
-                    <w:spacing w:lineRule="exact" w:line="360" w:before="0" w:after="0"/>
-                    <w:jc w:val="left"/>
-                  </w:pPr>
-                  <w:r>
-                    <w:rPr>
-                      <w:rFonts w:ascii="Times New Roman" w:hAnsi="Times New Roman" w:cs="Times New Roman" w:eastAsia="標楷體"/>
-                      <w:b w:val="0"/>
-                      <w:i w:val="0"/>
-                      <w:sz w:val="24"/>
-                    </w:rPr>
-                    <w:t>平日車輛小時（假設18 km/h）</w:t>
-                  </w:r>
-                </w:p>
-              </w:tc>
-              <w:tc>
-                <w:tcPr>
-                  <w:tcW w:type="dxa" w:w="1504"/>
-                  <w:vAlign w:val="center"/>
-                </w:tcPr>
-                <w:p>
-                  <w:pPr>
-                    <w:keepNext/>
-                    <w:spacing w:lineRule="exact" w:line="360" w:before="0" w:after="0"/>
-                    <w:jc w:val="center"/>
-                  </w:pPr>
-                  <w:r>
-                    <w:rPr>
-                      <w:rFonts w:ascii="Times New Roman" w:hAnsi="Times New Roman" w:cs="Times New Roman" w:eastAsia="標楷體"/>
-                      <w:b w:val="0"/>
-                      <w:i w:val="0"/>
-                      <w:sz w:val="24"/>
-                    </w:rPr>
-                    <w:t>1,105.2</w:t>
-                  </w:r>
-                </w:p>
-              </w:tc>
-              <w:tc>
-                <w:tcPr>
-                  <w:tcW w:type="dxa" w:w="1777"/>
-                  <w:vAlign w:val="center"/>
-                </w:tcPr>
-                <w:p>
-                  <w:pPr>
-                    <w:keepNext/>
-                    <w:spacing w:lineRule="exact" w:line="360" w:before="0" w:after="0"/>
-                    <w:jc w:val="center"/>
-                  </w:pPr>
-                  <w:r>
-                    <w:rPr>
-                      <w:rFonts w:ascii="Times New Roman" w:hAnsi="Times New Roman" w:cs="Times New Roman" w:eastAsia="標楷體"/>
-                      <w:b w:val="0"/>
-                      <w:i w:val="0"/>
-                      <w:sz w:val="24"/>
-                    </w:rPr>
-                    <w:t>1,070.3</w:t>
-                  </w:r>
-                </w:p>
-              </w:tc>
-              <w:tc>
-                <w:tcPr>
-                  <w:tcW w:type="dxa" w:w="2187"/>
-                  <w:vAlign w:val="center"/>
-                </w:tcPr>
-                <w:p>
-                  <w:pPr>
-                    <w:keepNext/>
-                    <w:spacing w:lineRule="exact" w:line="360" w:before="0" w:after="0"/>
-                    <w:jc w:val="center"/>
-                  </w:pPr>
-                  <w:r>
-                    <w:rPr>
-                      <w:rFonts w:ascii="Times New Roman" w:hAnsi="Times New Roman" w:cs="Times New Roman" w:eastAsia="標楷體"/>
-                      <w:b w:val="0"/>
-                      <w:i w:val="0"/>
-                      <w:sz w:val="24"/>
-                    </w:rPr>
-                    <w:t>−34.9</w:t>
-                  </w:r>
-                </w:p>
-              </w:tc>
-            </w:tr>
-            <w:tr>
-              <w:trPr>
-                <w:cantSplit/>
-              </w:trPr>
-              <w:tc>
-                <w:tcPr>
-                  <w:tcW w:type="dxa" w:w="3828"/>
-                  <w:vAlign w:val="center"/>
-                </w:tcPr>
-                <w:p>
-                  <w:pPr>
-                    <w:keepNext/>
-                    <w:spacing w:lineRule="exact" w:line="360" w:before="0" w:after="0"/>
-                    <w:jc w:val="left"/>
-                  </w:pPr>
-                  <w:r>
-                    <w:rPr>
-                      <w:rFonts w:ascii="Times New Roman" w:hAnsi="Times New Roman" w:cs="Times New Roman" w:eastAsia="標楷體"/>
-                      <w:b w:val="0"/>
-                      <w:i w:val="0"/>
-                      <w:sz w:val="24"/>
-                    </w:rPr>
-                    <w:t>約當駕駛班次（假設每班8小時）</w:t>
-                  </w:r>
-                </w:p>
-              </w:tc>
-              <w:tc>
-                <w:tcPr>
-                  <w:tcW w:type="dxa" w:w="1504"/>
-                  <w:vAlign w:val="center"/>
-                </w:tcPr>
-                <w:p>
-                  <w:pPr>
-                    <w:keepNext/>
-                    <w:spacing w:lineRule="exact" w:line="360" w:before="0" w:after="0"/>
-                    <w:jc w:val="center"/>
-                  </w:pPr>
-                  <w:r>
-                    <w:rPr>
-                      <w:rFonts w:ascii="Times New Roman" w:hAnsi="Times New Roman" w:cs="Times New Roman" w:eastAsia="標楷體"/>
-                      <w:b w:val="0"/>
-                      <w:i w:val="0"/>
-                      <w:sz w:val="24"/>
-                    </w:rPr>
-                    <w:t>138.1</w:t>
-                  </w:r>
-                </w:p>
-              </w:tc>
-              <w:tc>
-                <w:tcPr>
-                  <w:tcW w:type="dxa" w:w="1777"/>
-                  <w:vAlign w:val="center"/>
-                </w:tcPr>
-                <w:p>
-                  <w:pPr>
-                    <w:keepNext/>
-                    <w:spacing w:lineRule="exact" w:line="360" w:before="0" w:after="0"/>
-                    <w:jc w:val="center"/>
-                  </w:pPr>
-                  <w:r>
-                    <w:rPr>
-                      <w:rFonts w:ascii="Times New Roman" w:hAnsi="Times New Roman" w:cs="Times New Roman" w:eastAsia="標楷體"/>
-                      <w:b w:val="0"/>
-                      <w:i w:val="0"/>
-                      <w:sz w:val="24"/>
-                    </w:rPr>
-                    <w:t>133.8</w:t>
-                  </w:r>
-                </w:p>
-              </w:tc>
-              <w:tc>
-                <w:tcPr>
-                  <w:tcW w:type="dxa" w:w="2187"/>
-                  <w:vAlign w:val="center"/>
-                </w:tcPr>
-                <w:p>
-                  <w:pPr>
-                    <w:keepNext/>
-                    <w:spacing w:lineRule="exact" w:line="360" w:before="0" w:after="0"/>
-                    <w:jc w:val="center"/>
-                  </w:pPr>
-                  <w:r>
-                    <w:rPr>
-                      <w:rFonts w:ascii="Times New Roman" w:hAnsi="Times New Roman" w:cs="Times New Roman" w:eastAsia="標楷體"/>
-                      <w:b w:val="0"/>
-                      <w:i w:val="0"/>
-                      <w:sz w:val="24"/>
-                    </w:rPr>
-                    <w:t>−4.4</w:t>
-                  </w:r>
-                </w:p>
-              </w:tc>
-            </w:tr>
-            <w:tr>
-              <w:trPr>
-                <w:cantSplit/>
-              </w:trPr>
-              <w:tc>
-                <w:tcPr>
-                  <w:tcW w:type="dxa" w:w="3828"/>
-                  <w:vAlign w:val="center"/>
-                </w:tcPr>
-                <w:p>
-                  <w:pPr>
-                    <w:keepNext/>
-                    <w:spacing w:lineRule="exact" w:line="360" w:before="0" w:after="0"/>
-                    <w:jc w:val="left"/>
-                  </w:pPr>
-                  <w:r>
-                    <w:rPr>
-                      <w:rFonts w:ascii="Times New Roman" w:hAnsi="Times New Roman" w:cs="Times New Roman" w:eastAsia="標楷體"/>
-                      <w:b w:val="0"/>
-                      <w:i w:val="0"/>
-                      <w:sz w:val="24"/>
-                    </w:rPr>
-                    <w:t>GR雙向約當駕駛班次</w:t>
-                  </w:r>
-                </w:p>
-              </w:tc>
-              <w:tc>
-                <w:tcPr>
-                  <w:tcW w:type="dxa" w:w="1504"/>
-                  <w:vAlign w:val="center"/>
-                </w:tcPr>
-                <w:p>
-                  <w:pPr>
-                    <w:keepNext/>
-                    <w:spacing w:lineRule="exact" w:line="360" w:before="0" w:after="0"/>
-                    <w:jc w:val="center"/>
-                  </w:pPr>
-                  <w:r>
-                    <w:rPr>
-                      <w:rFonts w:ascii="Times New Roman" w:hAnsi="Times New Roman" w:cs="Times New Roman" w:eastAsia="標楷體"/>
-                      <w:b w:val="0"/>
-                      <w:i w:val="0"/>
-                      <w:sz w:val="24"/>
-                    </w:rPr>
-                    <w:t>7.2</w:t>
-                  </w:r>
-                </w:p>
-              </w:tc>
-              <w:tc>
-                <w:tcPr>
-                  <w:tcW w:type="dxa" w:w="1777"/>
-                  <w:vAlign w:val="center"/>
-                </w:tcPr>
-                <w:p>
-                  <w:pPr>
-                    <w:keepNext/>
-                    <w:spacing w:lineRule="exact" w:line="360" w:before="0" w:after="0"/>
-                    <w:jc w:val="center"/>
-                  </w:pPr>
-                  <w:r>
-                    <w:rPr>
-                      <w:rFonts w:ascii="Times New Roman" w:hAnsi="Times New Roman" w:cs="Times New Roman" w:eastAsia="標楷體"/>
-                      <w:b w:val="0"/>
-                      <w:i w:val="0"/>
-                      <w:sz w:val="24"/>
-                    </w:rPr>
-                    <w:t>1.8</w:t>
-                  </w:r>
-                </w:p>
-              </w:tc>
-              <w:tc>
-                <w:tcPr>
-                  <w:tcW w:type="dxa" w:w="2187"/>
-                  <w:vAlign w:val="center"/>
-                </w:tcPr>
-                <w:p>
-                  <w:pPr>
-                    <w:keepNext/>
-                    <w:spacing w:lineRule="exact" w:line="360" w:before="0" w:after="0"/>
-                    <w:jc w:val="center"/>
-                  </w:pPr>
-                  <w:r>
-                    <w:rPr>
-                      <w:rFonts w:ascii="Times New Roman" w:hAnsi="Times New Roman" w:cs="Times New Roman" w:eastAsia="標楷體"/>
-                      <w:b w:val="0"/>
-                      <w:i w:val="0"/>
-                      <w:sz w:val="24"/>
-                    </w:rPr>
-                    <w:t>−5.4（裁切節省）</w:t>
-                  </w:r>
-                </w:p>
-              </w:tc>
-            </w:tr>
-            <w:tr>
-              <w:trPr>
-                <w:cantSplit/>
-              </w:trPr>
-              <w:tc>
-                <w:tcPr>
-                  <w:tcW w:type="dxa" w:w="3828"/>
-                  <w:vAlign w:val="center"/>
-                </w:tcPr>
-                <w:p>
-                  <w:pPr>
-                    <w:keepNext/>
-                    <w:spacing w:lineRule="exact" w:line="360" w:before="0" w:after="0"/>
-                    <w:jc w:val="left"/>
-                  </w:pPr>
-                  <w:r>
-                    <w:rPr>
-                      <w:rFonts w:ascii="Times New Roman" w:hAnsi="Times New Roman" w:cs="Times New Roman" w:eastAsia="標楷體"/>
-                      <w:b w:val="0"/>
-                      <w:i w:val="0"/>
-                      <w:sz w:val="24"/>
-                    </w:rPr>
-                    <w:t>G14接駁線約當駕駛班次</w:t>
-                  </w:r>
-                </w:p>
-              </w:tc>
-              <w:tc>
-                <w:tcPr>
-                  <w:tcW w:type="dxa" w:w="1504"/>
-                  <w:vAlign w:val="center"/>
-                </w:tcPr>
-                <w:p>
-                  <w:pPr>
-                    <w:keepNext/>
-                    <w:spacing w:lineRule="exact" w:line="360" w:before="0" w:after="0"/>
-                    <w:jc w:val="center"/>
-                  </w:pPr>
-                  <w:r>
-                    <w:rPr>
-                      <w:rFonts w:ascii="Times New Roman" w:hAnsi="Times New Roman" w:cs="Times New Roman" w:eastAsia="標楷體"/>
-                      <w:b w:val="0"/>
-                      <w:i w:val="0"/>
-                      <w:sz w:val="24"/>
-                    </w:rPr>
-                    <w:t>0</w:t>
-                  </w:r>
-                </w:p>
-              </w:tc>
-              <w:tc>
-                <w:tcPr>
-                  <w:tcW w:type="dxa" w:w="1777"/>
-                  <w:vAlign w:val="center"/>
-                </w:tcPr>
-                <w:p>
-                  <w:pPr>
-                    <w:keepNext/>
-                    <w:spacing w:lineRule="exact" w:line="360" w:before="0" w:after="0"/>
-                    <w:jc w:val="center"/>
-                  </w:pPr>
-                  <w:r>
-                    <w:rPr>
-                      <w:rFonts w:ascii="Times New Roman" w:hAnsi="Times New Roman" w:cs="Times New Roman" w:eastAsia="標楷體"/>
-                      <w:b w:val="0"/>
-                      <w:i w:val="0"/>
-                      <w:sz w:val="24"/>
-                    </w:rPr>
-                    <w:t>1.0</w:t>
-                  </w:r>
-                </w:p>
-              </w:tc>
-              <w:tc>
-                <w:tcPr>
-                  <w:tcW w:type="dxa" w:w="2187"/>
-                  <w:vAlign w:val="center"/>
-                </w:tcPr>
-                <w:p>
-                  <w:pPr>
-                    <w:keepNext/>
-                    <w:spacing w:lineRule="exact" w:line="360" w:before="0" w:after="0"/>
-                    <w:jc w:val="center"/>
-                  </w:pPr>
-                  <w:r>
-                    <w:rPr>
-                      <w:rFonts w:ascii="Times New Roman" w:hAnsi="Times New Roman" w:cs="Times New Roman" w:eastAsia="標楷體"/>
-                      <w:b w:val="0"/>
-                      <w:i w:val="0"/>
-                      <w:sz w:val="24"/>
-                    </w:rPr>
-                    <w:t>+1.0（新增所需）</w:t>
-                  </w:r>
-                </w:p>
-              </w:tc>
-            </w:tr>
-            <w:tr>
-              <w:trPr>
-                <w:cantSplit/>
-              </w:trPr>
-              <w:tc>
-                <w:tcPr>
-                  <w:tcW w:type="dxa" w:w="3828"/>
-                  <w:vAlign w:val="center"/>
-                </w:tcPr>
-                <w:p>
-                  <w:pPr>
-                    <w:keepNext/>
-                    <w:spacing w:lineRule="exact" w:line="360" w:before="0" w:after="0"/>
-                    <w:jc w:val="left"/>
-                  </w:pPr>
-                  <w:r>
-                    <w:rPr>
-                      <w:rFonts w:ascii="Times New Roman" w:hAnsi="Times New Roman" w:cs="Times New Roman" w:eastAsia="標楷體"/>
-                      <w:b/>
-                      <w:i w:val="0"/>
-                      <w:sz w:val="24"/>
-                    </w:rPr>
-                    <w:t>可再配置駕駛人力</w:t>
-                  </w:r>
-                </w:p>
-              </w:tc>
-              <w:tc>
-                <w:tcPr>
-                  <w:tcW w:type="dxa" w:w="1504"/>
-                  <w:vAlign w:val="center"/>
-                </w:tcPr>
-                <w:p>
-                  <w:pPr>
-                    <w:keepNext/>
-                    <w:spacing w:lineRule="exact" w:line="360" w:before="0" w:after="0"/>
-                    <w:jc w:val="center"/>
-                  </w:pPr>
-                  <w:r>
-                    <w:rPr>
-                      <w:rFonts w:ascii="Times New Roman" w:hAnsi="Times New Roman" w:cs="Times New Roman" w:eastAsia="標楷體"/>
-                      <w:b/>
-                      <w:i w:val="0"/>
-                      <w:sz w:val="24"/>
-                    </w:rPr>
-                  </w:r>
-                </w:p>
-              </w:tc>
-              <w:tc>
-                <w:tcPr>
-                  <w:tcW w:type="dxa" w:w="1777"/>
-                  <w:vAlign w:val="center"/>
-                </w:tcPr>
-                <w:p>
-                  <w:pPr>
-                    <w:keepNext/>
-                    <w:spacing w:lineRule="exact" w:line="360" w:before="0" w:after="0"/>
-                    <w:jc w:val="center"/>
-                  </w:pPr>
-                  <w:r>
-                    <w:rPr>
-                      <w:rFonts w:ascii="Times New Roman" w:hAnsi="Times New Roman" w:cs="Times New Roman" w:eastAsia="標楷體"/>
-                      <w:b/>
-                      <w:i w:val="0"/>
-                      <w:sz w:val="24"/>
-                    </w:rPr>
-                  </w:r>
-                </w:p>
-              </w:tc>
-              <w:tc>
-                <w:tcPr>
-                  <w:tcW w:type="dxa" w:w="2187"/>
-                  <w:vAlign w:val="center"/>
-                </w:tcPr>
-                <w:p>
-                  <w:pPr>
-                    <w:keepNext/>
-                    <w:spacing w:lineRule="exact" w:line="360" w:before="0" w:after="0"/>
-                    <w:jc w:val="center"/>
-                  </w:pPr>
-                  <w:r>
-                    <w:rPr>
-                      <w:rFonts w:ascii="Times New Roman" w:hAnsi="Times New Roman" w:cs="Times New Roman" w:eastAsia="標楷體"/>
-                      <w:b/>
-                      <w:i w:val="0"/>
-                      <w:sz w:val="24"/>
-                    </w:rPr>
-                    <w:t>約+4.4班／平日</w:t>
-                  </w:r>
-                </w:p>
-              </w:tc>
-            </w:tr>
-            <w:tr>
-              <w:trPr>
-                <w:cantSplit/>
-              </w:trPr>
-              <w:tc>
-                <w:tcPr>
-                  <w:tcW w:type="dxa" w:w="3828"/>
-                  <w:vAlign w:val="center"/>
-                </w:tcPr>
-                <w:p>
-                  <w:pPr>
-                    <w:keepNext/>
-                    <w:spacing w:lineRule="exact" w:line="360" w:before="0" w:after="0"/>
-                    <w:jc w:val="left"/>
-                  </w:pPr>
-                  <w:r>
-                    <w:rPr>
-                      <w:rFonts w:ascii="Times New Roman" w:hAnsi="Times New Roman" w:cs="Times New Roman" w:eastAsia="標楷體"/>
-                      <w:b w:val="0"/>
-                      <w:i w:val="0"/>
-                      <w:sz w:val="24"/>
-                    </w:rPr>
-                    <w:t>可一車直達G14之65歲以上人口（1.5 km內）</w:t>
-                  </w:r>
-                </w:p>
-              </w:tc>
-              <w:tc>
-                <w:tcPr>
-                  <w:tcW w:type="dxa" w:w="1504"/>
-                  <w:vAlign w:val="center"/>
-                </w:tcPr>
-                <w:p>
-                  <w:pPr>
-                    <w:keepNext/>
-                    <w:spacing w:lineRule="exact" w:line="360" w:before="0" w:after="0"/>
-                    <w:jc w:val="center"/>
-                  </w:pPr>
-                  <w:r>
-                    <w:rPr>
-                      <w:rFonts w:ascii="Times New Roman" w:hAnsi="Times New Roman" w:cs="Times New Roman" w:eastAsia="標楷體"/>
-                      <w:b w:val="0"/>
-                      <w:i w:val="0"/>
-                      <w:sz w:val="24"/>
-                    </w:rPr>
-                    <w:t>1,018</w:t>
-                  </w:r>
-                </w:p>
-              </w:tc>
-              <w:tc>
-                <w:tcPr>
-                  <w:tcW w:type="dxa" w:w="1777"/>
-                  <w:vAlign w:val="center"/>
-                </w:tcPr>
-                <w:p>
-                  <w:pPr>
-                    <w:keepNext/>
-                    <w:spacing w:lineRule="exact" w:line="360" w:before="0" w:after="0"/>
-                    <w:jc w:val="center"/>
-                  </w:pPr>
-                  <w:r>
-                    <w:rPr>
-                      <w:rFonts w:ascii="Times New Roman" w:hAnsi="Times New Roman" w:cs="Times New Roman" w:eastAsia="標楷體"/>
-                      <w:b w:val="0"/>
-                      <w:i w:val="0"/>
-                      <w:sz w:val="24"/>
-                    </w:rPr>
-                    <w:t>2,332</w:t>
-                  </w:r>
-                </w:p>
-              </w:tc>
-              <w:tc>
-                <w:tcPr>
-                  <w:tcW w:type="dxa" w:w="2187"/>
-                  <w:vAlign w:val="center"/>
-                </w:tcPr>
-                <w:p>
-                  <w:pPr>
-                    <w:keepNext/>
-                    <w:spacing w:lineRule="exact" w:line="360" w:before="0" w:after="0"/>
-                    <w:jc w:val="center"/>
-                  </w:pPr>
-                  <w:r>
-                    <w:rPr>
-                      <w:rFonts w:ascii="Times New Roman" w:hAnsi="Times New Roman" w:cs="Times New Roman" w:eastAsia="標楷體"/>
-                      <w:b w:val="0"/>
-                      <w:i w:val="0"/>
-                      <w:sz w:val="24"/>
-                    </w:rPr>
-                    <w:t>+1,313</w:t>
-                  </w:r>
-                </w:p>
-              </w:tc>
-            </w:tr>
-            <w:tr>
-              <w:trPr>
-                <w:cantSplit/>
-              </w:trPr>
-              <w:tc>
-                <w:tcPr>
-                  <w:tcW w:type="dxa" w:w="3828"/>
-                  <w:vAlign w:val="center"/>
-                </w:tcPr>
-                <w:p>
-                  <w:pPr>
-                    <w:keepNext/>
-                    <w:spacing w:lineRule="exact" w:line="360" w:before="0" w:after="0"/>
-                    <w:jc w:val="left"/>
-                  </w:pPr>
-                  <w:r>
-                    <w:rPr>
-                      <w:rFonts w:ascii="Times New Roman" w:hAnsi="Times New Roman" w:cs="Times New Roman" w:eastAsia="標楷體"/>
-                      <w:b w:val="0"/>
-                      <w:i w:val="0"/>
-                      <w:sz w:val="24"/>
-                    </w:rPr>
-                    <w:t>可一車直達G12之65歲以上人口（1.5 km內）</w:t>
-                  </w:r>
-                </w:p>
-              </w:tc>
-              <w:tc>
-                <w:tcPr>
-                  <w:tcW w:type="dxa" w:w="1504"/>
-                  <w:vAlign w:val="center"/>
-                </w:tcPr>
-                <w:p>
-                  <w:pPr>
-                    <w:keepNext/>
-                    <w:spacing w:lineRule="exact" w:line="360" w:before="0" w:after="0"/>
-                    <w:jc w:val="center"/>
-                  </w:pPr>
-                  <w:r>
-                    <w:rPr>
-                      <w:rFonts w:ascii="Times New Roman" w:hAnsi="Times New Roman" w:cs="Times New Roman" w:eastAsia="標楷體"/>
-                      <w:b w:val="0"/>
-                      <w:i w:val="0"/>
-                      <w:sz w:val="24"/>
-                    </w:rPr>
-                    <w:t>8,806</w:t>
-                  </w:r>
-                </w:p>
-              </w:tc>
-              <w:tc>
-                <w:tcPr>
-                  <w:tcW w:type="dxa" w:w="1777"/>
-                  <w:vAlign w:val="center"/>
-                </w:tcPr>
-                <w:p>
-                  <w:pPr>
-                    <w:keepNext/>
-                    <w:spacing w:lineRule="exact" w:line="360" w:before="0" w:after="0"/>
-                    <w:jc w:val="center"/>
-                  </w:pPr>
-                  <w:r>
-                    <w:rPr>
-                      <w:rFonts w:ascii="Times New Roman" w:hAnsi="Times New Roman" w:cs="Times New Roman" w:eastAsia="標楷體"/>
-                      <w:b w:val="0"/>
-                      <w:i w:val="0"/>
-                      <w:sz w:val="24"/>
-                    </w:rPr>
-                    <w:t>8,773</w:t>
-                  </w:r>
-                </w:p>
-              </w:tc>
-              <w:tc>
-                <w:tcPr>
-                  <w:tcW w:type="dxa" w:w="2187"/>
-                  <w:vAlign w:val="center"/>
-                </w:tcPr>
-                <w:p>
-                  <w:pPr>
-                    <w:keepNext/>
-                    <w:spacing w:lineRule="exact" w:line="360" w:before="0" w:after="0"/>
-                    <w:jc w:val="center"/>
-                  </w:pPr>
-                  <w:r>
-                    <w:rPr>
-                      <w:rFonts w:ascii="Times New Roman" w:hAnsi="Times New Roman" w:cs="Times New Roman" w:eastAsia="標楷體"/>
-                      <w:b w:val="0"/>
-                      <w:i w:val="0"/>
-                      <w:sz w:val="24"/>
-                    </w:rPr>
-                    <w:t>−33</w:t>
-                  </w:r>
-                </w:p>
-              </w:tc>
-            </w:tr>
-            <w:tr>
-              <w:trPr>
-                <w:cantSplit/>
-              </w:trPr>
-              <w:tc>
-                <w:tcPr>
-                  <w:tcW w:type="dxa" w:w="3828"/>
-                  <w:vAlign w:val="center"/>
-                </w:tcPr>
-                <w:p>
-                  <w:pPr>
-                    <w:spacing w:lineRule="exact" w:line="360" w:before="0" w:after="0"/>
-                    <w:jc w:val="left"/>
-                  </w:pPr>
-                  <w:r>
-                    <w:rPr>
-                      <w:rFonts w:ascii="Times New Roman" w:hAnsi="Times New Roman" w:cs="Times New Roman" w:eastAsia="標楷體"/>
-                      <w:b w:val="0"/>
-                      <w:i w:val="0"/>
-                      <w:sz w:val="24"/>
-                    </w:rPr>
-                    <w:t>可一車直達G15b之65歲以上人口（1.5 km內）</w:t>
-                  </w:r>
-                </w:p>
-              </w:tc>
-              <w:tc>
-                <w:tcPr>
-                  <w:tcW w:type="dxa" w:w="1504"/>
-                  <w:vAlign w:val="center"/>
-                </w:tcPr>
-                <w:p>
-                  <w:pPr>
-                    <w:spacing w:lineRule="exact" w:line="360" w:before="0" w:after="0"/>
-                    <w:jc w:val="center"/>
-                  </w:pPr>
-                  <w:r>
-                    <w:rPr>
-                      <w:rFonts w:ascii="Times New Roman" w:hAnsi="Times New Roman" w:cs="Times New Roman" w:eastAsia="標楷體"/>
-                      <w:b w:val="0"/>
-                      <w:i w:val="0"/>
-                      <w:sz w:val="24"/>
-                    </w:rPr>
-                    <w:t>873</w:t>
-                  </w:r>
-                </w:p>
-              </w:tc>
-              <w:tc>
-                <w:tcPr>
-                  <w:tcW w:type="dxa" w:w="1777"/>
-                  <w:vAlign w:val="center"/>
-                </w:tcPr>
-                <w:p>
-                  <w:pPr>
-                    <w:spacing w:lineRule="exact" w:line="360" w:before="0" w:after="0"/>
-                    <w:jc w:val="center"/>
-                  </w:pPr>
-                  <w:r>
-                    <w:rPr>
-                      <w:rFonts w:ascii="Times New Roman" w:hAnsi="Times New Roman" w:cs="Times New Roman" w:eastAsia="標楷體"/>
-                      <w:b w:val="0"/>
-                      <w:i w:val="0"/>
-                      <w:sz w:val="24"/>
-                    </w:rPr>
-                    <w:t>845</w:t>
-                  </w:r>
-                </w:p>
-              </w:tc>
-              <w:tc>
-                <w:tcPr>
-                  <w:tcW w:type="dxa" w:w="2187"/>
-                  <w:vAlign w:val="center"/>
-                </w:tcPr>
-                <w:p>
-                  <w:pPr>
-                    <w:spacing w:lineRule="exact" w:line="360" w:before="0" w:after="0"/>
-                    <w:jc w:val="center"/>
-                  </w:pPr>
-                  <w:r>
-                    <w:rPr>
-                      <w:rFonts w:ascii="Times New Roman" w:hAnsi="Times New Roman" w:cs="Times New Roman" w:eastAsia="標楷體"/>
-                      <w:b w:val="0"/>
-                      <w:i w:val="0"/>
-                      <w:sz w:val="24"/>
-                    </w:rPr>
-                    <w:t>−28</w:t>
-                  </w:r>
-                </w:p>
-              </w:tc>
-            </w:tr>
-          </w:tbl>
-          <w:p/>
-          <w:p>
-            <w:pPr>
-              <w:spacing w:lineRule="exact" w:line="360" w:before="0" w:after="120"/>
-              <w:jc w:val="both"/>
-            </w:pPr>
-            <w:r>
-              <w:rPr>
-                <w:rFonts w:ascii="Times New Roman" w:hAnsi="Times New Roman" w:cs="Times New Roman" w:eastAsia="標楷體"/>
-                <w:b w:val="0"/>
-                <w:i w:val="0"/>
-                <w:sz w:val="24"/>
-              </w:rPr>
-              <w:t>註：營運速率、每班駕駛時數與接駁線班次均為假設值；換算僅含行駛時間。65歲以上人口為距站牌直線300 m內之估計值，各站數字不可相加。本情境僅為工具示範，非研究結論或政策建議。</w:t>
-            </w:r>
-          </w:p>
-          <w:p>
-            <w:pPr>
-              <w:keepNext/>
-              <w:spacing w:lineRule="auto" w:line="240" w:before="120" w:after="0"/>
-              <w:jc w:val="center"/>
-            </w:pPr>
-            <w:r>
-              <w:drawing>
-                <wp:inline xmlns:a="http://schemas.openxmlformats.org/drawingml/2006/main" xmlns:pic="http://schemas.openxmlformats.org/drawingml/2006/picture">
-                  <wp:extent cx="4320000" cy="4249565"/>
-                  <wp:docPr id="3" name="Picture 3"/>
-                  <wp:cNvGraphicFramePr>
-                    <a:graphicFrameLocks noChangeAspect="1"/>
-                  </wp:cNvGraphicFramePr>
-                  <a:graphic>
-                    <a:graphicData uri="http://schemas.openxmlformats.org/drawingml/2006/picture">
-                      <pic:pic>
-                        <pic:nvPicPr>
-                          <pic:cNvPr id="0" name="fig3_driver.png"/>
-                          <pic:cNvPicPr/>
-                        </pic:nvPicPr>
-                        <pic:blipFill>
-                          <a:blip r:embed="rId12"/>
-                          <a:stretch>
-                            <a:fillRect/>
-                          </a:stretch>
-                        </pic:blipFill>
-                        <pic:spPr>
-                          <a:xfrm>
-                            <a:off x="0" y="0"/>
-                            <a:ext cx="4320000" cy="4249565"/>
-                          </a:xfrm>
-                          <a:prstGeom prst="rect"/>
-                        </pic:spPr>
-                      </pic:pic>
-                    </a:graphicData>
-                  </a:graphic>
-                </wp:inline>
-              </w:drawing>
-            </w:r>
-          </w:p>
-          <w:p>
-            <w:pPr>
-              <w:spacing w:lineRule="exact" w:line="360" w:before="0" w:after="120"/>
-              <w:jc w:val="center"/>
-            </w:pPr>
-            <w:r>
-              <w:rPr>
-                <w:rFonts w:ascii="Times New Roman" w:hAnsi="Times New Roman" w:cs="Times New Roman" w:eastAsia="標楷體"/>
-                <w:b/>
-                <w:i w:val="0"/>
-                <w:sz w:val="24"/>
-              </w:rPr>
-              <w:t>圖3　決策平台展示版情境模擬頁：A＋B示意情境之駕駛人力與長者可及性比較（速率與每班時數為假設值）。</w:t>
-            </w:r>
-          </w:p>
-          <w:p>
-            <w:pPr>
-              <w:spacing w:lineRule="exact" w:line="360" w:before="0" w:after="0"/>
-              <w:ind w:left="0"/>
-            </w:pPr>
-            <w:r>
-              <w:rPr>
-                <w:rFonts w:ascii="Times New Roman" w:hAnsi="Times New Roman" w:cs="Times New Roman" w:eastAsia="標楷體"/>
-                <w:b/>
-                <w:i w:val="0"/>
-                <w:sz w:val="28"/>
-              </w:rPr>
-              <w:t>(四)產業用地代理指標（探索性）</w:t>
-            </w:r>
-          </w:p>
-          <w:p>
-            <w:pPr>
-              <w:spacing w:lineRule="exact" w:line="360" w:before="0" w:after="0"/>
-              <w:ind w:firstLine="561"/>
-              <w:jc w:val="both"/>
-            </w:pPr>
-            <w:r>
-              <w:rPr>
-                <w:rFonts w:ascii="Times New Roman" w:hAnsi="Times New Roman" w:cs="Times New Roman" w:eastAsia="標楷體"/>
-                <w:b w:val="0"/>
-                <w:i w:val="0"/>
-                <w:sz w:val="28"/>
-              </w:rPr>
-              <w:t>以OSM工業用地及產業園區範圍圖為代理，7站各1,500 m內產業用地約184.3 ha，其中約126.8 ha（69%）距公車站牌300 m內，僅約78.1 ha（42%）距可一車直達最近車站之路線站牌300 m內；G12周邊12塊產業用地皆無直達路線。僅為候選觀察點，需以市府資料驗證（圖4）。</w:t>
-            </w:r>
-          </w:p>
-          <w:p>
-            <w:pPr>
-              <w:keepNext/>
-              <w:spacing w:lineRule="auto" w:line="240" w:before="120" w:after="0"/>
-              <w:jc w:val="center"/>
-            </w:pPr>
-            <w:r>
-              <w:drawing>
-                <wp:inline xmlns:a="http://schemas.openxmlformats.org/drawingml/2006/main" xmlns:pic="http://schemas.openxmlformats.org/drawingml/2006/picture">
-                  <wp:extent cx="4680000" cy="3866087"/>
-                  <wp:docPr id="4" name="Picture 4"/>
-                  <wp:cNvGraphicFramePr>
-                    <a:graphicFrameLocks noChangeAspect="1"/>
-                  </wp:cNvGraphicFramePr>
-                  <a:graphic>
-                    <a:graphicData uri="http://schemas.openxmlformats.org/drawingml/2006/picture">
-                      <pic:pic>
-                        <pic:nvPicPr>
-                          <pic:cNvPr id="0" name="fig4_industrial.png"/>
-                          <pic:cNvPicPr/>
-                        </pic:nvPicPr>
-                        <pic:blipFill>
-                          <a:blip r:embed="rId13"/>
-                          <a:stretch>
-                            <a:fillRect/>
-                          </a:stretch>
-                        </pic:blipFill>
-                        <pic:spPr>
-                          <a:xfrm>
-                            <a:off x="0" y="0"/>
-                            <a:ext cx="4680000" cy="3866087"/>
-                          </a:xfrm>
-                          <a:prstGeom prst="rect"/>
-                        </pic:spPr>
-                      </pic:pic>
-                    </a:graphicData>
-                  </a:graphic>
-                </wp:inline>
-              </w:drawing>
-            </w:r>
-          </w:p>
-          <w:p>
-            <w:pPr>
-              <w:spacing w:lineRule="exact" w:line="360" w:before="0" w:after="120"/>
-              <w:jc w:val="center"/>
-            </w:pPr>
-            <w:r>
-              <w:rPr>
-                <w:rFonts w:ascii="Times New Roman" w:hAnsi="Times New Roman" w:cs="Times New Roman" w:eastAsia="標楷體"/>
-                <w:b/>
-                <w:i w:val="0"/>
-                <w:sz w:val="24"/>
-              </w:rPr>
-              <w:t>圖4　決策平台展示版接駁缺口頁：產業用地（移工通勤代理指標，探索性）。資料：OSM[22]、經濟部產業園區範圍圖[29]。</w:t>
-            </w:r>
-          </w:p>
-          <w:p>
-            <w:pPr>
-              <w:spacing w:lineRule="exact" w:line="360" w:before="0" w:after="0"/>
-              <w:ind w:left="0"/>
-            </w:pPr>
-            <w:r>
-              <w:rPr>
-                <w:rFonts w:ascii="Times New Roman" w:hAnsi="Times New Roman" w:cs="Times New Roman" w:eastAsia="標楷體"/>
-                <w:b/>
-                <w:i w:val="0"/>
-                <w:sz w:val="28"/>
-              </w:rPr>
-              <w:t>(五)通車前營運基準</w:t>
-            </w:r>
-          </w:p>
-          <w:p>
-            <w:pPr>
-              <w:spacing w:lineRule="exact" w:line="360" w:before="0" w:after="0"/>
-              <w:ind w:firstLine="561"/>
-              <w:jc w:val="both"/>
-            </w:pPr>
-            <w:r>
-              <w:rPr>
-                <w:rFonts w:ascii="Times New Roman" w:hAnsi="Times New Roman" w:cs="Times New Roman" w:eastAsia="標楷體"/>
-                <w:b w:val="0"/>
-                <w:i w:val="0"/>
-                <w:sz w:val="28"/>
-              </w:rPr>
-              <w:t>已自115年10月24日起以TDX即時動態資料蒐集59條路線之通車前基準，預定至115年11月14日或通車前一日；目前樣本尚不足以計算旅行時間與班距指標，將於樣本累積後呈現。</w:t>
             </w:r>
           </w:p>
         </w:tc>
@@ -5038,7 +2994,7 @@
                       <w:i w:val="0"/>
                       <w:sz w:val="28"/>
                     </w:rPr>
-                    <w:t>文獻回顧、TDX及OSM資料介接、前期試行分析、通車前基準資料蒐集；11月30日前完成報名</w:t>
+                    <w:t>文獻回顧、TDX與OSM資料介接、前期試行分析；取得單日歷史位置資料檢驗班距方法；11月30日前完成報名</w:t>
                   </w:r>
                 </w:p>
               </w:tc>
@@ -5084,7 +3040,7 @@
                       <w:i w:val="0"/>
                       <w:sz w:val="28"/>
                     </w:rPr>
-                    <w:t>書面初審；持續蒐集通車前基準資料；綠線北段預計通車（依官方公告）</w:t>
+                    <w:t>書面初審；以歷史資料建立通車前基準日（須為通車前日期）；綠線北段預計通車（依官方公告）</w:t>
                   </w:r>
                 </w:p>
               </w:tc>
@@ -5130,7 +3086,7 @@
                       <w:i w:val="0"/>
                       <w:sz w:val="28"/>
                     </w:rPr>
-                    <w:t>複審簡報；通車後資料蒐集</w:t>
+                    <w:t>複審簡報；以更多日班距資料校正規則門檻；通車後資料蒐集</w:t>
                   </w:r>
                 </w:p>
               </w:tc>
@@ -5222,7 +3178,7 @@
                       <w:i w:val="0"/>
                       <w:sz w:val="28"/>
                     </w:rPr>
-                    <w:t>通車後資料蒐集與前後比較；情境模擬；長者調查與移工代理指標驗證（視資源辦理）</w:t>
+                    <w:t>通車前後比較；方案評估；試辦建議；長者調查（視資源辦理）</w:t>
                   </w:r>
                 </w:p>
               </w:tc>
@@ -5268,7 +3224,7 @@
                       <w:i w:val="0"/>
                       <w:sz w:val="28"/>
                     </w:rPr>
-                    <w:t>情境方案評估、研究報告撰寫</w:t>
+                    <w:t>方案評估、研究報告撰寫</w:t>
                   </w:r>
                 </w:p>
               </w:tc>
@@ -5332,7 +3288,7 @@
                 <w:i w:val="0"/>
                 <w:sz w:val="24"/>
               </w:rPr>
-              <w:t>註：初審、複審與頒獎時程依115年度活動簡章[31]，實際日期以主辦單位公告為準。</w:t>
+              <w:t>註：初審、複審與頒獎時程依115年度活動簡章[23]，實際日期以主辦單位公告為準。</w:t>
             </w:r>
           </w:p>
         </w:tc>
@@ -5431,7 +3387,7 @@
                 <w:i w:val="0"/>
                 <w:sz w:val="28"/>
               </w:rPr>
-              <w:t>3至4套重整情境之量化比較報告，含各情境約當駕駛班次與可再配置人力。</w:t>
+              <w:t>班距可靠度基準報告，並檢驗三個待驗證課題。</w:t>
             </w:r>
           </w:p>
           <w:p>
@@ -5456,7 +3412,7 @@
                 <w:i w:val="0"/>
                 <w:sz w:val="28"/>
               </w:rPr>
-              <w:t>通車前後公車營運比較報告。</w:t>
+              <w:t>五個候選改善方案之量化比較，含約當駕駛班次與長者可及性。</w:t>
             </w:r>
           </w:p>
           <w:p>
@@ -5481,7 +3437,7 @@
                 <w:i w:val="0"/>
                 <w:sz w:val="28"/>
               </w:rPr>
-              <w:t>開源分析程式、決策平台（已完成展示版雛形）與操作手冊。</w:t>
+              <w:t>通車前後公車營運比較報告。</w:t>
             </w:r>
           </w:p>
           <w:p>
@@ -5506,7 +3462,7 @@
                 <w:i w:val="0"/>
                 <w:sz w:val="28"/>
               </w:rPr>
-              <w:t>長者轉乘需求摘要（若執行調查）；移工通勤代理指標及其驗證結果（探索性）。</w:t>
+              <w:t>開源分析程式、決策平台（已完成展示版，含班距可靠度頁）與操作手冊。</w:t>
             </w:r>
           </w:p>
           <w:p>
@@ -5536,7 +3492,7 @@
                 <w:i w:val="0"/>
                 <w:sz w:val="28"/>
               </w:rPr>
-              <w:t>路線長度與站點重疊率；車站500 m範圍內班次數與人口覆蓋；情境間車公里、車輛小時與約當駕駛班次差異；可一車直達車站之65歲以上人口；代表起訖點旅行時間、轉乘次數與步行距離變化；通車前後旅行時間與班距變異係數。各項數值待正式研究實測，不預設結果。</w:t>
+              <w:t>路線長度與站點重疊率；500 m範圍內班次與人口覆蓋；車公里、車輛小時與約當駕駛班次差異；可一車直達車站之65歲以上人口；班距變異係數、大間隔與併班比例；轉乘步行距離與等候；通車前後旅行時間。各項數值待正式研究實測，不預設結果。</w:t>
             </w:r>
           </w:p>
           <w:p>
@@ -5556,22 +3512,7 @@
           <w:p>
             <w:pPr>
               <w:spacing w:lineRule="exact" w:line="360" w:before="0" w:after="0"/>
-              <w:ind w:left="0"/>
-            </w:pPr>
-            <w:r>
-              <w:rPr>
-                <w:rFonts w:ascii="Times New Roman" w:hAnsi="Times New Roman" w:cs="Times New Roman" w:eastAsia="標楷體"/>
-                <w:b/>
-                <w:i w:val="0"/>
-                <w:sz w:val="28"/>
-              </w:rPr>
-              <w:t>(一)對桃園市政</w:t>
-            </w:r>
-          </w:p>
-          <w:p>
-            <w:pPr>
-              <w:spacing w:lineRule="exact" w:line="360" w:before="0" w:after="0"/>
-              <w:ind w:firstLine="561"/>
+              <w:ind w:left="340" w:hanging="340"/>
               <w:jc w:val="both"/>
             </w:pPr>
             <w:r>
@@ -5581,28 +3522,22 @@
                 <w:i w:val="0"/>
                 <w:sz w:val="28"/>
               </w:rPr>
-              <w:t>回應審計處對GR運量之關切與市府駕駛人力不足之說明[4]，將裁切平行路段釋出之車公里換算為約當駕駛班次，評估能否移去補強弱站接駁，提供交通局路網調整之量化依據。</w:t>
+              <w:t>1.</w:t>
+            </w:r>
+            <w:r>
+              <w:rPr>
+                <w:rFonts w:ascii="Times New Roman" w:hAnsi="Times New Roman" w:cs="Times New Roman" w:eastAsia="標楷體"/>
+                <w:b w:val="0"/>
+                <w:i w:val="0"/>
+                <w:sz w:val="28"/>
+              </w:rPr>
+              <w:t>對市政：回應審計處對GR運量之關切與駕駛人力不足之說明[4]，提供路網調整之量化依據與「班距穩定才裁切」之檢核門檻。</w:t>
             </w:r>
           </w:p>
           <w:p>
             <w:pPr>
               <w:spacing w:lineRule="exact" w:line="360" w:before="0" w:after="0"/>
-              <w:ind w:left="0"/>
-            </w:pPr>
-            <w:r>
-              <w:rPr>
-                <w:rFonts w:ascii="Times New Roman" w:hAnsi="Times New Roman" w:cs="Times New Roman" w:eastAsia="標楷體"/>
-                <w:b/>
-                <w:i w:val="0"/>
-                <w:sz w:val="28"/>
-              </w:rPr>
-              <w:t>(二)對民眾與族群</w:t>
-            </w:r>
-          </w:p>
-          <w:p>
-            <w:pPr>
-              <w:spacing w:lineRule="exact" w:line="360" w:before="0" w:after="0"/>
-              <w:ind w:firstLine="561"/>
+              <w:ind w:left="340" w:hanging="340"/>
               <w:jc w:val="both"/>
             </w:pPr>
             <w:r>
@@ -5612,28 +3547,22 @@
                 <w:i w:val="0"/>
                 <w:sz w:val="28"/>
               </w:rPr>
-              <w:t>以「可一車直達車站之長者人口」把關，避免裁切造成服務缺口；以產業用地代理指標初探移工通勤需求，並於獲獎後與市府資料媒合驗證。</w:t>
+              <w:t>2.</w:t>
+            </w:r>
+            <w:r>
+              <w:rPr>
+                <w:rFonts w:ascii="Times New Roman" w:hAnsi="Times New Roman" w:cs="Times New Roman" w:eastAsia="標楷體"/>
+                <w:b w:val="0"/>
+                <w:i w:val="0"/>
+                <w:sz w:val="28"/>
+              </w:rPr>
+              <w:t>對民眾與族群：以長者可一車直達人數把關，避免裁切造成服務缺口。</w:t>
             </w:r>
           </w:p>
           <w:p>
             <w:pPr>
               <w:spacing w:lineRule="exact" w:line="360" w:before="0" w:after="0"/>
-              <w:ind w:left="0"/>
-            </w:pPr>
-            <w:r>
-              <w:rPr>
-                <w:rFonts w:ascii="Times New Roman" w:hAnsi="Times New Roman" w:cs="Times New Roman" w:eastAsia="標楷體"/>
-                <w:b/>
-                <w:i w:val="0"/>
-                <w:sz w:val="28"/>
-              </w:rPr>
-              <w:t>(三)對城市發展</w:t>
-            </w:r>
-          </w:p>
-          <w:p>
-            <w:pPr>
-              <w:spacing w:lineRule="exact" w:line="360" w:before="0" w:after="0"/>
-              <w:ind w:firstLine="561"/>
+              <w:ind w:left="340" w:hanging="340"/>
               <w:jc w:val="both"/>
             </w:pPr>
             <w:r>
@@ -5643,7 +3572,16 @@
                 <w:i w:val="0"/>
                 <w:sz w:val="28"/>
               </w:rPr>
-              <w:t>評估流程與工具可沿用至G08（117年）、主線（119年）及航空城段（121年）之分階段通車。</w:t>
+              <w:t>3.</w:t>
+            </w:r>
+            <w:r>
+              <w:rPr>
+                <w:rFonts w:ascii="Times New Roman" w:hAnsi="Times New Roman" w:cs="Times New Roman" w:eastAsia="標楷體"/>
+                <w:b w:val="0"/>
+                <w:i w:val="0"/>
+                <w:sz w:val="28"/>
+              </w:rPr>
+              <w:t>對城市發展：流程與工具可沿用至G08、主線及航空城段之分階段通車。</w:t>
             </w:r>
           </w:p>
           <w:p>
@@ -5682,7 +3620,7 @@
                 <w:i w:val="0"/>
                 <w:sz w:val="28"/>
               </w:rPr>
-              <w:t>交通局：逐路線、逐站上下車量（去識別化彙總）；路線營運成本、車公里、車輛小時與駕駛排班規則；綠線接駁或路線調整計畫草案。</w:t>
+              <w:t>交通局：逐路線逐站上下車量（去識別化彙總）、營運成本與排班規則、綠線接駁或路線調整計畫草案。</w:t>
             </w:r>
           </w:p>
           <w:p>
@@ -5707,7 +3645,7 @@
                 <w:i w:val="0"/>
                 <w:sz w:val="28"/>
               </w:rPr>
-              <w:t>勞動局等：沿線移工人數或宿舍分布之去識別化彙總資料。</w:t>
+              <w:t>捷運公司、捷運工程局：通車後各站進出站量；車站出入口與轉乘設施位置。</w:t>
             </w:r>
           </w:p>
           <w:p>
@@ -5724,31 +3662,6 @@
                 <w:sz w:val="28"/>
               </w:rPr>
               <w:t>3.</w:t>
-            </w:r>
-            <w:r>
-              <w:rPr>
-                <w:rFonts w:ascii="Times New Roman" w:hAnsi="Times New Roman" w:cs="Times New Roman" w:eastAsia="標楷體"/>
-                <w:b w:val="0"/>
-                <w:i w:val="0"/>
-                <w:sz w:val="28"/>
-              </w:rPr>
-              <w:t>捷運公司、捷運工程局：通車後各站進出站量；車站出入口與轉乘設施位置。</w:t>
-            </w:r>
-          </w:p>
-          <w:p>
-            <w:pPr>
-              <w:spacing w:lineRule="exact" w:line="360" w:before="0" w:after="0"/>
-              <w:ind w:left="340" w:hanging="340"/>
-              <w:jc w:val="both"/>
-            </w:pPr>
-            <w:r>
-              <w:rPr>
-                <w:rFonts w:ascii="Times New Roman" w:hAnsi="Times New Roman" w:cs="Times New Roman" w:eastAsia="標楷體"/>
-                <w:b w:val="0"/>
-                <w:i w:val="0"/>
-                <w:sz w:val="28"/>
-              </w:rPr>
-              <w:t>4.</w:t>
             </w:r>
             <w:r>
               <w:rPr>
@@ -5843,7 +3756,7 @@
                 <w:i w:val="0"/>
                 <w:sz w:val="28"/>
               </w:rPr>
-              <w:t>使用方式：以生成式AI協助蒐集與整理公開資料、草擬提案文字，並協助撰寫與執行前期試行分析程式及決策平台展示版；分析結果與引用資料由團隊複核。</w:t>
+              <w:t>使用方式：以生成式AI協助蒐集與整理公開資料、草擬提案文字，並協助撰寫與執行前期試行分析程式、班距可靠度分析程式及決策平台展示版；分析結果與引用資料由團隊複核。</w:t>
             </w:r>
           </w:p>
           <w:p>
@@ -6137,7 +4050,7 @@
           <w:i w:val="0"/>
           <w:sz w:val="24"/>
         </w:rPr>
-        <w:t>桃園電子報（2025年12月17日）。桃園移工人數破13萬。https://tyenews.com/2025/12/1165890/</w:t>
+        <w:t>桃園市政府捷運工程局（2026年10月13日）。桃捷綠線通車配套與工程同步推進。https://dorts.tycg.gov.tw/News_Content.aspx?n=23116&amp;s=1896866</w:t>
       </w:r>
     </w:p>
     <w:p>
@@ -6166,7 +4079,7 @@
           <w:i w:val="0"/>
           <w:sz w:val="24"/>
         </w:rPr>
-        <w:t>桃園市政府捷運工程局（2026年10月13日）。桃捷綠線通車配套與工程同步推進。https://dorts.tycg.gov.tw/News_Content.aspx?n=23116&amp;s=1896866</w:t>
+        <w:t>自由時報（無日期）。中捷25日通車 53、800路公車將轉型捷運接駁。https://news.ltn.com.tw/news/life/breakingnews/3495512</w:t>
       </w:r>
     </w:p>
     <w:p>
@@ -6195,7 +4108,7 @@
           <w:i w:val="0"/>
           <w:sz w:val="24"/>
         </w:rPr>
-        <w:t>自由時報（無日期）。中捷25日通車 53、800路公車將轉型捷運接駁。https://news.ltn.com.tw/news/life/breakingnews/3495512</w:t>
+        <w:t>臺中市政府（無日期）。中捷綠線4/25正式通車〔市政新聞〕。https://www.taichung.gov.tw/8868/8872/9962/1772188</w:t>
       </w:r>
     </w:p>
     <w:p>
@@ -6224,7 +4137,7 @@
           <w:i w:val="0"/>
           <w:sz w:val="24"/>
         </w:rPr>
-        <w:t>臺中市政府（無日期）。中捷綠線4/25正式通車〔市政新聞〕。https://www.taichung.gov.tw/8868/8872/9962/1772188</w:t>
+        <w:t>交通部運輸研究所（無日期）。捷運路網規劃參考手冊。https://www.iot.gov.tw/uploads/asset/data/66195bd9367376304acd4c90/%E6%8D%B7%E9%81%8B%E8%B7%AF%E7%B6%B2%E8%A6%8F%E5%8A%83%E5%8F%83%E8%80%83%E6%89%8B%E5%86%8A.pdf</w:t>
       </w:r>
     </w:p>
     <w:p>
@@ -6253,7 +4166,7 @@
           <w:i w:val="0"/>
           <w:sz w:val="24"/>
         </w:rPr>
-        <w:t>交通部運輸研究所（無日期）。捷運路網規劃參考手冊。https://www.iot.gov.tw/uploads/asset/data/66195bd9367376304acd4c90/%E6%8D%B7%E9%81%8B%E8%B7%AF%E7%B6%B2%E8%A6%8F%E5%8A%83%E5%8F%83%E8%80%83%E6%89%8B%E5%86%8A.pdf</w:t>
+        <w:t>捷運通車後公車路線調整模式—以航空城為例〔學位論文〕（無日期）。臺灣博碩士論文知識加值系統。https://ndltd.ncl.edu.tw/r/09204086685482295339</w:t>
       </w:r>
     </w:p>
     <w:p>
@@ -6282,7 +4195,7 @@
           <w:i w:val="0"/>
           <w:sz w:val="24"/>
         </w:rPr>
-        <w:t>捷運通車後公車路線調整模式—以航空城為例〔學位論文〕（無日期）。臺灣博碩士論文知識加值系統。https://ndltd.ncl.edu.tw/r/09204086685482295339</w:t>
+        <w:t>市區公車之既有路線調整與新闢路線規劃程序之研究〔學位論文〕（無日期）。臺灣博碩士論文知識加值系統。https://ndltd.ncl.edu.tw/handle/17736567666393003850</w:t>
       </w:r>
     </w:p>
     <w:p>
@@ -6311,7 +4224,7 @@
           <w:i w:val="0"/>
           <w:sz w:val="24"/>
         </w:rPr>
-        <w:t>市區公車之既有路線調整與新闢路線規劃程序之研究〔學位論文〕（無日期）。臺灣博碩士論文知識加值系統。https://ndltd.ncl.edu.tw/handle/17736567666393003850</w:t>
+        <w:t>台中捷運接駁公車路線規劃－以捷運櫻花文心站至逢甲商圈為例（無日期）。華藝線上圖書館。https://www.airitilibrary.com/Article/Detail/U0008-1404202110493605</w:t>
       </w:r>
     </w:p>
     <w:p>
@@ -6340,7 +4253,7 @@
           <w:i w:val="0"/>
           <w:sz w:val="24"/>
         </w:rPr>
-        <w:t>台中捷運接駁公車路線規劃－以捷運櫻花文心站至逢甲商圈為例（無日期）。華藝線上圖書館。https://www.airitilibrary.com/Article/Detail/U0008-1404202110493605</w:t>
+        <w:t>桃園市政府智慧城鄉發展委員會（無日期）。114年度複審結果公告。https://sccdc.tycg.gov.tw/News_Content.aspx?n=16792&amp;s=1600221</w:t>
       </w:r>
     </w:p>
     <w:p>
@@ -6369,7 +4282,7 @@
           <w:i w:val="0"/>
           <w:sz w:val="24"/>
         </w:rPr>
-        <w:t>桃園市政府智慧城鄉發展委員會（無日期）。114年度複審結果公告。https://sccdc.tycg.gov.tw/News_Content.aspx?n=16792&amp;s=1600221</w:t>
+        <w:t>桃園市政府（無日期）。114年度「為桃園做研究」複審評審規則及流程－研究實作組。https://ws.tycg.gov.tw/Download.ashx?n=54K65qGD5ZyS5YGa56CU56m26KSH5a%2Bp6KaP5YmH5Y%2BK5rWB56iLX%2BeglOeptuWvpuS9nOe1hCjlhazlkYopLnBkZg%3D%3D&amp;u=LzAwMS9VcGxvYWQvMTg2L3JlbGZpbGUvMTgzNzAvMTU5NjMzMC9lNmI1ZmMzNy1lZWNmLTQzYzYtOGI0Ni03NzVlZjZiYzNiZDQucGRm</w:t>
       </w:r>
     </w:p>
     <w:p>
@@ -6398,7 +4311,7 @@
           <w:i w:val="0"/>
           <w:sz w:val="24"/>
         </w:rPr>
-        <w:t>桃園市政府（無日期）。114年度「為桃園做研究」複審評審規則及流程－研究實作組。https://ws.tycg.gov.tw/Download.ashx?n=54K65qGD5ZyS5YGa56CU56m26KSH5a%2Bp6KaP5YmH5Y%2BK5rWB56iLX%2BeglOeptuWvpuS9nOe1hCjlhazlkYopLnBkZg%3D%3D&amp;u=LzAwMS9VcGxvYWQvMTg2L3JlbGZpbGUvMTgzNzAvMTU5NjMzMC9lNmI1ZmMzNy1lZWNmLTQzYzYtOGI0Ni03NzVlZjZiYzNiZDQucGRm</w:t>
+        <w:t>交通部TDX運輸資料流通服務（無日期）。公車API規格（Swagger）。https://tdx.transportdata.tw/webapi/File/Swagger/V3/2998e851-81d0-40f5-b26d-77e2f5ac4118</w:t>
       </w:r>
     </w:p>
     <w:p>
@@ -6427,7 +4340,7 @@
           <w:i w:val="0"/>
           <w:sz w:val="24"/>
         </w:rPr>
-        <w:t>交通部TDX運輸資料流通服務（無日期）。公車API規格（Swagger）。https://tdx.transportdata.tw/webapi/File/Swagger/V3/2998e851-81d0-40f5-b26d-77e2f5ac4118</w:t>
+        <w:t>交通部TDX運輸資料流通服務（無日期）。歷史資料服務。https://tdx.transportdata.tw/data-service/historical</w:t>
       </w:r>
     </w:p>
     <w:p>
@@ -6456,7 +4369,7 @@
           <w:i w:val="0"/>
           <w:sz w:val="24"/>
         </w:rPr>
-        <w:t>交通部TDX運輸資料流通服務（無日期）。歷史資料服務。https://tdx.transportdata.tw/data-service/historical</w:t>
+        <w:t>OpenStreetMap contributors（無日期）。OpenStreetMap〔ODbL授權〕。https://www.openstreetmap.org/copyright</w:t>
       </w:r>
     </w:p>
     <w:p>
@@ -6485,7 +4398,7 @@
           <w:i w:val="0"/>
           <w:sz w:val="24"/>
         </w:rPr>
-        <w:t>交通部TDX運輸資料流通服務（無日期）。訂閱方案與存取頻率。https://tdx.transportdata.tw/pricing</w:t>
+        <w:t>內政部戶政司（2026）。人口統計資料開放API：村里戶數、單一年齡人口（ODRP014/11509）。https://www.ris.gov.tw/rs-opendata/api/v1/datastore/ODRP014/11509</w:t>
       </w:r>
     </w:p>
     <w:p>
@@ -6514,7 +4427,7 @@
           <w:i w:val="0"/>
           <w:sz w:val="24"/>
         </w:rPr>
-        <w:t>OpenStreetMap contributors（無日期）。OpenStreetMap〔ODbL授權〕。https://www.openstreetmap.org/copyright</w:t>
+        <w:t>Boeing, G.（無日期）。OSMnx〔軟體〕。https://github.com/gboeing/osmnx</w:t>
       </w:r>
     </w:p>
     <w:p>
@@ -6534,238 +4447,6 @@
           <w:sz w:val="24"/>
         </w:rPr>
         <w:t>[23]</w:t>
-        <w:tab/>
-      </w:r>
-      <w:r>
-        <w:rPr>
-          <w:rFonts w:ascii="Times New Roman" w:hAnsi="Times New Roman" w:cs="Times New Roman" w:eastAsia="標楷體"/>
-          <w:b w:val="0"/>
-          <w:i w:val="0"/>
-          <w:sz w:val="24"/>
-        </w:rPr>
-        <w:t>內政部戶政司（2026）。人口統計資料開放API：村里戶數、單一年齡人口（ODRP014/11509）。https://www.ris.gov.tw/rs-opendata/api/v1/datastore/ODRP014/11509</w:t>
-      </w:r>
-    </w:p>
-    <w:p>
-      <w:pPr>
-        <w:tabs>
-          <w:tab w:pos="567" w:val="left"/>
-        </w:tabs>
-        <w:spacing w:lineRule="exact" w:line="360" w:before="0" w:after="0"/>
-        <w:ind w:left="567" w:hanging="567"/>
-        <w:jc w:val="left"/>
-      </w:pPr>
-      <w:r>
-        <w:rPr>
-          <w:rFonts w:ascii="Times New Roman" w:hAnsi="Times New Roman" w:cs="Times New Roman" w:eastAsia="標楷體"/>
-          <w:b w:val="0"/>
-          <w:i w:val="0"/>
-          <w:sz w:val="24"/>
-        </w:rPr>
-        <w:t>[24]</w:t>
-        <w:tab/>
-      </w:r>
-      <w:r>
-        <w:rPr>
-          <w:rFonts w:ascii="Times New Roman" w:hAnsi="Times New Roman" w:cs="Times New Roman" w:eastAsia="標楷體"/>
-          <w:b w:val="0"/>
-          <w:i w:val="0"/>
-          <w:sz w:val="24"/>
-        </w:rPr>
-        <w:t>內政部（無日期）。社會經濟資料服務平台（SEGIS）。https://segis.moi.gov.tw</w:t>
-      </w:r>
-    </w:p>
-    <w:p>
-      <w:pPr>
-        <w:tabs>
-          <w:tab w:pos="567" w:val="left"/>
-        </w:tabs>
-        <w:spacing w:lineRule="exact" w:line="360" w:before="0" w:after="0"/>
-        <w:ind w:left="567" w:hanging="567"/>
-        <w:jc w:val="left"/>
-      </w:pPr>
-      <w:r>
-        <w:rPr>
-          <w:rFonts w:ascii="Times New Roman" w:hAnsi="Times New Roman" w:cs="Times New Roman" w:eastAsia="標楷體"/>
-          <w:b w:val="0"/>
-          <w:i w:val="0"/>
-          <w:sz w:val="24"/>
-        </w:rPr>
-        <w:t>[25]</w:t>
-        <w:tab/>
-      </w:r>
-      <w:r>
-        <w:rPr>
-          <w:rFonts w:ascii="Times New Roman" w:hAnsi="Times New Roman" w:cs="Times New Roman" w:eastAsia="標楷體"/>
-          <w:b w:val="0"/>
-          <w:i w:val="0"/>
-          <w:sz w:val="24"/>
-        </w:rPr>
-        <w:t>桃園資料開放平台（無日期）。桃園市公車運量每月統計〔資料集〕。https://opendata.tycg.gov.tw/datalist/95c565c2-1246-468b-9e5f-89bdd5225ac7</w:t>
-      </w:r>
-    </w:p>
-    <w:p>
-      <w:pPr>
-        <w:tabs>
-          <w:tab w:pos="567" w:val="left"/>
-        </w:tabs>
-        <w:spacing w:lineRule="exact" w:line="360" w:before="0" w:after="0"/>
-        <w:ind w:left="567" w:hanging="567"/>
-        <w:jc w:val="left"/>
-      </w:pPr>
-      <w:r>
-        <w:rPr>
-          <w:rFonts w:ascii="Times New Roman" w:hAnsi="Times New Roman" w:cs="Times New Roman" w:eastAsia="標楷體"/>
-          <w:b w:val="0"/>
-          <w:i w:val="0"/>
-          <w:sz w:val="24"/>
-        </w:rPr>
-        <w:t>[26]</w:t>
-        <w:tab/>
-      </w:r>
-      <w:r>
-        <w:rPr>
-          <w:rFonts w:ascii="Times New Roman" w:hAnsi="Times New Roman" w:cs="Times New Roman" w:eastAsia="標楷體"/>
-          <w:b w:val="0"/>
-          <w:i w:val="0"/>
-          <w:sz w:val="24"/>
-        </w:rPr>
-        <w:t>政府資料開放平臺（無日期）。捷運、公車、Youbike站點公共運輸量分析〔資料集〕。https://data.gov.tw/dataset/173670</w:t>
-      </w:r>
-    </w:p>
-    <w:p>
-      <w:pPr>
-        <w:tabs>
-          <w:tab w:pos="567" w:val="left"/>
-        </w:tabs>
-        <w:spacing w:lineRule="exact" w:line="360" w:before="0" w:after="0"/>
-        <w:ind w:left="567" w:hanging="567"/>
-        <w:jc w:val="left"/>
-      </w:pPr>
-      <w:r>
-        <w:rPr>
-          <w:rFonts w:ascii="Times New Roman" w:hAnsi="Times New Roman" w:cs="Times New Roman" w:eastAsia="標楷體"/>
-          <w:b w:val="0"/>
-          <w:i w:val="0"/>
-          <w:sz w:val="24"/>
-        </w:rPr>
-        <w:t>[27]</w:t>
-        <w:tab/>
-      </w:r>
-      <w:r>
-        <w:rPr>
-          <w:rFonts w:ascii="Times New Roman" w:hAnsi="Times New Roman" w:cs="Times New Roman" w:eastAsia="標楷體"/>
-          <w:b w:val="0"/>
-          <w:i w:val="0"/>
-          <w:sz w:val="24"/>
-        </w:rPr>
-        <w:t>桃園資料開放平台（無日期）。桃園大眾捷運各場站運量每月統計表〔資料集〕。https://opendata.tycg.gov.tw/datalist/7a7e006b-ec19-47ad-8fc8-6640a7a72f8a</w:t>
-      </w:r>
-    </w:p>
-    <w:p>
-      <w:pPr>
-        <w:tabs>
-          <w:tab w:pos="567" w:val="left"/>
-        </w:tabs>
-        <w:spacing w:lineRule="exact" w:line="360" w:before="0" w:after="0"/>
-        <w:ind w:left="567" w:hanging="567"/>
-        <w:jc w:val="left"/>
-      </w:pPr>
-      <w:r>
-        <w:rPr>
-          <w:rFonts w:ascii="Times New Roman" w:hAnsi="Times New Roman" w:cs="Times New Roman" w:eastAsia="標楷體"/>
-          <w:b w:val="0"/>
-          <w:i w:val="0"/>
-          <w:sz w:val="24"/>
-        </w:rPr>
-        <w:t>[28]</w:t>
-        <w:tab/>
-      </w:r>
-      <w:r>
-        <w:rPr>
-          <w:rFonts w:ascii="Times New Roman" w:hAnsi="Times New Roman" w:cs="Times New Roman" w:eastAsia="標楷體"/>
-          <w:b w:val="0"/>
-          <w:i w:val="0"/>
-          <w:sz w:val="24"/>
-        </w:rPr>
-        <w:t>桃園資料開放平台（無日期）。公車路線資料（含站址表連結）〔資料集〕。https://opendata.tycg.gov.tw/datalist/d7a0513d-1a91-4ae6-a06f-fbf83190ab2a</w:t>
-      </w:r>
-    </w:p>
-    <w:p>
-      <w:pPr>
-        <w:tabs>
-          <w:tab w:pos="567" w:val="left"/>
-        </w:tabs>
-        <w:spacing w:lineRule="exact" w:line="360" w:before="0" w:after="0"/>
-        <w:ind w:left="567" w:hanging="567"/>
-        <w:jc w:val="left"/>
-      </w:pPr>
-      <w:r>
-        <w:rPr>
-          <w:rFonts w:ascii="Times New Roman" w:hAnsi="Times New Roman" w:cs="Times New Roman" w:eastAsia="標楷體"/>
-          <w:b w:val="0"/>
-          <w:i w:val="0"/>
-          <w:sz w:val="24"/>
-        </w:rPr>
-        <w:t>[29]</w:t>
-        <w:tab/>
-      </w:r>
-      <w:r>
-        <w:rPr>
-          <w:rFonts w:ascii="Times New Roman" w:hAnsi="Times New Roman" w:cs="Times New Roman" w:eastAsia="標楷體"/>
-          <w:b w:val="0"/>
-          <w:i w:val="0"/>
-          <w:sz w:val="24"/>
-        </w:rPr>
-        <w:t>經濟部產業園區管理局（2026）。產業園區範圍圖〔SHP，檔案日期2026年4月30日；政府資料開放授權條款第1版〕。https://land.bip.gov.tw/supply/Policy/Show?id=49 ；https://data.gov.tw/dataset/25598</w:t>
-      </w:r>
-    </w:p>
-    <w:p>
-      <w:pPr>
-        <w:tabs>
-          <w:tab w:pos="567" w:val="left"/>
-        </w:tabs>
-        <w:spacing w:lineRule="exact" w:line="360" w:before="0" w:after="0"/>
-        <w:ind w:left="567" w:hanging="567"/>
-        <w:jc w:val="left"/>
-      </w:pPr>
-      <w:r>
-        <w:rPr>
-          <w:rFonts w:ascii="Times New Roman" w:hAnsi="Times New Roman" w:cs="Times New Roman" w:eastAsia="標楷體"/>
-          <w:b w:val="0"/>
-          <w:i w:val="0"/>
-          <w:sz w:val="24"/>
-        </w:rPr>
-        <w:t>[30]</w:t>
-        <w:tab/>
-      </w:r>
-      <w:r>
-        <w:rPr>
-          <w:rFonts w:ascii="Times New Roman" w:hAnsi="Times New Roman" w:cs="Times New Roman" w:eastAsia="標楷體"/>
-          <w:b w:val="0"/>
-          <w:i w:val="0"/>
-          <w:sz w:val="24"/>
-        </w:rPr>
-        <w:t>Boeing, G.（無日期）。OSMnx〔軟體〕。https://github.com/gboeing/osmnx</w:t>
-      </w:r>
-    </w:p>
-    <w:p>
-      <w:pPr>
-        <w:tabs>
-          <w:tab w:pos="567" w:val="left"/>
-        </w:tabs>
-        <w:spacing w:lineRule="exact" w:line="360" w:before="0" w:after="0"/>
-        <w:ind w:left="567" w:hanging="567"/>
-        <w:jc w:val="left"/>
-      </w:pPr>
-      <w:r>
-        <w:rPr>
-          <w:rFonts w:ascii="Times New Roman" w:hAnsi="Times New Roman" w:cs="Times New Roman" w:eastAsia="標楷體"/>
-          <w:b w:val="0"/>
-          <w:i w:val="0"/>
-          <w:sz w:val="24"/>
-        </w:rPr>
-        <w:t>[31]</w:t>
         <w:tab/>
       </w:r>
       <w:r>

</xml_diff>